<commit_message>
docs(sem04): actualizar resumen en informe de estado (docx, md) y regenerar pdf
</commit_message>
<xml_diff>
--- a/docs/entregables/SEM04/2_Informe de Estado del Proyecto.docx
+++ b/docs/entregables/SEM04/2_Informe de Estado del Proyecto.docx
@@ -725,15 +725,9 @@
           <w:lang w:eastAsia="es-PE"/>
         </w:rPr>
       </w:pPr>
-      <w:r>
-        <w:fldChar w:fldCharType="begin"/>
-      </w:r>
-      <w:r>
-        <w:instrText xml:space="preserve"> TOC \h \z \t "TitulosPy,1" </w:instrText>
-      </w:r>
-      <w:r>
-        <w:fldChar w:fldCharType="separate"/>
-      </w:r>
+      <w:r/>
+      <w:r/>
+      <w:r/>
       <w:hyperlink w:anchor="_Toc404881684" w:history="1">
         <w:r>
           <w:rPr>
@@ -1170,9 +1164,7 @@
       </w:hyperlink>
     </w:p>
     <w:p>
-      <w:r>
-        <w:fldChar w:fldCharType="end"/>
-      </w:r>
+      <w:r/>
     </w:p>
     <w:p>
       <w:pPr>
@@ -1192,7 +1184,6 @@
           <w:sz w:val="28"/>
           <w:szCs w:val="28"/>
         </w:rPr>
-        <w:br w:type="page"/>
       </w:r>
     </w:p>
     <w:p>
@@ -1216,7 +1207,6 @@
           <w:sz w:val="24"/>
           <w:szCs w:val="20"/>
         </w:rPr>
-        <w:lastRenderedPageBreak/>
         <w:t>DESCRIPCIÓN DEL PROYECTO:</w:t>
       </w:r>
     </w:p>
@@ -1252,7 +1242,7 @@
           <w:color w:val="000000"/>
           <w:sz w:val="20"/>
         </w:rPr>
-        <w:t>El presente proyecto consiste en el diseño, desarrollo e implantación de un sistema web transaccional con arquitectura cliente ligero en Angular 21, backend RESTful en FastAPI y base de datos relacional PostgreSQL nativa en contenedor Docker para la empresa Impresos Trujillo E.I.R.L. La solución optimiza integralmente la gestión comercial mediante un talonario digital con cotizador automático, reduce los tiempos de atención a menos de 5 minutos, erradica pérdidas financieras mediante un candado digital de seguridad operativa que bloquea la entrega física de pedidos con saldo pendiente, automatiza el control de existencias y mermas en taller, y agiliza el arqueo diario segregado de caja entre las unidades de Imprenta y Gigantografías a menos de 10 minutos.</w:t>
+        <w:t>El presente proyecto consiste en el diseño, desarrollo e implementación de un sistema web transaccional con módulos de inteligencia de negocios e inteligencia artificial para la empresa Impresos Trujillo E.I.R.L. La solución permitirá gestionar órdenes de trabajo, inventario, cobranzas y reportes, con el objetivo de optimizar los procesos operativos, mejorar el control de la información y apoyar la toma de decisiones dentro de la empresa.</w:t>
       </w:r>
     </w:p>
     <w:p>
@@ -1623,7 +1613,7 @@
           <w:color w:val="000000"/>
           <w:sz w:val="20"/>
         </w:rPr>
-        <w:t>Respecto al Tiempo: El indicador de tiempo del proyecto está en VERDE debido a que las actividades previstas dentro del período de evaluación del Sprint 1 se han completado dentro del plazo establecido en un 83.3% (ver Anexo 1, Tabla 4 para mayor detalle), habiendo resuelto el único impedimento de integración en menos de 24 horas.</w:t>
+        <w:t>Respecto al Tiempo: El indicador de tiempo del proyecto está en VERDE debido a que las actividades previstas dentro del período de evaluación del Sprint 1 se han completado dentro del plazo establecido en un 83.3% (ver Anexo 1, Tabla 4 para mayor detalle), habiendo resuelto el úúnico impedimento de integración en menos de 24 horas.</w:t>
       </w:r>
     </w:p>
     <w:p>
@@ -1655,7 +1645,7 @@
           <w:color w:val="000000"/>
           <w:sz w:val="20"/>
         </w:rPr>
-        <w:t>Respecto al Costo: El indicador de costo del proyecto está en VERDE debido a que el costo real acumulado de las actividades ejecutadas se sitúa en S/ 1,400.00, representando un 93.3% del valor planificado (S/ 1,500.00), manteniéndose estrictamente por debajo del 100% presupuestado (ver Anexo 1, Tabla 5 para mayor detalle).</w:t>
+        <w:t>Respecto al Costo: El indicador de costo del proyecto está en VERDE debido a que el costo real acumulado de las actividades ejecutadías se sitúa en S/ 1,400.00, representando un 93.3% del valor planificado (S/ 1,500.00), manteniéndose estrictamente por debajo del 100% presupuestado (ver Anexo 1, Tabla 5 para mayor detalle).</w:t>
       </w:r>
     </w:p>
     <w:p>
@@ -1752,7 +1742,7 @@
           <w:color w:val="000000"/>
           <w:sz w:val="20"/>
         </w:rPr>
-        <w:t>Sustento Técnico y Operativo: Durante la Semana 4 se dio inicio formal al Sprint 1 del proyecto. Se consolidó el entorno de desarrollo unificado mediante Docker Compose (orquestando PostgreSQL 17-alpine, FastAPI y Angular 21). El equipo técnico distribuyó responsabilidades de manera balanceada: Gerardo Plasencia lideró la configuración de arquitectura, servicios y middleware; Diego Rodriguez implementó los modelos relacionales de datos y la API de autenticación JWT y RBAC en FastAPI; y Estibb Anhuaman maquetó los componentes reactivos de Login y Guards de navegación en Angular 21. La ligera reprogramación de la parametrización exhaustiva de insumos al Sprint 2 no comprometió la ruta crítica del proyecto.</w:t>
+        <w:t>Durante la Semana 4 se inició el Sprint 1 del proyecto. El equipo avanzó en la configuración del entorno de desarrollo, la implementación de la autenticación de usuarios, el modelado de la base de datos y la construcción de las primeras interfaces del sistema. Las actividades ejecutadas se desarrollaron conforme al cronograma establecido y no afectaron la ruta crítica del proyecto.</w:t>
       </w:r>
     </w:p>
     <w:p>
@@ -1789,14 +1779,12 @@
         <w:rPr>
           <w:sz w:val="24"/>
         </w:rPr>
-        <w:br w:type="page"/>
       </w:r>
       <w:bookmarkStart w:id="3" w:name="_Toc257128654"/>
       <w:r>
         <w:rPr>
           <w:sz w:val="24"/>
         </w:rPr>
-        <w:lastRenderedPageBreak/>
         <w:t xml:space="preserve"> </w:t>
       </w:r>
     </w:p>
@@ -1813,7 +1801,7 @@
         <w:pStyle w:val="TitulosPy"/>
       </w:pPr>
       <w:r>
-        <w:t>Cambios principales ocurridos desde el último reporte emitido:</w:t>
+        <w:t>Cambios principales ocurridos desde el úúltimo reporte emitido:</w:t>
       </w:r>
     </w:p>
     <w:p/>
@@ -1834,7 +1822,7 @@
           <w:color w:val="000000"/>
           <w:sz w:val="20"/>
         </w:rPr>
-        <w:t>Sin modificaciones de alcance, tiempo ni presupuesto ocurridas en el presente período. Al ser el primer informe formal de avance del ciclo de desarrollo (Semana 4 / Sprint 1), el proyecto se mantiene plenamente alineado a la línea base y la EDT aprobada.</w:t>
+        <w:t>Sin modificaciones de alcance, tiempo ni presupuesto ocurridías en el presente período. Al ser el primer informe formal de avance del ciclo de desarrollo (Semana 4 / Sprint 1), el proyecto se mantiene plenamente alineado a la línea base y la EDT aprobada.</w:t>
       </w:r>
     </w:p>
     <w:p>
@@ -2126,7 +2114,7 @@
           </w:tcPr>
           <w:p>
             <w:r>
-              <w:t>Priorizacin del Product Backlog e historias de usuario</w:t>
+              <w:t>Priorización del Product Backlog e historias de usuario</w:t>
             </w:r>
           </w:p>
         </w:tc>
@@ -2218,7 +2206,7 @@
           </w:tcPr>
           <w:p>
             <w:r>
-              <w:t>TERMINADO (Aceptado por Marcell Vsquez)</w:t>
+              <w:t>TERMINADO (Aceptado por Marcell Vásquez)</w:t>
             </w:r>
           </w:p>
         </w:tc>
@@ -2266,7 +2254,7 @@
           </w:tcPr>
           <w:p>
             <w:r>
-              <w:t>Diseo de interfaces de usuario de alta fidelidad</w:t>
+              <w:t>Diseño de interfaces de usuario de alta fidelidad</w:t>
             </w:r>
           </w:p>
         </w:tc>
@@ -2406,7 +2394,7 @@
           </w:tcPr>
           <w:p>
             <w:r>
-              <w:t>Construccin de Mdulo Transaccional Base (Seguridad y Auth JWT)</w:t>
+              <w:t>Construcción de Módulo Transaccional Base (Seguridad y Auth JWT)</w:t>
             </w:r>
           </w:p>
         </w:tc>
@@ -2498,7 +2486,7 @@
           </w:tcPr>
           <w:p>
             <w:r>
-              <w:t>TERMINADO (Aceptado por Marcell Vsquez)</w:t>
+              <w:t>TERMINADO (Aceptado por Marcell Vásquez)</w:t>
             </w:r>
           </w:p>
         </w:tc>
@@ -2546,7 +2534,7 @@
           </w:tcPr>
           <w:p>
             <w:r>
-              <w:t>Construccin de Mdulo Transaccional Base (Catlogo y Recetas m)</w:t>
+              <w:t>Construcción de Módulo Transaccional Base (Catálogo y Recetas m)</w:t>
             </w:r>
           </w:p>
         </w:tc>
@@ -2569,7 +2557,7 @@
           </w:tcPr>
           <w:p>
             <w:r>
-              <w:t>Frmulas de consumo de lonas y vinilos en PostgreSQL</w:t>
+              <w:t>Fórmulas de consumo de lonas y vinilos en PostgreSQL</w:t>
             </w:r>
           </w:p>
         </w:tc>
@@ -2686,7 +2674,7 @@
           </w:tcPr>
           <w:p>
             <w:r>
-              <w:t>Construccin de Mdulo de Cobros, Caja y Business Intelligence</w:t>
+              <w:t>Construcción de Módulo de Cobros, Caja y Business Intelligence</w:t>
             </w:r>
           </w:p>
         </w:tc>
@@ -2709,7 +2697,7 @@
           </w:tcPr>
           <w:p>
             <w:r>
-              <w:t>Cotizador dinmico, talonario digital y cierre de caja</w:t>
+              <w:t>Cotizador dinámico, talonario digital y cierre de caja</w:t>
             </w:r>
           </w:p>
         </w:tc>
@@ -3042,7 +3030,6 @@
         <w:rPr>
           <w:lang w:val="en-US"/>
         </w:rPr>
-        <w:br w:type="page"/>
       </w:r>
     </w:p>
     <w:p>
@@ -3062,7 +3049,6 @@
           <w:sz w:val="24"/>
           <w:szCs w:val="24"/>
         </w:rPr>
-        <w:lastRenderedPageBreak/>
         <w:t>ANEXO 1</w:t>
       </w:r>
     </w:p>
@@ -3212,7 +3198,7 @@
           </w:tcPr>
           <w:p>
             <w:r>
-              <w:t>EDT 4.1.2 Priorizacin del Product Backlog</w:t>
+              <w:t>EDT 4.1.2 Priorización del Product Backlog</w:t>
             </w:r>
           </w:p>
         </w:tc>
@@ -3283,7 +3269,7 @@
           </w:tcPr>
           <w:p>
             <w:r>
-              <w:t>EDT 3.4.1 Diseo de interfaces de usuario UI</w:t>
+              <w:t>EDT 3.4.1 Diseño de interfaces de usuario UI</w:t>
             </w:r>
           </w:p>
         </w:tc>
@@ -3354,7 +3340,7 @@
           </w:tcPr>
           <w:p>
             <w:r>
-              <w:t>EDT 4.1.1 Construccin de API de Autenticacin JWT</w:t>
+              <w:t>EDT 4.1.1 Construcción de API de Autenticacin JWT</w:t>
             </w:r>
           </w:p>
         </w:tc>
@@ -3519,7 +3505,7 @@
           </w:tcPr>
           <w:p>
             <w:r>
-              <w:t>Frmulas de consumo de lonas y vinilos en base de datos</w:t>
+              <w:t>Fórmulas de consumo de lonas y vinilos en base de datos</w:t>
             </w:r>
           </w:p>
         </w:tc>
@@ -3610,7 +3596,7 @@
                 <w:color w:val="FFFFFF"/>
                 <w:sz w:val="18"/>
               </w:rPr>
-              <w:t>5 actividades evaluadas en la Semana 4</w:t>
+              <w:t>5 actividades evaluadías en la Semana 4</w:t>
             </w:r>
           </w:p>
         </w:tc>
@@ -5487,7 +5473,6 @@
         <w:rPr>
           <w:b/>
         </w:rPr>
-        <w:br w:type="page"/>
       </w:r>
     </w:p>
     <w:p>
@@ -5507,7 +5492,6 @@
           <w:sz w:val="24"/>
           <w:szCs w:val="24"/>
         </w:rPr>
-        <w:lastRenderedPageBreak/>
         <w:t xml:space="preserve">ANEXO </w:t>
       </w:r>
       <w:r>

</xml_diff>

<commit_message>
docs(sem04): erradicar referencias a kanban y alinear terminologia estricta a scrum
</commit_message>
<xml_diff>
--- a/docs/entregables/SEM04/2_Informe de Estado del Proyecto.docx
+++ b/docs/entregables/SEM04/2_Informe de Estado del Proyecto.docx
@@ -2277,7 +2277,7 @@
           </w:tcPr>
           <w:p>
             <w:r>
-              <w:t>Mockups UI de Login, Cotizador, Kanban y Caja</w:t>
+              <w:t>Mockups UI de Login, Cotizador, Taller y Caja</w:t>
             </w:r>
           </w:p>
         </w:tc>
@@ -3292,7 +3292,7 @@
           </w:tcPr>
           <w:p>
             <w:r>
-              <w:t>Prototipos de interfaz de Login, Cotizador, Kanban y Caja</w:t>
+              <w:t>Prototipos de interfaz de Login, Cotizador, Taller y Caja</w:t>
             </w:r>
           </w:p>
         </w:tc>

</xml_diff>

<commit_message>
docs(sem04): corregir ortografia de Vasquez, codificacion utf-8 y alinear excel y word
</commit_message>
<xml_diff>
--- a/docs/entregables/SEM04/2_Informe de Estado del Proyecto.docx
+++ b/docs/entregables/SEM04/2_Informe de Estado del Proyecto.docx
@@ -148,7 +148,7 @@
           <w:color w:val="000000"/>
           <w:sz w:val="26"/>
         </w:rPr>
-        <w:t>Implementación de un sistema web transaccional con módulos de inteligencia de negocios e inteligencia artificial para la optimización de los procesos operativos en la empresa Impresos Trujillo E.I.R.L.</w:t>
+        <w:t>Im²plem²entación de un sistem²a web transaccional con m²ódulos de inteligencia de negocios e inteligencia artificial para la optim²ización de los procesos operativos en la em²presa Im²presos Trujillo E.I.R.L.</w:t>
       </w:r>
     </w:p>
     <w:p>
@@ -628,7 +628,7 @@
                 <w:color w:val="000000"/>
                 <w:sz w:val="18"/>
               </w:rPr>
-              <w:t>Emisión inicial del Informe de Estado del Proyecto al cierre de la Semana 4 (Sprint 1).</w:t>
+              <w:t>Em²isión inicial del Inform²e de Estado del Proyecto al cierre de la Sem²ana 4 (Sprint 1).</w:t>
             </w:r>
           </w:p>
         </w:tc>
@@ -670,7 +670,7 @@
                 <w:color w:val="000000"/>
                 <w:sz w:val="18"/>
               </w:rPr>
-              <w:t>Gerardo Plasencia Torres, Jose Estibb Anhuaman Delgado, Jose Diego Rodriguez Vasquez</w:t>
+              <w:t>Gerardo Plasencia Torres, Jose Estibb Anhuam²an Delgado, Jose Diego Rodríguez Vásquez</w:t>
             </w:r>
           </w:p>
         </w:tc>
@@ -725,7 +725,13 @@
           <w:lang w:eastAsia="es-PE"/>
         </w:rPr>
       </w:pPr>
-      <w:r/>
+      <w:r>
+        <w:t>1.</w:t>
+        <w:tab/>
+        <w:t>Resum²en del Estado del Proyecto</w:t>
+        <w:tab/>
+        <w:t>3</w:t>
+      </w:r>
       <w:r/>
       <w:r/>
       <w:hyperlink w:anchor="_Toc404881684" w:history="1">
@@ -818,80 +824,13 @@
           <w:lang w:eastAsia="es-PE"/>
         </w:rPr>
       </w:pPr>
-      <w:hyperlink w:anchor="_Toc404881685" w:history="1">
-        <w:r>
-          <w:rPr>
-            <w:rStyle w:val="Hipervnculo"/>
-            <w:noProof/>
-          </w:rPr>
-          <w:t>2.</w:t>
-        </w:r>
-        <w:r>
-          <w:rPr>
-            <w:rFonts w:asciiTheme="minorHAnsi" w:eastAsiaTheme="minorEastAsia" w:hAnsiTheme="minorHAnsi" w:cstheme="minorBidi"/>
-            <w:noProof/>
-            <w:sz w:val="22"/>
-            <w:szCs w:val="22"/>
-            <w:lang w:eastAsia="es-PE"/>
-          </w:rPr>
-          <w:tab/>
-        </w:r>
-        <w:r>
-          <w:rPr>
-            <w:rStyle w:val="Hipervnculo"/>
-            <w:noProof/>
-          </w:rPr>
-          <w:t>Trabajo planificado para la siguiente semana</w:t>
-        </w:r>
-        <w:r>
-          <w:rPr>
-            <w:noProof/>
-            <w:webHidden/>
-          </w:rPr>
-          <w:tab/>
-        </w:r>
-        <w:r>
-          <w:rPr>
-            <w:noProof/>
-            <w:webHidden/>
-          </w:rPr>
-          <w:fldChar w:fldCharType="begin"/>
-        </w:r>
-        <w:r>
-          <w:rPr>
-            <w:noProof/>
-            <w:webHidden/>
-          </w:rPr>
-          <w:instrText xml:space="preserve"> PAGEREF _Toc404881685 \h </w:instrText>
-        </w:r>
-        <w:r>
-          <w:rPr>
-            <w:noProof/>
-            <w:webHidden/>
-          </w:rPr>
-        </w:r>
-        <w:r>
-          <w:rPr>
-            <w:noProof/>
-            <w:webHidden/>
-          </w:rPr>
-          <w:fldChar w:fldCharType="separate"/>
-        </w:r>
-        <w:r>
-          <w:rPr>
-            <w:noProof/>
-            <w:webHidden/>
-          </w:rPr>
-          <w:t>4</w:t>
-        </w:r>
-        <w:r>
-          <w:rPr>
-            <w:noProof/>
-            <w:webHidden/>
-          </w:rPr>
-          <w:fldChar w:fldCharType="end"/>
-        </w:r>
-      </w:hyperlink>
+      <w:r>
+        <w:t>2.</w:t>
+        <w:tab/>
+        <w:t>Trabajo planificado para la siguiente sem²ana</w:t>
+        <w:tab/>
+        <w:t>4</w:t>
+      </w:r>
     </w:p>
     <w:p>
       <w:pPr>
@@ -908,80 +847,13 @@
           <w:lang w:eastAsia="es-PE"/>
         </w:rPr>
       </w:pPr>
-      <w:hyperlink w:anchor="_Toc404881686" w:history="1">
-        <w:r>
-          <w:rPr>
-            <w:rStyle w:val="Hipervnculo"/>
-            <w:noProof/>
-          </w:rPr>
-          <w:t>3.</w:t>
-        </w:r>
-        <w:r>
-          <w:rPr>
-            <w:rFonts w:asciiTheme="minorHAnsi" w:eastAsiaTheme="minorEastAsia" w:hAnsiTheme="minorHAnsi" w:cstheme="minorBidi"/>
-            <w:noProof/>
-            <w:sz w:val="22"/>
-            <w:szCs w:val="22"/>
-            <w:lang w:eastAsia="es-PE"/>
-          </w:rPr>
-          <w:tab/>
-        </w:r>
-        <w:r>
-          <w:rPr>
-            <w:rStyle w:val="Hipervnculo"/>
-            <w:noProof/>
-          </w:rPr>
-          <w:t>Mejoras o cambios pendientes</w:t>
-        </w:r>
-        <w:r>
-          <w:rPr>
-            <w:noProof/>
-            <w:webHidden/>
-          </w:rPr>
-          <w:tab/>
-        </w:r>
-        <w:r>
-          <w:rPr>
-            <w:noProof/>
-            <w:webHidden/>
-          </w:rPr>
-          <w:fldChar w:fldCharType="begin"/>
-        </w:r>
-        <w:r>
-          <w:rPr>
-            <w:noProof/>
-            <w:webHidden/>
-          </w:rPr>
-          <w:instrText xml:space="preserve"> PAGEREF _Toc404881686 \h </w:instrText>
-        </w:r>
-        <w:r>
-          <w:rPr>
-            <w:noProof/>
-            <w:webHidden/>
-          </w:rPr>
-        </w:r>
-        <w:r>
-          <w:rPr>
-            <w:noProof/>
-            <w:webHidden/>
-          </w:rPr>
-          <w:fldChar w:fldCharType="separate"/>
-        </w:r>
-        <w:r>
-          <w:rPr>
-            <w:noProof/>
-            <w:webHidden/>
-          </w:rPr>
-          <w:t>4</w:t>
-        </w:r>
-        <w:r>
-          <w:rPr>
-            <w:noProof/>
-            <w:webHidden/>
-          </w:rPr>
-          <w:fldChar w:fldCharType="end"/>
-        </w:r>
-      </w:hyperlink>
+      <w:r>
+        <w:t>3.</w:t>
+        <w:tab/>
+        <w:t>Mejoras o cam²bios pendientes</w:t>
+        <w:tab/>
+        <w:t>4</w:t>
+      </w:r>
     </w:p>
     <w:p>
       <w:pPr>
@@ -1088,80 +960,13 @@
           <w:lang w:eastAsia="es-PE"/>
         </w:rPr>
       </w:pPr>
-      <w:hyperlink w:anchor="_Toc404881688" w:history="1">
-        <w:r>
-          <w:rPr>
-            <w:rStyle w:val="Hipervnculo"/>
-            <w:noProof/>
-          </w:rPr>
-          <w:t>5.</w:t>
-        </w:r>
-        <w:r>
-          <w:rPr>
-            <w:rFonts w:asciiTheme="minorHAnsi" w:eastAsiaTheme="minorEastAsia" w:hAnsiTheme="minorHAnsi" w:cstheme="minorBidi"/>
-            <w:noProof/>
-            <w:sz w:val="22"/>
-            <w:szCs w:val="22"/>
-            <w:lang w:eastAsia="es-PE"/>
-          </w:rPr>
-          <w:tab/>
-        </w:r>
-        <w:r>
-          <w:rPr>
-            <w:rStyle w:val="Hipervnculo"/>
-            <w:noProof/>
-          </w:rPr>
-          <w:t>Indicadores Clave de Desempeño (KPI's)</w:t>
-        </w:r>
-        <w:r>
-          <w:rPr>
-            <w:noProof/>
-            <w:webHidden/>
-          </w:rPr>
-          <w:tab/>
-        </w:r>
-        <w:r>
-          <w:rPr>
-            <w:noProof/>
-            <w:webHidden/>
-          </w:rPr>
-          <w:fldChar w:fldCharType="begin"/>
-        </w:r>
-        <w:r>
-          <w:rPr>
-            <w:noProof/>
-            <w:webHidden/>
-          </w:rPr>
-          <w:instrText xml:space="preserve"> PAGEREF _Toc404881688 \h </w:instrText>
-        </w:r>
-        <w:r>
-          <w:rPr>
-            <w:noProof/>
-            <w:webHidden/>
-          </w:rPr>
-        </w:r>
-        <w:r>
-          <w:rPr>
-            <w:noProof/>
-            <w:webHidden/>
-          </w:rPr>
-          <w:fldChar w:fldCharType="separate"/>
-        </w:r>
-        <w:r>
-          <w:rPr>
-            <w:noProof/>
-            <w:webHidden/>
-          </w:rPr>
-          <w:t>4</w:t>
-        </w:r>
-        <w:r>
-          <w:rPr>
-            <w:noProof/>
-            <w:webHidden/>
-          </w:rPr>
-          <w:fldChar w:fldCharType="end"/>
-        </w:r>
-      </w:hyperlink>
+      <w:r>
+        <w:t>5.</w:t>
+        <w:tab/>
+        <w:t>Indicadores Clave de Desem²peño (KPI's)</w:t>
+        <w:tab/>
+        <w:t>4</w:t>
+      </w:r>
     </w:p>
     <w:p>
       <w:r/>
@@ -1242,7 +1047,7 @@
           <w:color w:val="000000"/>
           <w:sz w:val="20"/>
         </w:rPr>
-        <w:t>El presente proyecto consiste en el diseño, desarrollo e implementación de un sistema web transaccional con módulos de inteligencia de negocios e inteligencia artificial para la empresa Impresos Trujillo E.I.R.L. La solución permitirá gestionar órdenes de trabajo, inventario, cobranzas y reportes, con el objetivo de optimizar los procesos operativos, mejorar el control de la información y apoyar la toma de decisiones dentro de la empresa.</w:t>
+        <w:t>El presente proyecto consiste en el diseño, desarrollo e im²plem²entación de un sistem²a web transaccional con m²ódulos de inteligencia de negocios e inteligencia artificial para la em²presa Im²presos Trujillo E.I.R.L. La solución perm²itirá gestáionar órdenes de trabajo, inventario, cobranzas y reportes, con el objetivo de optim²izar los procesos operativos, m²ejorar el control de la inform²ación y apoyar la tom²a de decisiones dentro de la em²presa.</w:t>
       </w:r>
     </w:p>
     <w:p>
@@ -1272,67 +1077,58 @@
         <w:rPr>
           <w:rStyle w:val="TitulosPyCar"/>
         </w:rPr>
-        <w:t>R</w:t>
+        <w:t>Resum²en del Estado del Proyecto</w:t>
+        <w:tab/>
       </w:r>
       <w:r>
         <w:rPr>
           <w:rStyle w:val="TitulosPyCar"/>
         </w:rPr>
-        <w:t>e</w:t>
       </w:r>
       <w:r>
         <w:rPr>
           <w:rStyle w:val="TitulosPyCar"/>
         </w:rPr>
-        <w:t>sumen</w:t>
       </w:r>
       <w:r>
         <w:rPr>
           <w:rStyle w:val="TitulosPyCar"/>
         </w:rPr>
-        <w:t xml:space="preserve"> </w:t>
       </w:r>
       <w:r>
         <w:rPr>
           <w:rStyle w:val="TitulosPyCar"/>
         </w:rPr>
-        <w:t>del</w:t>
       </w:r>
       <w:r>
         <w:rPr>
           <w:rStyle w:val="TitulosPyCar"/>
         </w:rPr>
-        <w:t xml:space="preserve"> E</w:t>
       </w:r>
       <w:r>
         <w:rPr>
           <w:rStyle w:val="TitulosPyCar"/>
         </w:rPr>
-        <w:t>stado</w:t>
       </w:r>
       <w:r>
         <w:rPr>
           <w:rStyle w:val="TitulosPyCar"/>
         </w:rPr>
-        <w:t xml:space="preserve"> </w:t>
       </w:r>
       <w:r>
         <w:rPr>
           <w:rStyle w:val="TitulosPyCar"/>
         </w:rPr>
-        <w:t>del</w:t>
       </w:r>
       <w:r>
         <w:rPr>
           <w:rStyle w:val="TitulosPyCar"/>
         </w:rPr>
-        <w:t xml:space="preserve"> P</w:t>
       </w:r>
       <w:r>
         <w:rPr>
           <w:rStyle w:val="TitulosPyCar"/>
         </w:rPr>
-        <w:t>royecto</w:t>
       </w:r>
       <w:bookmarkEnd w:id="2"/>
       <w:r>
@@ -1343,7 +1139,6 @@
           <w:sz w:val="28"/>
           <w:szCs w:val="28"/>
         </w:rPr>
-        <w:tab/>
       </w:r>
     </w:p>
     <w:p>
@@ -1435,7 +1230,7 @@
               </w:rPr>
               <w:t>Alcance: VERDE</w:t>
               <w:br/>
-              <w:t>(80.0% Cumplimiento)</w:t>
+              <w:t>(80.0% Cum²plim²iento)</w:t>
             </w:r>
           </w:p>
         </w:tc>
@@ -1472,7 +1267,7 @@
                 <w:color w:val="FFFFFF"/>
                 <w:sz w:val="21"/>
               </w:rPr>
-              <w:t>Tiempo: VERDE</w:t>
+              <w:t>Tiem²po: VERDE</w:t>
               <w:br/>
               <w:t>(83.3% En Plazo)</w:t>
             </w:r>
@@ -1513,7 +1308,7 @@
               </w:rPr>
               <w:t>Costo: VERDE</w:t>
               <w:br/>
-              <w:t>(93.3% Presupuestado)</w:t>
+              <w:t>(93.3% Presupuestáado)</w:t>
             </w:r>
           </w:p>
         </w:tc>
@@ -1581,7 +1376,7 @@
           <w:color w:val="000000"/>
           <w:sz w:val="20"/>
         </w:rPr>
-        <w:t>Respecto al Alcance: El indicador de alcance del proyecto está en VERDE debido a que el porcentaje de culminación de los entregables y actividades técnicas correspondientes a la Semana 4 (Sprint 1) ha alcanzado el 80.0% de cumplimiento promedio (ver Anexo 1, Tabla 3 para mayor detalle), superando el umbral mínimo del 75% estipulado en la leyenda oficial.</w:t>
+        <w:t>Respecto al Alcance: El indicador de alcance del proyecto estáá en VERDE debido a que el porcentaje de culm²inación de los entregables y actividíades técnicas correspondientes a la Sem²ana 4 (Sprint 1) ha alcanzado el 80.0% de cum²plim²iento prom²edio (ver Anexo 1, Tabla 3 para m²ayor detalle), superando el um²bral m²ínim²o del 75% estáipulado en la leyendía oficial.</w:t>
       </w:r>
     </w:p>
     <w:p>
@@ -1613,7 +1408,7 @@
           <w:color w:val="000000"/>
           <w:sz w:val="20"/>
         </w:rPr>
-        <w:t>Respecto al Tiempo: El indicador de tiempo del proyecto está en VERDE debido a que las actividades previstas dentro del período de evaluación del Sprint 1 se han completado dentro del plazo establecido en un 83.3% (ver Anexo 1, Tabla 4 para mayor detalle), habiendo resuelto el úúnico impedimento de integración en menos de 24 horas.</w:t>
+        <w:t>Respecto al Tiem²po: El indicador de tiem²po del proyecto estáá en VERDE debido a que las actividíades previstas dentro del período de evaluación del Sprint 1 se han com²pletado dentro del plazo estáablecido en un 83.3% (ver Anexo 1, Tabla 4 para m²ayor detalle), habiendo resuelto el úúúnico im²pedim²ento de integración en m²enos de 24 horas.</w:t>
       </w:r>
     </w:p>
     <w:p>
@@ -1645,7 +1440,7 @@
           <w:color w:val="000000"/>
           <w:sz w:val="20"/>
         </w:rPr>
-        <w:t>Respecto al Costo: El indicador de costo del proyecto está en VERDE debido a que el costo real acumulado de las actividades ejecutadías se sitúa en S/ 1,400.00, representando un 93.3% del valor planificado (S/ 1,500.00), manteniéndose estrictamente por debajo del 100% presupuestado (ver Anexo 1, Tabla 5 para mayor detalle).</w:t>
+        <w:t>Respecto al Costo: El indicador de costo del proyecto estáá en VERDE debido a que el costo real acum²ulado de las actividíades ejecutadías se sitúa en S/ 1,400.00, representando un 93.3% del valor planificado (S/ 1,500.00), m²anteniéndose estárictam²ente por debajo del 100% presupuestáado (ver Anexo 1, Tabla 5 para m²ayor detalle).</w:t>
       </w:r>
     </w:p>
     <w:p>
@@ -1742,7 +1537,7 @@
           <w:color w:val="000000"/>
           <w:sz w:val="20"/>
         </w:rPr>
-        <w:t>Durante la Semana 4 se inició el Sprint 1 del proyecto. El equipo avanzó en la configuración del entorno de desarrollo, la implementación de la autenticación de usuarios, el modelado de la base de datos y la construcción de las primeras interfaces del sistema. Las actividades ejecutadas se desarrollaron conforme al cronograma establecido y no afectaron la ruta crítica del proyecto.</w:t>
+        <w:t>Durante la Sem²ana 4 se inició el Sprint 1 del proyecto. El equipo avanzó en la configuración del entorno de desarrollo, la im²plem²entación de la autenticación de usuarios, el m²odelado de la base de díatos y la construcción de las prim²eras interfaces del sistem²a. Las actividíades ejecutadías se desarrollaron conform²e al cronogram²a estáablecido y no afectaron la ruta crítica del proyecto.</w:t>
       </w:r>
     </w:p>
     <w:p>
@@ -1801,7 +1596,7 @@
         <w:pStyle w:val="TitulosPy"/>
       </w:pPr>
       <w:r>
-        <w:t>Cambios principales ocurridos desde el úúltimo reporte emitido:</w:t>
+        <w:t>Cam²bios principales ocurridos desde el úúltim²o reporte em²itido:</w:t>
       </w:r>
     </w:p>
     <w:p/>
@@ -1822,7 +1617,7 @@
           <w:color w:val="000000"/>
           <w:sz w:val="20"/>
         </w:rPr>
-        <w:t>Sin modificaciones de alcance, tiempo ni presupuesto ocurridías en el presente período. Al ser el primer informe formal de avance del ciclo de desarrollo (Semana 4 / Sprint 1), el proyecto se mantiene plenamente alineado a la línea base y la EDT aprobada.</w:t>
+        <w:t>Sin m²odificaciones de alcance, tiem²po ni presupuestáo ocurridías en el presente período. Al ser el prim²er inform²e form²al de avance del ciclo de desarrollo (Sem²ana 4 / Sprint 1), el proyecto se m²antiene plenam²ente alineado a la línea base y la EDT aprobadía.</w:t>
       </w:r>
     </w:p>
     <w:p>
@@ -1838,28 +1633,16 @@
       </w:pPr>
       <w:bookmarkStart w:id="4" w:name="_Toc404881687"/>
       <w:r>
-        <w:t>H</w:t>
+        <w:t>Hitos y entregables del proyecto (Sem²ana/Mes Actual y Siguiente):</w:t>
       </w:r>
-      <w:r>
-        <w:t>itos y entregables del proyecto</w:t>
-      </w:r>
-      <w:r>
-        <w:t xml:space="preserve"> </w:t>
-      </w:r>
-      <w:r>
-        <w:t>(Semana</w:t>
-      </w:r>
-      <w:r>
-        <w:t>/Mes</w:t>
-      </w:r>
+      <w:r/>
+      <w:r/>
+      <w:r/>
+      <w:r/>
       <w:bookmarkStart w:id="5" w:name="_GoBack"/>
       <w:bookmarkEnd w:id="5"/>
-      <w:r>
-        <w:t xml:space="preserve"> Actual y Siguiente)</w:t>
-      </w:r>
-      <w:r>
-        <w:t>:</w:t>
-      </w:r>
+      <w:r/>
+      <w:r/>
       <w:bookmarkEnd w:id="4"/>
     </w:p>
     <w:p>
@@ -1991,7 +1774,7 @@
                 <w:color w:val="FFFFFF"/>
                 <w:sz w:val="18"/>
               </w:rPr>
-              <w:t>Fecha Planeada</w:t>
+              <w:t>Fecha Planeadía Culm²inación</w:t>
             </w:r>
             <w:r>
               <w:rPr>
@@ -2000,7 +1783,6 @@
                 <w:color w:val="FFFFFF"/>
                 <w:sz w:val="18"/>
               </w:rPr>
-              <w:t xml:space="preserve"> Culminación</w:t>
             </w:r>
           </w:p>
         </w:tc>
@@ -2137,7 +1919,7 @@
           </w:tcPr>
           <w:p>
             <w:r>
-              <w:t>Product Backlog formalizado con 10 historias y DoD</w:t>
+              <w:t>Product Backlog form²alizado con 10 historias y DoD</w:t>
             </w:r>
           </w:p>
         </w:tc>
@@ -2254,7 +2036,7 @@
           </w:tcPr>
           <w:p>
             <w:r>
-              <w:t>Diseño de interfaces de usuario de alta fidelidad</w:t>
+              <w:t>Diseño de interfaces de usuario de alta fidelidíad</w:t>
             </w:r>
           </w:p>
         </w:tc>
@@ -2346,7 +2128,7 @@
           </w:tcPr>
           <w:p>
             <w:r>
-              <w:t>TERMINADO (Validado en equipo)</w:t>
+              <w:t>TERMINADO (Validíado en equipo)</w:t>
             </w:r>
           </w:p>
         </w:tc>
@@ -2394,7 +2176,7 @@
           </w:tcPr>
           <w:p>
             <w:r>
-              <w:t>Construcción de Módulo Transaccional Base (Seguridad y Auth JWT)</w:t>
+              <w:t>Construcción de Módulo Transaccional Base (Seguridíad y Auth JWT)</w:t>
             </w:r>
           </w:p>
         </w:tc>
@@ -2417,7 +2199,7 @@
           </w:tcPr>
           <w:p>
             <w:r>
-              <w:t>API Auth FastAPI y componente Login Angular 21</w:t>
+              <w:t>API Auth FastAPI y com²ponente Login Angular 21</w:t>
             </w:r>
           </w:p>
         </w:tc>
@@ -2534,7 +2316,7 @@
           </w:tcPr>
           <w:p>
             <w:r>
-              <w:t>Construcción de Módulo Transaccional Base (Catálogo y Recetas m)</w:t>
+              <w:t>Construcción de Módulo Transaccional Base (Catálogo y Recetas m²)</w:t>
             </w:r>
           </w:p>
         </w:tc>
@@ -2557,7 +2339,7 @@
           </w:tcPr>
           <w:p>
             <w:r>
-              <w:t>Fórmulas de consumo de lonas y vinilos en PostgreSQL</w:t>
+              <w:t>Fórm²ulas de consum²o de lonas y vinilos en PostgreSQL</w:t>
             </w:r>
           </w:p>
         </w:tc>
@@ -2697,7 +2479,7 @@
           </w:tcPr>
           <w:p>
             <w:r>
-              <w:t>Cotizador dinámico, talonario digital y cierre de caja</w:t>
+              <w:t>Cotizador dinám²ico, talonario digital y cierre de caja</w:t>
             </w:r>
           </w:p>
         </w:tc>
@@ -2788,19 +2570,13 @@
       </w:pPr>
       <w:bookmarkStart w:id="6" w:name="_Toc404881688"/>
       <w:r>
-        <w:t xml:space="preserve">Indicadores Clave de Desempeño </w:t>
+        <w:t>Indicadores Clave de Desem²peño (KPI's)</w:t>
       </w:r>
-      <w:r>
-        <w:t>(</w:t>
-      </w:r>
+      <w:r/>
       <w:proofErr w:type="spellStart"/>
-      <w:r>
-        <w:t>KPI's</w:t>
-      </w:r>
+      <w:r/>
       <w:proofErr w:type="spellEnd"/>
-      <w:r>
-        <w:t>)</w:t>
-      </w:r>
+      <w:r/>
       <w:bookmarkEnd w:id="6"/>
     </w:p>
     <w:p>
@@ -2831,7 +2607,7 @@
           <w:color w:val="000000"/>
           <w:sz w:val="20"/>
         </w:rPr>
-        <w:t>Tiempo — El Proyecto se encuentra alineado con respecto al cronograma (variación marginal controlada):</w:t>
+        <w:t>Tiem²po — El Proyecto se encuentra alineado con respecto al cronogram²a (variación m²arginal controladía):</w:t>
       </w:r>
     </w:p>
     <w:p>
@@ -2858,7 +2634,7 @@
         <w:tab/>
         <w:t>-S/ 50.00</w:t>
         <w:tab/>
-        <w:t>(Margen mínimo absorbido en el Sprint)</w:t>
+        <w:t>(Margen m²ínim²o absorbido en el Sprint)</w:t>
       </w:r>
     </w:p>
     <w:p>
@@ -2882,11 +2658,11 @@
           <w:color w:val="000000"/>
           <w:sz w:val="19"/>
         </w:rPr>
-        <w:t>Schedule Performance Index (SPI):</w:t>
+        <w:t>Schedule Perform²ance Index (SPI):</w:t>
         <w:tab/>
         <w:t>0.97</w:t>
         <w:tab/>
-        <w:t>(Eficiencia de cronograma: 97%)</w:t>
+        <w:t>(Eficiencia de cronogram²a: 97%)</w:t>
       </w:r>
     </w:p>
     <w:p>
@@ -2922,7 +2698,7 @@
           <w:color w:val="000000"/>
           <w:sz w:val="20"/>
         </w:rPr>
-        <w:t>Costo — El Proyecto está por debajo de lo presupuestado (ahorro operativo):</w:t>
+        <w:t>Costo — El Proyecto estáá por debajo de lo presupuestáado (ahorro operativo):</w:t>
       </w:r>
     </w:p>
     <w:p>
@@ -2973,11 +2749,11 @@
           <w:color w:val="000000"/>
           <w:sz w:val="19"/>
         </w:rPr>
-        <w:t>Cost Performance Index (CPI):</w:t>
+        <w:t>Cost Perform²ance Index (CPI):</w:t>
         <w:tab/>
         <w:t>1.04</w:t>
         <w:tab/>
-        <w:t>(Rendimiento de costo superior a la unidad)</w:t>
+        <w:t>(Rendim²iento de costo superior a la unidíad)</w:t>
       </w:r>
     </w:p>
     <w:p>
@@ -3221,7 +2997,7 @@
           </w:tcPr>
           <w:p>
             <w:r>
-              <w:t>Product Backlog formalizado con 10 historias y mockups</w:t>
+              <w:t>Product Backlog form²alizado con 10 historias y m²ockups</w:t>
             </w:r>
           </w:p>
         </w:tc>
@@ -3434,7 +3210,7 @@
           </w:tcPr>
           <w:p>
             <w:r>
-              <w:t>Formulario reactivo Angular 21 con guards RBAC activos</w:t>
+              <w:t>Form²ulario reactivo Angular 21 con guards RBAC activos</w:t>
             </w:r>
           </w:p>
         </w:tc>
@@ -3482,7 +3258,7 @@
           </w:tcPr>
           <w:p>
             <w:r>
-              <w:t>EDT 4.1.1 Parametrizacin de recetas de insumos por m</w:t>
+              <w:t>EDT 4.1.1 Param²etrizacin de recetas de insum²os por m²</w:t>
             </w:r>
           </w:p>
         </w:tc>
@@ -3505,7 +3281,7 @@
           </w:tcPr>
           <w:p>
             <w:r>
-              <w:t>Fórmulas de consumo de lonas y vinilos en base de datos</w:t>
+              <w:t>Fórm²ulas de consum²o de lonas y vinilos en base de díatos</w:t>
             </w:r>
           </w:p>
         </w:tc>
@@ -3563,7 +3339,7 @@
                 <w:color w:val="FFFFFF"/>
                 <w:sz w:val="18"/>
               </w:rPr>
-              <w:t>Cumplimiento Promedio Global del Período</w:t>
+              <w:t>Cum²plim²iento Prom²edio Global del Período</w:t>
             </w:r>
           </w:p>
         </w:tc>
@@ -3596,7 +3372,7 @@
                 <w:color w:val="FFFFFF"/>
                 <w:sz w:val="18"/>
               </w:rPr>
-              <w:t>5 actividades evaluadías en la Semana 4</w:t>
+              <w:t>5 actividíades evaluadías en la Sem²ana 4</w:t>
             </w:r>
           </w:p>
         </w:tc>
@@ -3833,7 +3609,7 @@
                 <w:color w:val="000000"/>
                 <w:sz w:val="17"/>
               </w:rPr>
-              <w:t>Configuración de entorno Docker local y base de datos</w:t>
+              <w:t>Configuración de entorno Docker local y base de díatos</w:t>
             </w:r>
           </w:p>
         </w:tc>
@@ -4235,7 +4011,7 @@
                 <w:color w:val="000000"/>
                 <w:sz w:val="17"/>
               </w:rPr>
-              <w:t>Componente de Login y Guards de navegación Angular</w:t>
+              <w:t>Com²ponente de Login y Guards de navegación Angular</w:t>
             </w:r>
           </w:p>
         </w:tc>
@@ -4369,7 +4145,7 @@
                 <w:color w:val="000000"/>
                 <w:sz w:val="17"/>
               </w:rPr>
-              <w:t>Parametrización de catálogo y recetas de insumos por m²</w:t>
+              <w:t>Param²etrización de catálogo y recetas de insum²os por m²²</w:t>
             </w:r>
           </w:p>
         </w:tc>
@@ -4503,7 +4279,7 @@
                 <w:color w:val="FFFFFF"/>
                 <w:sz w:val="18"/>
               </w:rPr>
-              <w:t>Cumplimiento Promedio de Tiempo</w:t>
+              <w:t>Cum²plim²iento Prom²edio de Tiem²po</w:t>
             </w:r>
           </w:p>
         </w:tc>
@@ -4569,7 +4345,7 @@
                 <w:color w:val="FFFFFF"/>
                 <w:sz w:val="18"/>
               </w:rPr>
-              <w:t>14 días insumidos</w:t>
+              <w:t>14 días insum²idos</w:t>
             </w:r>
           </w:p>
         </w:tc>
@@ -4778,7 +4554,7 @@
                 <w:color w:val="000000"/>
                 <w:sz w:val="17"/>
               </w:rPr>
-              <w:t>Configuración de entorno Docker Compose y PostgreSQL</w:t>
+              <w:t>Configuración de entorno Docker Com²pose y PostgreSQL</w:t>
             </w:r>
           </w:p>
         </w:tc>
@@ -4879,7 +4655,7 @@
                 <w:color w:val="000000"/>
                 <w:sz w:val="17"/>
               </w:rPr>
-              <w:t>Modelado relacional de datos y tablas de Usuarios</w:t>
+              <w:t>Modelado relacional de díatos y tablas de Usuarios</w:t>
             </w:r>
           </w:p>
         </w:tc>
@@ -5182,7 +4958,7 @@
                 <w:color w:val="000000"/>
                 <w:sz w:val="17"/>
               </w:rPr>
-              <w:t>Parametrización de catálogo de insumos y recetas por m²</w:t>
+              <w:t>Param²etrización de catálogo de insum²os y recetas por m²²</w:t>
             </w:r>
           </w:p>
         </w:tc>
@@ -5525,19 +5301,17 @@
         <w:rPr>
           <w:rFonts w:ascii="Calibri" w:hAnsi="Calibri"/>
         </w:rPr>
-        <w:t>Leyenda</w:t>
+        <w:t>Leyendía del Alcance:</w:t>
       </w:r>
       <w:r>
         <w:rPr>
           <w:rFonts w:ascii="Calibri" w:hAnsi="Calibri"/>
         </w:rPr>
-        <w:t xml:space="preserve"> del Alcance</w:t>
       </w:r>
       <w:r>
         <w:rPr>
           <w:rFonts w:ascii="Calibri" w:hAnsi="Calibri"/>
         </w:rPr>
-        <w:t>:</w:t>
       </w:r>
     </w:p>
     <w:p>
@@ -5674,7 +5448,7 @@
                 <w:color w:val="000000"/>
                 <w:sz w:val="17"/>
               </w:rPr>
-              <w:t>Los entregables correspondientes al periodo de evaluación se han completado en un porcentaje mayor o igual a 75</w:t>
+              <w:t>Los entregables correspondientes al periodo de evaluación se han com²pletado en un porcentaje m²ayor o igual a 75</w:t>
             </w:r>
           </w:p>
         </w:tc>
@@ -5707,7 +5481,7 @@
                 <w:color w:val="000000"/>
                 <w:sz w:val="17"/>
               </w:rPr>
-              <w:t>Amarillo</w:t>
+              <w:t>Am²arillo</w:t>
             </w:r>
           </w:p>
         </w:tc>
@@ -5734,7 +5508,7 @@
                 <w:color w:val="000000"/>
                 <w:sz w:val="17"/>
               </w:rPr>
-              <w:t>Los entregables correspondientes al periodo de evaluación se han completado en un porcentaje menor a 75%, pero mayor o igual a 50%</w:t>
+              <w:t>Los entregables correspondientes al periodo de evaluación se han com²pletado en un porcentaje m²enor a 75%, pero m²ayor o igual a 50%</w:t>
             </w:r>
           </w:p>
         </w:tc>
@@ -5795,7 +5569,7 @@
                 <w:color w:val="000000"/>
                 <w:sz w:val="17"/>
               </w:rPr>
-              <w:t>Los entregables correspondientes al periodo de evaluación se han completado en un porcentaje menor a 50%</w:t>
+              <w:t>Los entregables correspondientes al periodo de evaluación se han com²pletado en un porcentaje m²enor a 50%</w:t>
             </w:r>
           </w:p>
         </w:tc>
@@ -5822,19 +5596,17 @@
         <w:rPr>
           <w:rFonts w:ascii="Calibri" w:hAnsi="Calibri"/>
         </w:rPr>
-        <w:t>Leyenda</w:t>
+        <w:t>Leyendía del Tiem²po:</w:t>
       </w:r>
       <w:r>
         <w:rPr>
           <w:rFonts w:ascii="Calibri" w:hAnsi="Calibri"/>
         </w:rPr>
-        <w:t xml:space="preserve"> del Tiempo</w:t>
       </w:r>
       <w:r>
         <w:rPr>
           <w:rFonts w:ascii="Calibri" w:hAnsi="Calibri"/>
         </w:rPr>
-        <w:t>:</w:t>
       </w:r>
     </w:p>
     <w:p>
@@ -5968,7 +5740,7 @@
                 <w:color w:val="000000"/>
                 <w:sz w:val="17"/>
               </w:rPr>
-              <w:t>Las actividades correspondientes al periodo de evaluación se han completado dentro del plazo previsto en un porcentaje mayor o igual a 75</w:t>
+              <w:t>Las actividíades correspondientes al periodo de evaluación se han com²pletado dentro del plazo previsto en un porcentaje m²ayor o igual a 75</w:t>
             </w:r>
           </w:p>
         </w:tc>
@@ -6001,7 +5773,7 @@
                 <w:color w:val="000000"/>
                 <w:sz w:val="17"/>
               </w:rPr>
-              <w:t>Amarillo</w:t>
+              <w:t>Am²arillo</w:t>
             </w:r>
           </w:p>
         </w:tc>
@@ -6028,7 +5800,7 @@
                 <w:color w:val="000000"/>
                 <w:sz w:val="17"/>
               </w:rPr>
-              <w:t>Las actividades correspondientes al periodo de evaluación se han completado dentro del plazo previsto en un porcentaje menor a 75, pero mayor o igual a 50</w:t>
+              <w:t>Las actividíades correspondientes al periodo de evaluación se han com²pletado dentro del plazo previsto en un porcentaje m²enor a 75, pero m²ayor o igual a 50</w:t>
             </w:r>
           </w:p>
         </w:tc>
@@ -6089,7 +5861,7 @@
                 <w:color w:val="000000"/>
                 <w:sz w:val="17"/>
               </w:rPr>
-              <w:t>Las actividades correspondientes al periodo de evaluación se han completado dentro del plazo previsto en un porcentaje menor a 50</w:t>
+              <w:t>Las actividíades correspondientes al periodo de evaluación se han com²pletado dentro del plazo previsto en un porcentaje m²enor a 50</w:t>
             </w:r>
           </w:p>
         </w:tc>
@@ -6116,19 +5888,17 @@
         <w:rPr>
           <w:rFonts w:ascii="Calibri" w:hAnsi="Calibri"/>
         </w:rPr>
-        <w:t>Leyenda</w:t>
+        <w:t>Leyendía del Costo:</w:t>
       </w:r>
       <w:r>
         <w:rPr>
           <w:rFonts w:ascii="Calibri" w:hAnsi="Calibri"/>
         </w:rPr>
-        <w:t xml:space="preserve"> del Costo</w:t>
       </w:r>
       <w:r>
         <w:rPr>
           <w:rFonts w:ascii="Calibri" w:hAnsi="Calibri"/>
         </w:rPr>
-        <w:t>:</w:t>
       </w:r>
     </w:p>
     <w:p>
@@ -6262,7 +6032,7 @@
                 <w:color w:val="000000"/>
                 <w:sz w:val="17"/>
               </w:rPr>
-              <w:t>El costo real de las actividades correspondientes al periodo de evaluación es menor o igual al 100% del costo presupuestado.</w:t>
+              <w:t>El costo real de las actividíades correspondientes al periodo de evaluación es m²enor o igual al 100% del costo presupuestáado.</w:t>
             </w:r>
           </w:p>
         </w:tc>
@@ -6295,7 +6065,7 @@
                 <w:color w:val="000000"/>
                 <w:sz w:val="17"/>
               </w:rPr>
-              <w:t>Amarillo</w:t>
+              <w:t>Am²arillo</w:t>
             </w:r>
           </w:p>
         </w:tc>
@@ -6322,7 +6092,7 @@
                 <w:color w:val="000000"/>
                 <w:sz w:val="17"/>
               </w:rPr>
-              <w:t>El costo real de las actividades correspondientes al periodo de evaluación es mayor al 100% del costo presupuestado, pero menor o igual al 110%.</w:t>
+              <w:t>El costo real de las actividíades correspondientes al periodo de evaluación es m²ayor al 100% del costo presupuestáado, pero m²enor o igual al 110%.</w:t>
             </w:r>
           </w:p>
         </w:tc>
@@ -6383,7 +6153,7 @@
                 <w:color w:val="000000"/>
                 <w:sz w:val="17"/>
               </w:rPr>
-              <w:t>El costo real de las actividades correspondientes al periodo de evaluación es mayor al 110% del costo presupuestado.</w:t>
+              <w:t>El costo real de las actividíades correspondientes al periodo de evaluación es m²ayor al 110% del costo presupuestáado.</w:t>
             </w:r>
           </w:p>
         </w:tc>

</xml_diff>

<commit_message>
fix(docs): subsanar reemplazo espurio de m2 en textos y normalizar Vasquez y ortografia
</commit_message>
<xml_diff>
--- a/docs/entregables/SEM04/2_Informe de Estado del Proyecto.docx
+++ b/docs/entregables/SEM04/2_Informe de Estado del Proyecto.docx
@@ -148,7 +148,7 @@
           <w:color w:val="000000"/>
           <w:sz w:val="26"/>
         </w:rPr>
-        <w:t>Im²plem²entación de un sistem²a web transaccional con m²ódulos de inteligencia de negocios e inteligencia artificial para la optim²ización de los procesos operativos en la em²presa Im²presos Trujillo E.I.R.L.</w:t>
+        <w:t>Implementación de un sistema web transaccional con módulos de inteligencia de negocios e inteligencia artificial para la optimización de los procesos operativos en la empresa Impresos Trujillo E.I.R.L.</w:t>
       </w:r>
     </w:p>
     <w:p>
@@ -628,7 +628,7 @@
                 <w:color w:val="000000"/>
                 <w:sz w:val="18"/>
               </w:rPr>
-              <w:t>Em²isión inicial del Inform²e de Estado del Proyecto al cierre de la Sem²ana 4 (Sprint 1).</w:t>
+              <w:t>Emisión inicial del Informe de Estado del Proyecto al cierre de la Semana 4 (Sprint 1).</w:t>
             </w:r>
           </w:p>
         </w:tc>
@@ -670,7 +670,7 @@
                 <w:color w:val="000000"/>
                 <w:sz w:val="18"/>
               </w:rPr>
-              <w:t>Gerardo Plasencia Torres, Jose Estibb Anhuam²an Delgado, Jose Diego Rodríguez Vásquez</w:t>
+              <w:t>Gerardo Plasencia Torres, Jose Estibb Anhuaman Delgado, Jose Diego Rodríguez Vásquez</w:t>
             </w:r>
           </w:p>
         </w:tc>
@@ -725,13 +725,7 @@
           <w:lang w:eastAsia="es-PE"/>
         </w:rPr>
       </w:pPr>
-      <w:r>
-        <w:t>1.</w:t>
-        <w:tab/>
-        <w:t>Resum²en del Estado del Proyecto</w:t>
-        <w:tab/>
-        <w:t>3</w:t>
-      </w:r>
+      <w:r/>
       <w:r/>
       <w:r/>
       <w:hyperlink w:anchor="_Toc404881684" w:history="1">
@@ -824,13 +818,80 @@
           <w:lang w:eastAsia="es-PE"/>
         </w:rPr>
       </w:pPr>
-      <w:r>
-        <w:t>2.</w:t>
-        <w:tab/>
-        <w:t>Trabajo planificado para la siguiente sem²ana</w:t>
-        <w:tab/>
-        <w:t>4</w:t>
-      </w:r>
+      <w:hyperlink w:anchor="_Toc404881685" w:history="1">
+        <w:r>
+          <w:rPr>
+            <w:rStyle w:val="Hipervnculo"/>
+            <w:noProof/>
+          </w:rPr>
+          <w:t>2.</w:t>
+        </w:r>
+        <w:r>
+          <w:rPr>
+            <w:rFonts w:asciiTheme="minorHAnsi" w:eastAsiaTheme="minorEastAsia" w:hAnsiTheme="minorHAnsi" w:cstheme="minorBidi"/>
+            <w:noProof/>
+            <w:sz w:val="22"/>
+            <w:szCs w:val="22"/>
+            <w:lang w:eastAsia="es-PE"/>
+          </w:rPr>
+          <w:tab/>
+        </w:r>
+        <w:r>
+          <w:rPr>
+            <w:rStyle w:val="Hipervnculo"/>
+            <w:noProof/>
+          </w:rPr>
+          <w:t>Trabajo planificado para la siguiente semana</w:t>
+        </w:r>
+        <w:r>
+          <w:rPr>
+            <w:noProof/>
+            <w:webHidden/>
+          </w:rPr>
+          <w:tab/>
+        </w:r>
+        <w:r>
+          <w:rPr>
+            <w:noProof/>
+            <w:webHidden/>
+          </w:rPr>
+          <w:fldChar w:fldCharType="begin"/>
+        </w:r>
+        <w:r>
+          <w:rPr>
+            <w:noProof/>
+            <w:webHidden/>
+          </w:rPr>
+          <w:instrText xml:space="preserve"> PAGEREF _Toc404881685 \h </w:instrText>
+        </w:r>
+        <w:r>
+          <w:rPr>
+            <w:noProof/>
+            <w:webHidden/>
+          </w:rPr>
+        </w:r>
+        <w:r>
+          <w:rPr>
+            <w:noProof/>
+            <w:webHidden/>
+          </w:rPr>
+          <w:fldChar w:fldCharType="separate"/>
+        </w:r>
+        <w:r>
+          <w:rPr>
+            <w:noProof/>
+            <w:webHidden/>
+          </w:rPr>
+          <w:t>4</w:t>
+        </w:r>
+        <w:r>
+          <w:rPr>
+            <w:noProof/>
+            <w:webHidden/>
+          </w:rPr>
+          <w:fldChar w:fldCharType="end"/>
+        </w:r>
+      </w:hyperlink>
     </w:p>
     <w:p>
       <w:pPr>
@@ -847,13 +908,80 @@
           <w:lang w:eastAsia="es-PE"/>
         </w:rPr>
       </w:pPr>
-      <w:r>
-        <w:t>3.</w:t>
-        <w:tab/>
-        <w:t>Mejoras o cam²bios pendientes</w:t>
-        <w:tab/>
-        <w:t>4</w:t>
-      </w:r>
+      <w:hyperlink w:anchor="_Toc404881686" w:history="1">
+        <w:r>
+          <w:rPr>
+            <w:rStyle w:val="Hipervnculo"/>
+            <w:noProof/>
+          </w:rPr>
+          <w:t>3.</w:t>
+        </w:r>
+        <w:r>
+          <w:rPr>
+            <w:rFonts w:asciiTheme="minorHAnsi" w:eastAsiaTheme="minorEastAsia" w:hAnsiTheme="minorHAnsi" w:cstheme="minorBidi"/>
+            <w:noProof/>
+            <w:sz w:val="22"/>
+            <w:szCs w:val="22"/>
+            <w:lang w:eastAsia="es-PE"/>
+          </w:rPr>
+          <w:tab/>
+        </w:r>
+        <w:r>
+          <w:rPr>
+            <w:rStyle w:val="Hipervnculo"/>
+            <w:noProof/>
+          </w:rPr>
+          <w:t>Mejoras o cambios pendientes</w:t>
+        </w:r>
+        <w:r>
+          <w:rPr>
+            <w:noProof/>
+            <w:webHidden/>
+          </w:rPr>
+          <w:tab/>
+        </w:r>
+        <w:r>
+          <w:rPr>
+            <w:noProof/>
+            <w:webHidden/>
+          </w:rPr>
+          <w:fldChar w:fldCharType="begin"/>
+        </w:r>
+        <w:r>
+          <w:rPr>
+            <w:noProof/>
+            <w:webHidden/>
+          </w:rPr>
+          <w:instrText xml:space="preserve"> PAGEREF _Toc404881686 \h </w:instrText>
+        </w:r>
+        <w:r>
+          <w:rPr>
+            <w:noProof/>
+            <w:webHidden/>
+          </w:rPr>
+        </w:r>
+        <w:r>
+          <w:rPr>
+            <w:noProof/>
+            <w:webHidden/>
+          </w:rPr>
+          <w:fldChar w:fldCharType="separate"/>
+        </w:r>
+        <w:r>
+          <w:rPr>
+            <w:noProof/>
+            <w:webHidden/>
+          </w:rPr>
+          <w:t>4</w:t>
+        </w:r>
+        <w:r>
+          <w:rPr>
+            <w:noProof/>
+            <w:webHidden/>
+          </w:rPr>
+          <w:fldChar w:fldCharType="end"/>
+        </w:r>
+      </w:hyperlink>
     </w:p>
     <w:p>
       <w:pPr>
@@ -960,13 +1088,80 @@
           <w:lang w:eastAsia="es-PE"/>
         </w:rPr>
       </w:pPr>
-      <w:r>
-        <w:t>5.</w:t>
-        <w:tab/>
-        <w:t>Indicadores Clave de Desem²peño (KPI's)</w:t>
-        <w:tab/>
-        <w:t>4</w:t>
-      </w:r>
+      <w:hyperlink w:anchor="_Toc404881688" w:history="1">
+        <w:r>
+          <w:rPr>
+            <w:rStyle w:val="Hipervnculo"/>
+            <w:noProof/>
+          </w:rPr>
+          <w:t>5.</w:t>
+        </w:r>
+        <w:r>
+          <w:rPr>
+            <w:rFonts w:asciiTheme="minorHAnsi" w:eastAsiaTheme="minorEastAsia" w:hAnsiTheme="minorHAnsi" w:cstheme="minorBidi"/>
+            <w:noProof/>
+            <w:sz w:val="22"/>
+            <w:szCs w:val="22"/>
+            <w:lang w:eastAsia="es-PE"/>
+          </w:rPr>
+          <w:tab/>
+        </w:r>
+        <w:r>
+          <w:rPr>
+            <w:rStyle w:val="Hipervnculo"/>
+            <w:noProof/>
+          </w:rPr>
+          <w:t>Indicadores Clave de Desempeño (KPI's)</w:t>
+        </w:r>
+        <w:r>
+          <w:rPr>
+            <w:noProof/>
+            <w:webHidden/>
+          </w:rPr>
+          <w:tab/>
+        </w:r>
+        <w:r>
+          <w:rPr>
+            <w:noProof/>
+            <w:webHidden/>
+          </w:rPr>
+          <w:fldChar w:fldCharType="begin"/>
+        </w:r>
+        <w:r>
+          <w:rPr>
+            <w:noProof/>
+            <w:webHidden/>
+          </w:rPr>
+          <w:instrText xml:space="preserve"> PAGEREF _Toc404881688 \h </w:instrText>
+        </w:r>
+        <w:r>
+          <w:rPr>
+            <w:noProof/>
+            <w:webHidden/>
+          </w:rPr>
+        </w:r>
+        <w:r>
+          <w:rPr>
+            <w:noProof/>
+            <w:webHidden/>
+          </w:rPr>
+          <w:fldChar w:fldCharType="separate"/>
+        </w:r>
+        <w:r>
+          <w:rPr>
+            <w:noProof/>
+            <w:webHidden/>
+          </w:rPr>
+          <w:t>4</w:t>
+        </w:r>
+        <w:r>
+          <w:rPr>
+            <w:noProof/>
+            <w:webHidden/>
+          </w:rPr>
+          <w:fldChar w:fldCharType="end"/>
+        </w:r>
+      </w:hyperlink>
     </w:p>
     <w:p>
       <w:r/>
@@ -1047,7 +1242,7 @@
           <w:color w:val="000000"/>
           <w:sz w:val="20"/>
         </w:rPr>
-        <w:t>El presente proyecto consiste en el diseño, desarrollo e im²plem²entación de un sistem²a web transaccional con m²ódulos de inteligencia de negocios e inteligencia artificial para la em²presa Im²presos Trujillo E.I.R.L. La solución perm²itirá gestáionar órdenes de trabajo, inventario, cobranzas y reportes, con el objetivo de optim²izar los procesos operativos, m²ejorar el control de la inform²ación y apoyar la tom²a de decisiones dentro de la em²presa.</w:t>
+        <w:t>El presente proyecto consiste en el diseño, desarrollo e implementación de un sistema web transaccional con módulos de inteligencia de negocios e inteligencia artificial para la empresa Impresos Trujillo E.I.R.L. La solución permitirá gestionar órdenes de trabajo, inventario, cobranzas y reportes, con el objetivo de optimizar los procesos operativos, mejorar el control de la información y apoyar la toma de decisiones dentro de la empresa.</w:t>
       </w:r>
     </w:p>
     <w:p>
@@ -1077,58 +1272,67 @@
         <w:rPr>
           <w:rStyle w:val="TitulosPyCar"/>
         </w:rPr>
-        <w:t>Resum²en del Estado del Proyecto</w:t>
-        <w:tab/>
+        <w:t>R</w:t>
       </w:r>
       <w:r>
         <w:rPr>
           <w:rStyle w:val="TitulosPyCar"/>
         </w:rPr>
+        <w:t>e</w:t>
       </w:r>
       <w:r>
         <w:rPr>
           <w:rStyle w:val="TitulosPyCar"/>
         </w:rPr>
+        <w:t>sumen</w:t>
       </w:r>
       <w:r>
         <w:rPr>
           <w:rStyle w:val="TitulosPyCar"/>
         </w:rPr>
+        <w:t xml:space="preserve"> </w:t>
       </w:r>
       <w:r>
         <w:rPr>
           <w:rStyle w:val="TitulosPyCar"/>
         </w:rPr>
+        <w:t>del</w:t>
       </w:r>
       <w:r>
         <w:rPr>
           <w:rStyle w:val="TitulosPyCar"/>
         </w:rPr>
+        <w:t xml:space="preserve"> E</w:t>
       </w:r>
       <w:r>
         <w:rPr>
           <w:rStyle w:val="TitulosPyCar"/>
         </w:rPr>
+        <w:t>stado</w:t>
       </w:r>
       <w:r>
         <w:rPr>
           <w:rStyle w:val="TitulosPyCar"/>
         </w:rPr>
+        <w:t xml:space="preserve"> </w:t>
       </w:r>
       <w:r>
         <w:rPr>
           <w:rStyle w:val="TitulosPyCar"/>
         </w:rPr>
+        <w:t>del</w:t>
       </w:r>
       <w:r>
         <w:rPr>
           <w:rStyle w:val="TitulosPyCar"/>
         </w:rPr>
+        <w:t xml:space="preserve"> P</w:t>
       </w:r>
       <w:r>
         <w:rPr>
           <w:rStyle w:val="TitulosPyCar"/>
         </w:rPr>
+        <w:t>royecto</w:t>
       </w:r>
       <w:bookmarkEnd w:id="2"/>
       <w:r>
@@ -1139,6 +1343,7 @@
           <w:sz w:val="28"/>
           <w:szCs w:val="28"/>
         </w:rPr>
+        <w:tab/>
       </w:r>
     </w:p>
     <w:p>
@@ -1230,7 +1435,7 @@
               </w:rPr>
               <w:t>Alcance: VERDE</w:t>
               <w:br/>
-              <w:t>(80.0% Cum²plim²iento)</w:t>
+              <w:t>(80.0% Cumplimiento)</w:t>
             </w:r>
           </w:p>
         </w:tc>
@@ -1267,7 +1472,7 @@
                 <w:color w:val="FFFFFF"/>
                 <w:sz w:val="21"/>
               </w:rPr>
-              <w:t>Tiem²po: VERDE</w:t>
+              <w:t>Tiempo: VERDE</w:t>
               <w:br/>
               <w:t>(83.3% En Plazo)</w:t>
             </w:r>
@@ -1308,7 +1513,7 @@
               </w:rPr>
               <w:t>Costo: VERDE</w:t>
               <w:br/>
-              <w:t>(93.3% Presupuestáado)</w:t>
+              <w:t>(93.3% Presupuestado)</w:t>
             </w:r>
           </w:p>
         </w:tc>
@@ -1376,7 +1581,7 @@
           <w:color w:val="000000"/>
           <w:sz w:val="20"/>
         </w:rPr>
-        <w:t>Respecto al Alcance: El indicador de alcance del proyecto estáá en VERDE debido a que el porcentaje de culm²inación de los entregables y actividíades técnicas correspondientes a la Sem²ana 4 (Sprint 1) ha alcanzado el 80.0% de cum²plim²iento prom²edio (ver Anexo 1, Tabla 3 para m²ayor detalle), superando el um²bral m²ínim²o del 75% estáipulado en la leyendía oficial.</w:t>
+        <w:t>Respecto al Alcance: El indicador de alcance del proyecto está en VERDE debido a que el porcentaje de culminación de los entregables y actividades técnicas correspondientes a la Semana 4 (Sprint 1) ha alcanzado el 80.0% de cumplimiento promedio (ver Anexo 1, Tabla 3 para mayor detalle), superando el umbral mínimo del 75% estipulado en la leyenda oficial.</w:t>
       </w:r>
     </w:p>
     <w:p>
@@ -1408,7 +1613,7 @@
           <w:color w:val="000000"/>
           <w:sz w:val="20"/>
         </w:rPr>
-        <w:t>Respecto al Tiem²po: El indicador de tiem²po del proyecto estáá en VERDE debido a que las actividíades previstas dentro del período de evaluación del Sprint 1 se han com²pletado dentro del plazo estáablecido en un 83.3% (ver Anexo 1, Tabla 4 para m²ayor detalle), habiendo resuelto el úúúnico im²pedim²ento de integración en m²enos de 24 horas.</w:t>
+        <w:t>Respecto al Tiempo: El indicador de tiempo del proyecto está en VERDE debido a que las actividades previstas dentro del período de evaluación del Sprint 1 —se han completado dentro del plazo establecido en un 83.3% (ver Anexo 1, Tabla 4 para mayor detalle), habiendo resuelto el úúúnico impedimento de integración en menos de 24 horas.</w:t>
       </w:r>
     </w:p>
     <w:p>
@@ -1440,7 +1645,7 @@
           <w:color w:val="000000"/>
           <w:sz w:val="20"/>
         </w:rPr>
-        <w:t>Respecto al Costo: El indicador de costo del proyecto estáá en VERDE debido a que el costo real acum²ulado de las actividíades ejecutadías se sitúa en S/ 1,400.00, representando un 93.3% del valor planificado (S/ 1,500.00), m²anteniéndose estárictam²ente por debajo del 100% presupuestáado (ver Anexo 1, Tabla 5 para m²ayor detalle).</w:t>
+        <w:t>Respecto al Costo: El indicador de costo del proyecto está en VERDE debido a que el costo real acumulado de las actividades ejecutadías se sitúa en S/ 1,400.00, representando un 93.3% del valor planificado (S/ 1,500.00), manteniéndose estrictamente por debajo del 100% presupuestado (ver Anexo 1, Tabla 5 para mayor detalle).</w:t>
       </w:r>
     </w:p>
     <w:p>
@@ -1537,7 +1742,7 @@
           <w:color w:val="000000"/>
           <w:sz w:val="20"/>
         </w:rPr>
-        <w:t>Durante la Sem²ana 4 se inició el Sprint 1 del proyecto. El equipo avanzó en la configuración del entorno de desarrollo, la im²plem²entación de la autenticación de usuarios, el m²odelado de la base de díatos y la construcción de las prim²eras interfaces del sistem²a. Las actividíades ejecutadías se desarrollaron conform²e al cronogram²a estáablecido y no afectaron la ruta crítica del proyecto.</w:t>
+        <w:t>Durante la Semana 4 se inició el Sprint 1 —del proyecto. El equipo avanzó en la configuración del entorno de desarrollo, la implementación de la autenticación de usuarios, el modelado de la base de datos y la construcción de las primeras interfaces del sistema. Las actividades ejecutadías se desarrollaron conforme al cronograma establecido y no afectaron la ruta crítica del proyecto.</w:t>
       </w:r>
     </w:p>
     <w:p>
@@ -1596,7 +1801,7 @@
         <w:pStyle w:val="TitulosPy"/>
       </w:pPr>
       <w:r>
-        <w:t>Cam²bios principales ocurridos desde el úúltim²o reporte em²itido:</w:t>
+        <w:t>Cambios principales ocurridos desde el úúúltimo reporte emitido:</w:t>
       </w:r>
     </w:p>
     <w:p/>
@@ -1617,7 +1822,7 @@
           <w:color w:val="000000"/>
           <w:sz w:val="20"/>
         </w:rPr>
-        <w:t>Sin m²odificaciones de alcance, tiem²po ni presupuestáo ocurridías en el presente período. Al ser el prim²er inform²e form²al de avance del ciclo de desarrollo (Sem²ana 4 / Sprint 1), el proyecto se m²antiene plenam²ente alineado a la línea base y la EDT aprobadía.</w:t>
+        <w:t>Sin modificaciones de alcance, tiempo ni presupuesto ocurridías en el presente período. Al ser el primer informe formal de avance del ciclo de desarrollo (Semana 4 / Sprint 1), el proyecto se mantiene plenamente alineado a la línea base y la EDT aprobada.</w:t>
       </w:r>
     </w:p>
     <w:p>
@@ -1633,16 +1838,28 @@
       </w:pPr>
       <w:bookmarkStart w:id="4" w:name="_Toc404881687"/>
       <w:r>
-        <w:t>Hitos y entregables del proyecto (Sem²ana/Mes Actual y Siguiente):</w:t>
+        <w:t>H</w:t>
       </w:r>
-      <w:r/>
-      <w:r/>
-      <w:r/>
-      <w:r/>
+      <w:r>
+        <w:t>itos y entregables del proyecto</w:t>
+      </w:r>
+      <w:r>
+        <w:t xml:space="preserve"> </w:t>
+      </w:r>
+      <w:r>
+        <w:t>(Semana</w:t>
+      </w:r>
+      <w:r>
+        <w:t>/Mes</w:t>
+      </w:r>
       <w:bookmarkStart w:id="5" w:name="_GoBack"/>
       <w:bookmarkEnd w:id="5"/>
-      <w:r/>
-      <w:r/>
+      <w:r>
+        <w:t xml:space="preserve"> Actual y Siguiente)</w:t>
+      </w:r>
+      <w:r>
+        <w:t>:</w:t>
+      </w:r>
       <w:bookmarkEnd w:id="4"/>
     </w:p>
     <w:p>
@@ -1774,7 +1991,7 @@
                 <w:color w:val="FFFFFF"/>
                 <w:sz w:val="18"/>
               </w:rPr>
-              <w:t>Fecha Planeadía Culm²inación</w:t>
+              <w:t>Fecha Planeada</w:t>
             </w:r>
             <w:r>
               <w:rPr>
@@ -1783,6 +2000,7 @@
                 <w:color w:val="FFFFFF"/>
                 <w:sz w:val="18"/>
               </w:rPr>
+              <w:t xml:space="preserve"> Culminación</w:t>
             </w:r>
           </w:p>
         </w:tc>
@@ -1919,7 +2137,7 @@
           </w:tcPr>
           <w:p>
             <w:r>
-              <w:t>Product Backlog form²alizado con 10 historias y DoD</w:t>
+              <w:t>Product Backlog formalizado con 10 historias y DoD</w:t>
             </w:r>
           </w:p>
         </w:tc>
@@ -2036,7 +2254,7 @@
           </w:tcPr>
           <w:p>
             <w:r>
-              <w:t>Diseño de interfaces de usuario de alta fidelidíad</w:t>
+              <w:t>Diseño de interfaces de usuario de alta fidelidad</w:t>
             </w:r>
           </w:p>
         </w:tc>
@@ -2128,7 +2346,7 @@
           </w:tcPr>
           <w:p>
             <w:r>
-              <w:t>TERMINADO (Validíado en equipo)</w:t>
+              <w:t>TERMINADO (Validado en equipo)</w:t>
             </w:r>
           </w:p>
         </w:tc>
@@ -2176,7 +2394,7 @@
           </w:tcPr>
           <w:p>
             <w:r>
-              <w:t>Construcción de Módulo Transaccional Base (Seguridíad y Auth JWT)</w:t>
+              <w:t>Construcción de Módulo Transaccional Base (Seguridad y Auth JWT)</w:t>
             </w:r>
           </w:p>
         </w:tc>
@@ -2199,7 +2417,7 @@
           </w:tcPr>
           <w:p>
             <w:r>
-              <w:t>API Auth FastAPI y com²ponente Login Angular 21</w:t>
+              <w:t>API Auth FastAPI y componente Login Angular 21</w:t>
             </w:r>
           </w:p>
         </w:tc>
@@ -2316,7 +2534,7 @@
           </w:tcPr>
           <w:p>
             <w:r>
-              <w:t>Construcción de Módulo Transaccional Base (Catálogo y Recetas m²)</w:t>
+              <w:t>Construcción de Módulo Transaccional Base (Catálogo y Recetas m)</w:t>
             </w:r>
           </w:p>
         </w:tc>
@@ -2339,7 +2557,7 @@
           </w:tcPr>
           <w:p>
             <w:r>
-              <w:t>Fórm²ulas de consum²o de lonas y vinilos en PostgreSQL</w:t>
+              <w:t>Fórmulas de consumo de lonas y vinilos en PostgreSQL</w:t>
             </w:r>
           </w:p>
         </w:tc>
@@ -2479,7 +2697,7 @@
           </w:tcPr>
           <w:p>
             <w:r>
-              <w:t>Cotizador dinám²ico, talonario digital y cierre de caja</w:t>
+              <w:t>Cotizador dinámico, talonario digital y cierre de caja</w:t>
             </w:r>
           </w:p>
         </w:tc>
@@ -2570,13 +2788,19 @@
       </w:pPr>
       <w:bookmarkStart w:id="6" w:name="_Toc404881688"/>
       <w:r>
-        <w:t>Indicadores Clave de Desem²peño (KPI's)</w:t>
+        <w:t xml:space="preserve">Indicadores Clave de Desempeño </w:t>
       </w:r>
-      <w:r/>
+      <w:r>
+        <w:t>(</w:t>
+      </w:r>
       <w:proofErr w:type="spellStart"/>
-      <w:r/>
+      <w:r>
+        <w:t>KPI's</w:t>
+      </w:r>
       <w:proofErr w:type="spellEnd"/>
-      <w:r/>
+      <w:r>
+        <w:t>)</w:t>
+      </w:r>
       <w:bookmarkEnd w:id="6"/>
     </w:p>
     <w:p>
@@ -2607,7 +2831,7 @@
           <w:color w:val="000000"/>
           <w:sz w:val="20"/>
         </w:rPr>
-        <w:t>Tiem²po — El Proyecto se encuentra alineado con respecto al cronogram²a (variación m²arginal controladía):</w:t>
+        <w:t>Tiempo — El Proyecto se encuentra alineado con respecto al cronograma (variación marginal controlada):</w:t>
       </w:r>
     </w:p>
     <w:p>
@@ -2634,7 +2858,7 @@
         <w:tab/>
         <w:t>-S/ 50.00</w:t>
         <w:tab/>
-        <w:t>(Margen m²ínim²o absorbido en el Sprint)</w:t>
+        <w:t>(Margen mínimo absorbido en el Sprint)</w:t>
       </w:r>
     </w:p>
     <w:p>
@@ -2658,11 +2882,11 @@
           <w:color w:val="000000"/>
           <w:sz w:val="19"/>
         </w:rPr>
-        <w:t>Schedule Perform²ance Index (SPI):</w:t>
+        <w:t>Schedule Performance Index (SPI):</w:t>
         <w:tab/>
         <w:t>0.97</w:t>
         <w:tab/>
-        <w:t>(Eficiencia de cronogram²a: 97%)</w:t>
+        <w:t>(Eficiencia de cronograma: 97%)</w:t>
       </w:r>
     </w:p>
     <w:p>
@@ -2698,7 +2922,7 @@
           <w:color w:val="000000"/>
           <w:sz w:val="20"/>
         </w:rPr>
-        <w:t>Costo — El Proyecto estáá por debajo de lo presupuestáado (ahorro operativo):</w:t>
+        <w:t>Costo — El Proyecto está por debajo de lo presupuestado (ahorro operativo):</w:t>
       </w:r>
     </w:p>
     <w:p>
@@ -2749,11 +2973,11 @@
           <w:color w:val="000000"/>
           <w:sz w:val="19"/>
         </w:rPr>
-        <w:t>Cost Perform²ance Index (CPI):</w:t>
+        <w:t>Cost Performance Index (CPI):</w:t>
         <w:tab/>
         <w:t>1.04</w:t>
         <w:tab/>
-        <w:t>(Rendim²iento de costo superior a la unidíad)</w:t>
+        <w:t>(Rendimiento de costo superior a la unidad)</w:t>
       </w:r>
     </w:p>
     <w:p>
@@ -2997,7 +3221,7 @@
           </w:tcPr>
           <w:p>
             <w:r>
-              <w:t>Product Backlog form²alizado con 10 historias y m²ockups</w:t>
+              <w:t>Product Backlog formalizado con 10 historias y mockups</w:t>
             </w:r>
           </w:p>
         </w:tc>
@@ -3210,7 +3434,7 @@
           </w:tcPr>
           <w:p>
             <w:r>
-              <w:t>Form²ulario reactivo Angular 21 con guards RBAC activos</w:t>
+              <w:t>Formulario reactivo Angular 21 con guards RBAC activos</w:t>
             </w:r>
           </w:p>
         </w:tc>
@@ -3258,7 +3482,7 @@
           </w:tcPr>
           <w:p>
             <w:r>
-              <w:t>EDT 4.1.1 Param²etrizacin de recetas de insum²os por m²</w:t>
+              <w:t>EDT 4.1.1 Parametrizacin de recetas de insumos por m</w:t>
             </w:r>
           </w:p>
         </w:tc>
@@ -3281,7 +3505,7 @@
           </w:tcPr>
           <w:p>
             <w:r>
-              <w:t>Fórm²ulas de consum²o de lonas y vinilos en base de díatos</w:t>
+              <w:t>Fórmulas de consumo de lonas y vinilos en base de datos</w:t>
             </w:r>
           </w:p>
         </w:tc>
@@ -3339,7 +3563,7 @@
                 <w:color w:val="FFFFFF"/>
                 <w:sz w:val="18"/>
               </w:rPr>
-              <w:t>Cum²plim²iento Prom²edio Global del Período</w:t>
+              <w:t>Cumplimiento Promedio Global del Período</w:t>
             </w:r>
           </w:p>
         </w:tc>
@@ -3372,7 +3596,7 @@
                 <w:color w:val="FFFFFF"/>
                 <w:sz w:val="18"/>
               </w:rPr>
-              <w:t>5 actividíades evaluadías en la Sem²ana 4</w:t>
+              <w:t>5 actividades evaluadías en la Semana 4</w:t>
             </w:r>
           </w:p>
         </w:tc>
@@ -3609,7 +3833,7 @@
                 <w:color w:val="000000"/>
                 <w:sz w:val="17"/>
               </w:rPr>
-              <w:t>Configuración de entorno Docker local y base de díatos</w:t>
+              <w:t>Configuración de entorno Docker local y base de datos</w:t>
             </w:r>
           </w:p>
         </w:tc>
@@ -4011,7 +4235,7 @@
                 <w:color w:val="000000"/>
                 <w:sz w:val="17"/>
               </w:rPr>
-              <w:t>Com²ponente de Login y Guards de navegación Angular</w:t>
+              <w:t>Componente de Login y Guards de navegación Angular</w:t>
             </w:r>
           </w:p>
         </w:tc>
@@ -4145,7 +4369,7 @@
                 <w:color w:val="000000"/>
                 <w:sz w:val="17"/>
               </w:rPr>
-              <w:t>Param²etrización de catálogo y recetas de insum²os por m²²</w:t>
+              <w:t>Parametrización de catálogo y recetas de insumos por m²</w:t>
             </w:r>
           </w:p>
         </w:tc>
@@ -4279,7 +4503,7 @@
                 <w:color w:val="FFFFFF"/>
                 <w:sz w:val="18"/>
               </w:rPr>
-              <w:t>Cum²plim²iento Prom²edio de Tiem²po</w:t>
+              <w:t>Cumplimiento Promedio de Tiempo</w:t>
             </w:r>
           </w:p>
         </w:tc>
@@ -4345,7 +4569,7 @@
                 <w:color w:val="FFFFFF"/>
                 <w:sz w:val="18"/>
               </w:rPr>
-              <w:t>14 días insum²idos</w:t>
+              <w:t>14 días insumidos</w:t>
             </w:r>
           </w:p>
         </w:tc>
@@ -4554,7 +4778,7 @@
                 <w:color w:val="000000"/>
                 <w:sz w:val="17"/>
               </w:rPr>
-              <w:t>Configuración de entorno Docker Com²pose y PostgreSQL</w:t>
+              <w:t>Configuración de entorno Docker Compose y PostgreSQL</w:t>
             </w:r>
           </w:p>
         </w:tc>
@@ -4655,7 +4879,7 @@
                 <w:color w:val="000000"/>
                 <w:sz w:val="17"/>
               </w:rPr>
-              <w:t>Modelado relacional de díatos y tablas de Usuarios</w:t>
+              <w:t>Modelado relacional de datos y tablas de Usuarios</w:t>
             </w:r>
           </w:p>
         </w:tc>
@@ -4958,7 +5182,7 @@
                 <w:color w:val="000000"/>
                 <w:sz w:val="17"/>
               </w:rPr>
-              <w:t>Param²etrización de catálogo de insum²os y recetas por m²²</w:t>
+              <w:t>Parametrización de catálogo de insumos y recetas por m²²</w:t>
             </w:r>
           </w:p>
         </w:tc>
@@ -5301,17 +5525,19 @@
         <w:rPr>
           <w:rFonts w:ascii="Calibri" w:hAnsi="Calibri"/>
         </w:rPr>
-        <w:t>Leyendía del Alcance:</w:t>
+        <w:t>Leyenda</w:t>
       </w:r>
       <w:r>
         <w:rPr>
           <w:rFonts w:ascii="Calibri" w:hAnsi="Calibri"/>
         </w:rPr>
+        <w:t xml:space="preserve"> del Alcance</w:t>
       </w:r>
       <w:r>
         <w:rPr>
           <w:rFonts w:ascii="Calibri" w:hAnsi="Calibri"/>
         </w:rPr>
+        <w:t>:</w:t>
       </w:r>
     </w:p>
     <w:p>
@@ -5448,7 +5674,7 @@
                 <w:color w:val="000000"/>
                 <w:sz w:val="17"/>
               </w:rPr>
-              <w:t>Los entregables correspondientes al periodo de evaluación se han com²pletado en un porcentaje m²ayor o igual a 75</w:t>
+              <w:t>Los entregables correspondientes al periodo de evaluación se han completado en un porcentaje mayor o igual a 75</w:t>
             </w:r>
           </w:p>
         </w:tc>
@@ -5481,7 +5707,7 @@
                 <w:color w:val="000000"/>
                 <w:sz w:val="17"/>
               </w:rPr>
-              <w:t>Am²arillo</w:t>
+              <w:t>Amarillo</w:t>
             </w:r>
           </w:p>
         </w:tc>
@@ -5508,7 +5734,7 @@
                 <w:color w:val="000000"/>
                 <w:sz w:val="17"/>
               </w:rPr>
-              <w:t>Los entregables correspondientes al periodo de evaluación se han com²pletado en un porcentaje m²enor a 75%, pero m²ayor o igual a 50%</w:t>
+              <w:t>Los entregables correspondientes al periodo de evaluación se han completado en un porcentaje menor a 75%, pero mayor o igual a 50%</w:t>
             </w:r>
           </w:p>
         </w:tc>
@@ -5569,7 +5795,7 @@
                 <w:color w:val="000000"/>
                 <w:sz w:val="17"/>
               </w:rPr>
-              <w:t>Los entregables correspondientes al periodo de evaluación se han com²pletado en un porcentaje m²enor a 50%</w:t>
+              <w:t>Los entregables correspondientes al periodo de evaluación se han completado en un porcentaje menor a 50%</w:t>
             </w:r>
           </w:p>
         </w:tc>
@@ -5596,17 +5822,19 @@
         <w:rPr>
           <w:rFonts w:ascii="Calibri" w:hAnsi="Calibri"/>
         </w:rPr>
-        <w:t>Leyendía del Tiem²po:</w:t>
+        <w:t>Leyenda</w:t>
       </w:r>
       <w:r>
         <w:rPr>
           <w:rFonts w:ascii="Calibri" w:hAnsi="Calibri"/>
         </w:rPr>
+        <w:t xml:space="preserve"> del Tiempo</w:t>
       </w:r>
       <w:r>
         <w:rPr>
           <w:rFonts w:ascii="Calibri" w:hAnsi="Calibri"/>
         </w:rPr>
+        <w:t>:</w:t>
       </w:r>
     </w:p>
     <w:p>
@@ -5740,7 +5968,7 @@
                 <w:color w:val="000000"/>
                 <w:sz w:val="17"/>
               </w:rPr>
-              <w:t>Las actividíades correspondientes al periodo de evaluación se han com²pletado dentro del plazo previsto en un porcentaje m²ayor o igual a 75</w:t>
+              <w:t>Las actividades correspondientes al periodo de evaluación se han completado dentro del plazo previsto en un porcentaje mayor o igual a 75</w:t>
             </w:r>
           </w:p>
         </w:tc>
@@ -5773,7 +6001,7 @@
                 <w:color w:val="000000"/>
                 <w:sz w:val="17"/>
               </w:rPr>
-              <w:t>Am²arillo</w:t>
+              <w:t>Amarillo</w:t>
             </w:r>
           </w:p>
         </w:tc>
@@ -5800,7 +6028,7 @@
                 <w:color w:val="000000"/>
                 <w:sz w:val="17"/>
               </w:rPr>
-              <w:t>Las actividíades correspondientes al periodo de evaluación se han com²pletado dentro del plazo previsto en un porcentaje m²enor a 75, pero m²ayor o igual a 50</w:t>
+              <w:t>Las actividades correspondientes al periodo de evaluación se han completado dentro del plazo previsto en un porcentaje menor a 75, pero mayor o igual a 50</w:t>
             </w:r>
           </w:p>
         </w:tc>
@@ -5861,7 +6089,7 @@
                 <w:color w:val="000000"/>
                 <w:sz w:val="17"/>
               </w:rPr>
-              <w:t>Las actividíades correspondientes al periodo de evaluación se han com²pletado dentro del plazo previsto en un porcentaje m²enor a 50</w:t>
+              <w:t>Las actividades correspondientes al periodo de evaluación se han completado dentro del plazo previsto en un porcentaje menor a 50</w:t>
             </w:r>
           </w:p>
         </w:tc>
@@ -5888,17 +6116,19 @@
         <w:rPr>
           <w:rFonts w:ascii="Calibri" w:hAnsi="Calibri"/>
         </w:rPr>
-        <w:t>Leyendía del Costo:</w:t>
+        <w:t>Leyenda</w:t>
       </w:r>
       <w:r>
         <w:rPr>
           <w:rFonts w:ascii="Calibri" w:hAnsi="Calibri"/>
         </w:rPr>
+        <w:t xml:space="preserve"> del Costo</w:t>
       </w:r>
       <w:r>
         <w:rPr>
           <w:rFonts w:ascii="Calibri" w:hAnsi="Calibri"/>
         </w:rPr>
+        <w:t>:</w:t>
       </w:r>
     </w:p>
     <w:p>
@@ -6032,7 +6262,7 @@
                 <w:color w:val="000000"/>
                 <w:sz w:val="17"/>
               </w:rPr>
-              <w:t>El costo real de las actividíades correspondientes al periodo de evaluación es m²enor o igual al 100% del costo presupuestáado.</w:t>
+              <w:t>El costo real de las actividades correspondientes al periodo de evaluación es menor o igual al 100% del costo presupuestado.</w:t>
             </w:r>
           </w:p>
         </w:tc>
@@ -6065,7 +6295,7 @@
                 <w:color w:val="000000"/>
                 <w:sz w:val="17"/>
               </w:rPr>
-              <w:t>Am²arillo</w:t>
+              <w:t>Amarillo</w:t>
             </w:r>
           </w:p>
         </w:tc>
@@ -6092,7 +6322,7 @@
                 <w:color w:val="000000"/>
                 <w:sz w:val="17"/>
               </w:rPr>
-              <w:t>El costo real de las actividíades correspondientes al periodo de evaluación es m²ayor al 100% del costo presupuestáado, pero m²enor o igual al 110%.</w:t>
+              <w:t>El costo real de las actividades correspondientes al periodo de evaluación es mayor al 100% del costo presupuestado, pero menor o igual al 110%.</w:t>
             </w:r>
           </w:p>
         </w:tc>
@@ -6153,7 +6383,7 @@
                 <w:color w:val="000000"/>
                 <w:sz w:val="17"/>
               </w:rPr>
-              <w:t>El costo real de las actividíades correspondientes al periodo de evaluación es m²ayor al 110% del costo presupuestáado.</w:t>
+              <w:t>El costo real de las actividades correspondientes al periodo de evaluación es mayor al 110% del costo presupuestado.</w:t>
             </w:r>
           </w:p>
         </w:tc>

</xml_diff>

<commit_message>
docs(sem04): reestructurar scrum diario sincerando tareas de desarrollo lun-vie, sprint review y traspaso a sprint 2
</commit_message>
<xml_diff>
--- a/docs/entregables/SEM04/2_Informe de Estado del Proyecto.docx
+++ b/docs/entregables/SEM04/2_Informe de Estado del Proyecto.docx
@@ -1607,13 +1607,7 @@
         </w:rPr>
       </w:pPr>
       <w:r>
-        <w:rPr>
-          <w:rFonts w:ascii="Calibri" w:hAnsi="Calibri"/>
-          <w:b w:val="0"/>
-          <w:color w:val="000000"/>
-          <w:sz w:val="20"/>
-        </w:rPr>
-        <w:t>Respecto al Tiempo: El indicador de tiempo del proyecto está en VERDE debido a que las actividades previstas dentro del período de evaluación del Sprint 1 —se han completado dentro del plazo establecido en un 83.3% (ver Anexo 1, Tabla 4 para mayor detalle), habiendo resuelto el úúúnico impedimento de integración en menos de 24 horas.</w:t>
+        <w:t>Respecto al Tiempo: El indicador de tiempo del proyecto está en VERDE debido a que las actividades previstas dentro del período de evaluación del Sprint 1 —se han completado dentro del plazo establecido en un 83.3% (ver Anexo 1, Tabla 4 para mayor detalle), habiendo resuelto el único impedimento de integración en menos de 24 horas.</w:t>
       </w:r>
     </w:p>
     <w:p>
@@ -1801,7 +1795,7 @@
         <w:pStyle w:val="TitulosPy"/>
       </w:pPr>
       <w:r>
-        <w:t>Cambios principales ocurridos desde el úúúltimo reporte emitido:</w:t>
+        <w:t>Cambios principales ocurridos desde el último reporte emitido:</w:t>
       </w:r>
     </w:p>
     <w:p/>

</xml_diff>

<commit_message>
docs(sem04-05): subsanar observaciones docentes de semana 4 y generar acta de aceptacion formal
</commit_message>
<xml_diff>
--- a/docs/entregables/SEM04/2_Informe de Estado del Proyecto.docx
+++ b/docs/entregables/SEM04/2_Informe de Estado del Proyecto.docx
@@ -672,6 +672,84 @@
         </w:tc>
       </w:tr>
       <w:bookmarkEnd w:id="0"/>
+      <w:tr>
+        <w:tc>
+          <w:tcPr>
+            <w:tcW w:type="dxa" w:w="1237"/>
+          </w:tcPr>
+          <w:p>
+            <w:pPr>
+              <w:jc w:val="left"/>
+            </w:pPr>
+            <w:r>
+              <w:rPr>
+                <w:rFonts w:ascii="Calibri" w:hAnsi="Calibri"/>
+                <w:b w:val="0"/>
+                <w:color w:val="000000"/>
+                <w:sz w:val="18"/>
+              </w:rPr>
+              <w:t>1.1</w:t>
+            </w:r>
+          </w:p>
+        </w:tc>
+        <w:tc>
+          <w:tcPr>
+            <w:tcW w:type="dxa" w:w="1283"/>
+          </w:tcPr>
+          <w:p>
+            <w:pPr>
+              <w:jc w:val="left"/>
+            </w:pPr>
+            <w:r>
+              <w:rPr>
+                <w:rFonts w:ascii="Calibri" w:hAnsi="Calibri"/>
+                <w:b w:val="0"/>
+                <w:color w:val="000000"/>
+                <w:sz w:val="18"/>
+              </w:rPr>
+              <w:t>25/09/2026</w:t>
+            </w:r>
+          </w:p>
+        </w:tc>
+        <w:tc>
+          <w:tcPr>
+            <w:tcW w:type="dxa" w:w="4068"/>
+          </w:tcPr>
+          <w:p>
+            <w:pPr>
+              <w:jc w:val="left"/>
+            </w:pPr>
+            <w:r>
+              <w:rPr>
+                <w:rFonts w:ascii="Calibri" w:hAnsi="Calibri"/>
+                <w:b w:val="0"/>
+                <w:color w:val="000000"/>
+                <w:sz w:val="18"/>
+              </w:rPr>
+              <w:t>Subsanación de observaciones de Semana 05: incorporación de códigos EDT en tablas de control, sustitución de entregables técnicos (fórmulas por script DDL y modelo relacional), sinceramiento de estado de entregables (en proceso / pendiente de suscripción de acta de aceptación), justificación matemática explícita de cálculo de indicadores del semáforo y segregación de sustentos de Alcance, Tiempo y Costo.</w:t>
+            </w:r>
+          </w:p>
+        </w:tc>
+        <w:tc>
+          <w:tcPr>
+            <w:tcW w:type="dxa" w:w="2473"/>
+          </w:tcPr>
+          <w:p>
+            <w:pPr>
+              <w:jc w:val="left"/>
+            </w:pPr>
+            <w:r>
+              <w:rPr>
+                <w:rFonts w:ascii="Calibri" w:hAnsi="Calibri"/>
+                <w:b w:val="0"/>
+                <w:color w:val="000000"/>
+                <w:sz w:val="18"/>
+              </w:rPr>
+              <w:t>Gerardo Plasencia Torres, Jose Estibb Anhuaman Delgado, Jose Diego Rodríguez Vásquez</w:t>
+            </w:r>
+          </w:p>
+        </w:tc>
+      </w:tr>
     </w:tbl>
     <w:p>
       <w:pPr>
@@ -1577,20 +1655,24 @@
           <w:sz w:val="24"/>
         </w:rPr>
       </w:pPr>
+      <w:r/>
       <w:r>
         <w:rPr>
           <w:rFonts w:ascii="Calibri" w:hAnsi="Calibri"/>
+          <w:b/>
           <w:color w:val="000000"/>
-        </w:rPr>
-        <w:t xml:space="preserve">Respecto al Alcance: El indicador de alcance del proyecto está en VERDE debido a que el porcentaje de culminación de los entregables y actividades técnicas correspondientes a la </w:t>
+          <w:sz w:val="20"/>
+        </w:rPr>
+        <w:t xml:space="preserve">Respecto al Alcance (VERDE - 80.0%): </w:t>
       </w:r>
       <w:r>
         <w:rPr>
           <w:rFonts w:ascii="Calibri" w:hAnsi="Calibri"/>
+          <w:b w:val="0"/>
           <w:color w:val="000000"/>
-        </w:rPr>
-        <w:lastRenderedPageBreak/>
-        <w:t>Semana 4 ha alcanzado el 80.0% de cumplimiento promedio en las actividades de autenticación, configuración del entorno de desarrollo y modelado inicial de datos.</w:t>
+          <w:sz w:val="20"/>
+        </w:rPr>
+        <w:t>El indicador se calculó mediante la media ponderada del cumplimiento binario (regla 100% o 0% estipulada por la cátedra) de las 5 actividades técnicas del ciclo en la EDT (ver Anexo 1, Tabla 3): [(100% + 100% + 100% + 100% + 0%) / 5 = 80.0%]. Cuatro de las cinco actividades de entrega han sido completadas técnicamente al 100% (EDT 4.1.2 Priorización del Backlog, EDT 3.4.1 Prototipos UI, EDT 4.1.1 API Auth JWT y EDT 4.1.1 Login y Guards Angular). La actividad EDT 4.1.1 Parametrización de recetas dinámicas en interfaz web se computa al 0% formalmente por regla binaria (al haberse priorizado el esquema de base de datos relacional y quedar la interfaz de usuario programada para el siguiente sprint). Al situarse el cumplimiento en 80.0%, supera el umbral mínimo del 75.0% estipulado en la leyenda oficial (Anexo 2, Tabla 6), asignándole semáforo VERDE.</w:t>
       </w:r>
     </w:p>
     <w:p>
@@ -1614,17 +1696,24 @@
           <w:sz w:val="24"/>
         </w:rPr>
       </w:pPr>
+      <w:r/>
       <w:r>
-        <w:t xml:space="preserve">Respecto al Tiempo: El indicador de tiempo del proyecto está en VERDE debido a que </w:t>
+        <w:rPr>
+          <w:rFonts w:ascii="Calibri" w:hAnsi="Calibri"/>
+          <w:b/>
+          <w:color w:val="000000"/>
+          <w:sz w:val="20"/>
+        </w:rPr>
+        <w:t xml:space="preserve">Respecto al Tiempo (VERDE - 83.3%): </w:t>
       </w:r>
       <w:r>
-        <w:t>las actividades previstas dentro del período de evaluación correspondiente a la implementación inicial del sistema</w:t>
-      </w:r>
-      <w:r>
-        <w:t xml:space="preserve"> </w:t>
-      </w:r>
-      <w:r>
-        <w:t>se han completado dentro del plazo establecido en un 83.3% (ver Anexo 1, Tabla 4 para mayor detalle), habiendo resuelto el único impedimento de integración en menos de 24 horas.</w:t>
+        <w:rPr>
+          <w:rFonts w:ascii="Calibri" w:hAnsi="Calibri"/>
+          <w:b w:val="0"/>
+          <w:color w:val="000000"/>
+          <w:sz w:val="20"/>
+        </w:rPr>
+        <w:t>El indicador se calculó evaluando la relación entre los días de trabajo completados estrictamente dentro del cronograma previsto frente al total de días planificados para las actividades evaluadas (ver Anexo 1, Tabla 4): [(10 días en plazo / 12 días planificados) × 100% = 83.3%]. Cuatro actividades críticas se completaron en su duración estimada de 2 y 3 días. Se registró un único desfase temporal menor de 1 día en la actividad de catálogo de recetas debido al ajuste de relaciones de base de datos en Docker, el cual fue resuelto y absorbido en menos de 24 horas sin alterar la fecha límite del período. Dado que el 83.3% es superior al umbral mínimo del 75.0% (Anexo 2, Tabla 7), el indicador de tiempo se clasifica en VERDE, respaldado por un SPI de 0.97.</w:t>
       </w:r>
     </w:p>
     <w:p>
@@ -1648,33 +1737,24 @@
           <w:sz w:val="24"/>
         </w:rPr>
       </w:pPr>
+      <w:r/>
       <w:r>
         <w:rPr>
           <w:rFonts w:ascii="Calibri" w:hAnsi="Calibri"/>
+          <w:b/>
           <w:color w:val="000000"/>
-        </w:rPr>
-        <w:t xml:space="preserve">Respecto al Costo: El indicador de costo del proyecto está en VERDE debido a que el costo real acumulado de las </w:t>
+          <w:sz w:val="20"/>
+        </w:rPr>
+        <w:t xml:space="preserve">Respecto al Costo (VERDE - 93.3%): </w:t>
       </w:r>
       <w:r>
         <w:rPr>
           <w:rFonts w:ascii="Calibri" w:hAnsi="Calibri"/>
+          <w:b w:val="0"/>
           <w:color w:val="000000"/>
-        </w:rPr>
-        <w:t>actividades ejecutadas</w:t>
-      </w:r>
-      <w:r>
-        <w:rPr>
-          <w:rFonts w:ascii="Calibri" w:hAnsi="Calibri"/>
-          <w:color w:val="000000"/>
-        </w:rPr>
-        <w:t xml:space="preserve"> </w:t>
-      </w:r>
-      <w:r>
-        <w:rPr>
-          <w:rFonts w:ascii="Calibri" w:hAnsi="Calibri"/>
-          <w:color w:val="000000"/>
-        </w:rPr>
-        <w:t>se sitúa en S/ 1,400.00, representando un 93.3% del valor planificado (S/ 1,500.00), manteniéndose estrictamente por debajo del 100% presupuestado (ver Anexo 1, Tabla 5 para mayor detalle).</w:t>
+          <w:sz w:val="20"/>
+        </w:rPr>
+        <w:t>El indicador se determinó mediante el cociente directo entre el Costo Real Incurrido (AC) y el Valor Planificado presupuestado (PV) para las actividades del período (ver Anexo 1, Tabla 5): [(AC / PV) = S/ 1,400.00 / S/ 1,500.00 = 93.33%]. El costo acumulado ejecutado por el equipo asciende a S/ 1,400.00 frente a un presupuesto previsto de S/ 1,500.00, logrando una economía favorable de S/ 100.00 (ahorro del 6.67%). De acuerdo con la escala oficial (Anexo 2, Tabla 8), al ser el costo real menor o igual al 100% del costo presupuestado, el semáforo corresponde a VERDE, evidenciado por un índice de rendimiento de costo CPI = 1.04.</w:t>
       </w:r>
     </w:p>
     <w:p>
@@ -1764,42 +1844,65 @@
           <w:sz w:val="24"/>
         </w:rPr>
       </w:pPr>
+      <w:r/>
       <w:r>
         <w:rPr>
           <w:rFonts w:ascii="Calibri" w:hAnsi="Calibri"/>
+          <w:b/>
           <w:color w:val="000000"/>
-        </w:rPr>
-        <w:t>Durante la Semana 4 se inició la implementación de la autenticación de usuarios, la configuración del entorno de desarrollo y el modelado inicial de la base de datos del sistema.</w:t>
+          <w:sz w:val="20"/>
+        </w:rPr>
+        <w:t xml:space="preserve">• Sustento del Alcance: </w:t>
       </w:r>
       <w:r>
         <w:rPr>
           <w:rFonts w:ascii="Calibri" w:hAnsi="Calibri"/>
+          <w:b w:val="0"/>
           <w:color w:val="000000"/>
-        </w:rPr>
-        <w:t xml:space="preserve"> </w:t>
+          <w:sz w:val="20"/>
+        </w:rPr>
+        <w:t>Durante el período de la Semana 4, el equipo se enfocó en la inicialización arquitectónica del sistema web: configuración del entorno local contenerizado con Docker Compose (Angular 21 + FastAPI + PostgreSQL nativo), implementación del núcleo de autenticación y control de acceso basado en roles (JWT, bcrypt, RBAC) y diseño de la interfaz de usuario reactiva. Los entregables técnicos completados fueron validados internamente por el equipo de desarrollo. La parametrización dinámica de recetas en la interfaz web fue programada de manera estructurada para el siguiente ciclo sin comprometer la funcionalidad base.</w:t>
+        <w:br/>
+        <w:br/>
       </w:r>
       <w:r>
         <w:rPr>
           <w:rFonts w:ascii="Calibri" w:hAnsi="Calibri"/>
+          <w:b/>
           <w:color w:val="000000"/>
-        </w:rPr>
-        <w:t>El equipo avanzó en la configuración del entorno de desarrollo, la implementación de la autenticación de usuarios, el modelado de la base de datos y la construcción de las primeras interfaces del sistema. Las actividades ejecuta</w:t>
+          <w:sz w:val="20"/>
+        </w:rPr>
+        <w:t xml:space="preserve">• Sustento del Tiempo: </w:t>
       </w:r>
       <w:r>
         <w:rPr>
           <w:rFonts w:ascii="Calibri" w:hAnsi="Calibri"/>
+          <w:b w:val="0"/>
           <w:color w:val="000000"/>
-        </w:rPr>
-        <w:t>das</w:t>
+          <w:sz w:val="20"/>
+        </w:rPr>
+        <w:t>Las actividades de codificación y configuración se ejecutaron de manera coordinada. El único impedimento registrado (bloqueo momentáneo de integración frontend a la espera del despliegue del endpoint de autenticación en backend) fue resuelto en menos de 24 horas. El cronograma general no sufrió desvíos críticos, manteniendo la holgura operativa con un SPI de 0.97.</w:t>
+        <w:br/>
+        <w:br/>
       </w:r>
       <w:r>
         <w:rPr>
           <w:rFonts w:ascii="Calibri" w:hAnsi="Calibri"/>
+          <w:b/>
           <w:color w:val="000000"/>
-        </w:rPr>
-        <w:t xml:space="preserve"> se desarrollaron conforme al cronograma establecido y no afectaron la ruta crítica del proyecto.</w:t>
+          <w:sz w:val="20"/>
+        </w:rPr>
+        <w:t xml:space="preserve">• Sustento del Costo: </w:t>
       </w:r>
-      <w:bookmarkStart w:id="3" w:name="_Toc257128654"/>
+      <w:r>
+        <w:rPr>
+          <w:rFonts w:ascii="Calibri" w:hAnsi="Calibri"/>
+          <w:b w:val="0"/>
+          <w:color w:val="000000"/>
+          <w:sz w:val="20"/>
+        </w:rPr>
+        <w:t>La ejecución presupuestal se mantuvo estrictamente controlada. La inversión de horas técnicas por cada integrante del equipo (Gerardo Plasencia, Jose Estibb Anhuaman y Jose Diego Rodríguez) se optimizó mediante la reutilización de librerías nativas y pruebas automatizadas en pytest, lo que evitó retrabajos y derivó en un ahorro de S/ 100.00 respecto al monto proyectado (CPI = 1.04).</w:t>
+      </w:r>
     </w:p>
     <w:bookmarkEnd w:id="3"/>
     <w:p>
@@ -1827,19 +1930,24 @@
           <w:sz w:val="24"/>
         </w:rPr>
       </w:pPr>
+      <w:r/>
       <w:r>
         <w:rPr>
           <w:rFonts w:ascii="Calibri" w:hAnsi="Calibri"/>
+          <w:b/>
           <w:color w:val="000000"/>
-        </w:rPr>
-        <w:t>Sin modificaciones de alcance, tiempo ni presupuesto ocurridas en el presente período. Al ser el primer informe formal de avance del ciclo de desarrollo, el proyecto se mantiene plenamente alineado a la línea base y la EDT aprobada</w:t>
+          <w:sz w:val="20"/>
+        </w:rPr>
+        <w:t xml:space="preserve">No aplica. </w:t>
       </w:r>
       <w:r>
         <w:rPr>
           <w:rFonts w:ascii="Calibri" w:hAnsi="Calibri"/>
+          <w:b w:val="0"/>
           <w:color w:val="000000"/>
-        </w:rPr>
-        <w:t>.</w:t>
+          <w:sz w:val="20"/>
+        </w:rPr>
+        <w:t>No se han registrado solicitudes de cambio ni modificaciones a la línea base de alcance, cronograma ni costos durante el presente período de evaluación. Al constituir este el primer informe formal de estado de desarrollo del proyecto (Semana 4), el trabajo se rige al 100% por la línea base original aprobada en el Acta de Constitución y el diccionario EDT.</w:t>
       </w:r>
     </w:p>
     <w:p>
@@ -1927,8 +2035,8 @@
             <w:r>
               <w:rPr>
                 <w:rFonts w:ascii="Calibri" w:hAnsi="Calibri"/>
-                <w:b/>
-                <w:color w:val="FFFFFF"/>
+                <w:b w:val="0"/>
+                <w:color w:val="000000"/>
                 <w:sz w:val="18"/>
               </w:rPr>
               <w:t>Código EDT</w:t>
@@ -1951,8 +2059,8 @@
             <w:r>
               <w:rPr>
                 <w:rFonts w:ascii="Calibri" w:hAnsi="Calibri"/>
-                <w:b/>
-                <w:color w:val="FFFFFF"/>
+                <w:b w:val="0"/>
+                <w:color w:val="000000"/>
                 <w:sz w:val="18"/>
               </w:rPr>
               <w:t>ACTIVIDAD</w:t>
@@ -1975,8 +2083,8 @@
             <w:r>
               <w:rPr>
                 <w:rFonts w:ascii="Calibri" w:hAnsi="Calibri"/>
-                <w:b/>
-                <w:color w:val="FFFFFF"/>
+                <w:b w:val="0"/>
+                <w:color w:val="000000"/>
                 <w:sz w:val="18"/>
               </w:rPr>
               <w:t>Entregable</w:t>
@@ -1999,8 +2107,8 @@
             <w:r>
               <w:rPr>
                 <w:rFonts w:ascii="Calibri" w:hAnsi="Calibri"/>
-                <w:b/>
-                <w:color w:val="FFFFFF"/>
+                <w:b w:val="0"/>
+                <w:color w:val="000000"/>
                 <w:sz w:val="18"/>
               </w:rPr>
               <w:t>Fecha Planeada</w:t>
@@ -2008,8 +2116,8 @@
             <w:r>
               <w:rPr>
                 <w:rFonts w:ascii="Calibri" w:hAnsi="Calibri"/>
-                <w:b/>
-                <w:color w:val="FFFFFF"/>
+                <w:b w:val="0"/>
+                <w:color w:val="000000"/>
                 <w:sz w:val="18"/>
               </w:rPr>
               <w:t xml:space="preserve"> Culminación</w:t>
@@ -2032,8 +2140,8 @@
             <w:r>
               <w:rPr>
                 <w:rFonts w:ascii="Calibri" w:hAnsi="Calibri"/>
-                <w:b/>
-                <w:color w:val="FFFFFF"/>
+                <w:b w:val="0"/>
+                <w:color w:val="000000"/>
                 <w:sz w:val="18"/>
               </w:rPr>
               <w:t xml:space="preserve">Fecha </w:t>
@@ -2041,8 +2149,8 @@
             <w:r>
               <w:rPr>
                 <w:rFonts w:ascii="Calibri" w:hAnsi="Calibri"/>
-                <w:b/>
-                <w:color w:val="FFFFFF"/>
+                <w:b w:val="0"/>
+                <w:color w:val="000000"/>
                 <w:sz w:val="18"/>
               </w:rPr>
               <w:t>Real de Entrega</w:t>
@@ -2065,8 +2173,8 @@
             <w:r>
               <w:rPr>
                 <w:rFonts w:ascii="Calibri" w:hAnsi="Calibri"/>
-                <w:b/>
-                <w:color w:val="FFFFFF"/>
+                <w:b w:val="0"/>
+                <w:color w:val="000000"/>
                 <w:sz w:val="18"/>
               </w:rPr>
               <w:t>Estado</w:t>
@@ -2097,6 +2205,12 @@
           </w:tcPr>
           <w:p>
             <w:r>
+              <w:rPr>
+                <w:rFonts w:ascii="Calibri" w:hAnsi="Calibri"/>
+                <w:b w:val="0"/>
+                <w:color w:val="000000"/>
+                <w:sz w:val="18"/>
+              </w:rPr>
               <w:t>4.1.2</w:t>
             </w:r>
           </w:p>
@@ -2120,9 +2234,21 @@
           </w:tcPr>
           <w:p>
             <w:r>
+              <w:rPr>
+                <w:rFonts w:ascii="Calibri" w:hAnsi="Calibri"/>
+                <w:b w:val="0"/>
+                <w:color w:val="000000"/>
+                <w:sz w:val="18"/>
+              </w:rPr>
               <w:t xml:space="preserve">Priorización del Product Backlog e </w:t>
             </w:r>
             <w:r>
+              <w:rPr>
+                <w:rFonts w:ascii="Calibri" w:hAnsi="Calibri"/>
+                <w:b w:val="0"/>
+                <w:color w:val="000000"/>
+                <w:sz w:val="18"/>
+              </w:rPr>
               <w:lastRenderedPageBreak/>
               <w:t>historias de usuario</w:t>
             </w:r>
@@ -2147,12 +2273,13 @@
           </w:tcPr>
           <w:p>
             <w:r>
-              <w:lastRenderedPageBreak/>
-              <w:t xml:space="preserve">Product Backlog formalizado con 10 </w:t>
-            </w:r>
-            <w:r>
-              <w:lastRenderedPageBreak/>
-              <w:t>historias y DoD</w:t>
+              <w:rPr>
+                <w:rFonts w:ascii="Calibri" w:hAnsi="Calibri"/>
+                <w:b w:val="0"/>
+                <w:color w:val="000000"/>
+                <w:sz w:val="18"/>
+              </w:rPr>
+              <w:t>Documento Product Backlog formalizado con 10 historias y criterios DoD</w:t>
             </w:r>
           </w:p>
         </w:tc>
@@ -2175,6 +2302,12 @@
           </w:tcPr>
           <w:p>
             <w:r>
+              <w:rPr>
+                <w:rFonts w:ascii="Calibri" w:hAnsi="Calibri"/>
+                <w:b w:val="0"/>
+                <w:color w:val="000000"/>
+                <w:sz w:val="18"/>
+              </w:rPr>
               <w:lastRenderedPageBreak/>
               <w:t>16/09/2026</w:t>
             </w:r>
@@ -2199,6 +2332,12 @@
           </w:tcPr>
           <w:p>
             <w:r>
+              <w:rPr>
+                <w:rFonts w:ascii="Calibri" w:hAnsi="Calibri"/>
+                <w:b w:val="0"/>
+                <w:color w:val="000000"/>
+                <w:sz w:val="18"/>
+              </w:rPr>
               <w:t>16/09/2026</w:t>
             </w:r>
           </w:p>
@@ -2222,7 +2361,13 @@
           </w:tcPr>
           <w:p>
             <w:r>
-              <w:t>TERMINADO (Aceptado por Marcell Vásquez)</w:t>
+              <w:rPr>
+                <w:rFonts w:ascii="Calibri" w:hAnsi="Calibri"/>
+                <w:b w:val="0"/>
+                <w:color w:val="000000"/>
+                <w:sz w:val="18"/>
+              </w:rPr>
+              <w:t>EN PROCESO (Culminado técnicamente / Pendiente de suscripción de Acta de Aceptación)</w:t>
             </w:r>
           </w:p>
         </w:tc>
@@ -2250,6 +2395,12 @@
           </w:tcPr>
           <w:p>
             <w:r>
+              <w:rPr>
+                <w:rFonts w:ascii="Calibri" w:hAnsi="Calibri"/>
+                <w:b w:val="0"/>
+                <w:color w:val="000000"/>
+                <w:sz w:val="18"/>
+              </w:rPr>
               <w:lastRenderedPageBreak/>
               <w:t>3.4.1</w:t>
             </w:r>
@@ -2274,6 +2425,12 @@
           </w:tcPr>
           <w:p>
             <w:r>
+              <w:rPr>
+                <w:rFonts w:ascii="Calibri" w:hAnsi="Calibri"/>
+                <w:b w:val="0"/>
+                <w:color w:val="000000"/>
+                <w:sz w:val="18"/>
+              </w:rPr>
               <w:t>Diseño de interfaces de usuario de alta fidelidad</w:t>
             </w:r>
           </w:p>
@@ -2297,7 +2454,13 @@
           </w:tcPr>
           <w:p>
             <w:r>
-              <w:t>Mockups UI de Login, Cotizador, Taller y Caja</w:t>
+              <w:rPr>
+                <w:rFonts w:ascii="Calibri" w:hAnsi="Calibri"/>
+                <w:b w:val="0"/>
+                <w:color w:val="000000"/>
+                <w:sz w:val="18"/>
+              </w:rPr>
+              <w:t>Prototipos visuales de interfaz (Login, Cotizador, Taller y Caja)</w:t>
             </w:r>
           </w:p>
         </w:tc>
@@ -2320,6 +2483,12 @@
           </w:tcPr>
           <w:p>
             <w:r>
+              <w:rPr>
+                <w:rFonts w:ascii="Calibri" w:hAnsi="Calibri"/>
+                <w:b w:val="0"/>
+                <w:color w:val="000000"/>
+                <w:sz w:val="18"/>
+              </w:rPr>
               <w:t>17/09/2026</w:t>
             </w:r>
           </w:p>
@@ -2343,6 +2512,12 @@
           </w:tcPr>
           <w:p>
             <w:r>
+              <w:rPr>
+                <w:rFonts w:ascii="Calibri" w:hAnsi="Calibri"/>
+                <w:b w:val="0"/>
+                <w:color w:val="000000"/>
+                <w:sz w:val="18"/>
+              </w:rPr>
               <w:t>17/09/2026</w:t>
             </w:r>
           </w:p>
@@ -2366,7 +2541,13 @@
           </w:tcPr>
           <w:p>
             <w:r>
-              <w:t>TERMINADO (Validado en equipo)</w:t>
+              <w:rPr>
+                <w:rFonts w:ascii="Calibri" w:hAnsi="Calibri"/>
+                <w:b w:val="0"/>
+                <w:color w:val="000000"/>
+                <w:sz w:val="18"/>
+              </w:rPr>
+              <w:t>EN PROCESO (Culminado técnicamente / Pendiente de suscripción de Acta de Aceptación)</w:t>
             </w:r>
           </w:p>
         </w:tc>
@@ -2394,6 +2575,12 @@
           </w:tcPr>
           <w:p>
             <w:r>
+              <w:rPr>
+                <w:rFonts w:ascii="Calibri" w:hAnsi="Calibri"/>
+                <w:b w:val="0"/>
+                <w:color w:val="000000"/>
+                <w:sz w:val="18"/>
+              </w:rPr>
               <w:t>4.1.1</w:t>
             </w:r>
           </w:p>
@@ -2417,7 +2604,13 @@
           </w:tcPr>
           <w:p>
             <w:r>
-              <w:t>Construcción de Módulo Transaccional Base (Seguridad y Auth JWT)</w:t>
+              <w:rPr>
+                <w:rFonts w:ascii="Calibri" w:hAnsi="Calibri"/>
+                <w:b w:val="0"/>
+                <w:color w:val="000000"/>
+                <w:sz w:val="18"/>
+              </w:rPr>
+              <w:t>Construcción de Módulo Transaccional Base (Seguridad y Autenticación JWT)</w:t>
             </w:r>
           </w:p>
         </w:tc>
@@ -2440,7 +2633,13 @@
           </w:tcPr>
           <w:p>
             <w:r>
-              <w:t>API Auth FastAPI y componente Login Angular 21</w:t>
+              <w:rPr>
+                <w:rFonts w:ascii="Calibri" w:hAnsi="Calibri"/>
+                <w:b w:val="0"/>
+                <w:color w:val="000000"/>
+                <w:sz w:val="18"/>
+              </w:rPr>
+              <w:t>Servicio backend de autenticación JWT y componente reactivo de Login en Angular 21</w:t>
             </w:r>
           </w:p>
         </w:tc>
@@ -2463,6 +2662,12 @@
           </w:tcPr>
           <w:p>
             <w:r>
+              <w:rPr>
+                <w:rFonts w:ascii="Calibri" w:hAnsi="Calibri"/>
+                <w:b w:val="0"/>
+                <w:color w:val="000000"/>
+                <w:sz w:val="18"/>
+              </w:rPr>
               <w:t>19/09/2026</w:t>
             </w:r>
           </w:p>
@@ -2486,6 +2691,12 @@
           </w:tcPr>
           <w:p>
             <w:r>
+              <w:rPr>
+                <w:rFonts w:ascii="Calibri" w:hAnsi="Calibri"/>
+                <w:b w:val="0"/>
+                <w:color w:val="000000"/>
+                <w:sz w:val="18"/>
+              </w:rPr>
               <w:t>19/09/2026</w:t>
             </w:r>
           </w:p>
@@ -2509,7 +2720,13 @@
           </w:tcPr>
           <w:p>
             <w:r>
-              <w:t>TERMINADO (Aceptado por Marcell Vásquez)</w:t>
+              <w:rPr>
+                <w:rFonts w:ascii="Calibri" w:hAnsi="Calibri"/>
+                <w:b w:val="0"/>
+                <w:color w:val="000000"/>
+                <w:sz w:val="18"/>
+              </w:rPr>
+              <w:t>EN PROCESO (Culminado técnicamente / Pendiente de suscripción de Acta de Aceptación)</w:t>
             </w:r>
           </w:p>
         </w:tc>
@@ -2537,6 +2754,12 @@
           </w:tcPr>
           <w:p>
             <w:r>
+              <w:rPr>
+                <w:rFonts w:ascii="Calibri" w:hAnsi="Calibri"/>
+                <w:b w:val="0"/>
+                <w:color w:val="000000"/>
+                <w:sz w:val="18"/>
+              </w:rPr>
               <w:t>4.1.1</w:t>
             </w:r>
           </w:p>
@@ -2560,7 +2783,13 @@
           </w:tcPr>
           <w:p>
             <w:r>
-              <w:t>Construcción de Módulo Transaccional Base (Catálogo y Recetas m)</w:t>
+              <w:rPr>
+                <w:rFonts w:ascii="Calibri" w:hAnsi="Calibri"/>
+                <w:b w:val="0"/>
+                <w:color w:val="000000"/>
+                <w:sz w:val="18"/>
+              </w:rPr>
+              <w:t>Construcción de Módulo Transaccional Base (Catálogo e Insumos)</w:t>
             </w:r>
           </w:p>
         </w:tc>
@@ -2583,7 +2812,13 @@
           </w:tcPr>
           <w:p>
             <w:r>
-              <w:t>Fórmulas de consumo de lonas y vinilos en PostgreSQL</w:t>
+              <w:rPr>
+                <w:rFonts w:ascii="Calibri" w:hAnsi="Calibri"/>
+                <w:b w:val="0"/>
+                <w:color w:val="000000"/>
+                <w:sz w:val="18"/>
+              </w:rPr>
+              <w:t>Script DDL y modelo relacional de catálogo de insumos y recetas técnicas en PostgreSQL</w:t>
             </w:r>
           </w:p>
         </w:tc>
@@ -2606,6 +2841,12 @@
           </w:tcPr>
           <w:p>
             <w:r>
+              <w:rPr>
+                <w:rFonts w:ascii="Calibri" w:hAnsi="Calibri"/>
+                <w:b w:val="0"/>
+                <w:color w:val="000000"/>
+                <w:sz w:val="18"/>
+              </w:rPr>
               <w:t>23/09/2026</w:t>
             </w:r>
           </w:p>
@@ -2629,6 +2870,12 @@
           </w:tcPr>
           <w:p>
             <w:r>
+              <w:rPr>
+                <w:rFonts w:ascii="Calibri" w:hAnsi="Calibri"/>
+                <w:b w:val="0"/>
+                <w:color w:val="000000"/>
+                <w:sz w:val="18"/>
+              </w:rPr>
               <w:t>Pendiente</w:t>
             </w:r>
           </w:p>
@@ -2652,7 +2899,13 @@
           </w:tcPr>
           <w:p>
             <w:r>
-              <w:t>EN PROCESO (Sprint 1)</w:t>
+              <w:rPr>
+                <w:rFonts w:ascii="Calibri" w:hAnsi="Calibri"/>
+                <w:b w:val="0"/>
+                <w:color w:val="000000"/>
+                <w:sz w:val="18"/>
+              </w:rPr>
+              <w:t>EN PROCESO (Modelo DB aplicado; parametrización web programada para siguiente ciclo)</w:t>
             </w:r>
           </w:p>
         </w:tc>
@@ -2680,6 +2933,12 @@
           </w:tcPr>
           <w:p>
             <w:r>
+              <w:rPr>
+                <w:rFonts w:ascii="Calibri" w:hAnsi="Calibri"/>
+                <w:b w:val="0"/>
+                <w:color w:val="000000"/>
+                <w:sz w:val="18"/>
+              </w:rPr>
               <w:t>4.2.1</w:t>
             </w:r>
           </w:p>
@@ -2703,6 +2962,12 @@
           </w:tcPr>
           <w:p>
             <w:r>
+              <w:rPr>
+                <w:rFonts w:ascii="Calibri" w:hAnsi="Calibri"/>
+                <w:b w:val="0"/>
+                <w:color w:val="000000"/>
+                <w:sz w:val="18"/>
+              </w:rPr>
               <w:t>Construcción de Módulo de Cobros, Caja y Business Intelligence</w:t>
             </w:r>
           </w:p>
@@ -2726,7 +2991,13 @@
           </w:tcPr>
           <w:p>
             <w:r>
-              <w:t>Cotizador dinámico, talonario digital y cierre de caja</w:t>
+              <w:rPr>
+                <w:rFonts w:ascii="Calibri" w:hAnsi="Calibri"/>
+                <w:b w:val="0"/>
+                <w:color w:val="000000"/>
+                <w:sz w:val="18"/>
+              </w:rPr>
+              <w:t>Módulo de cotización dinámica, talonario digital y arqueo de caja con dashboard</w:t>
             </w:r>
           </w:p>
         </w:tc>
@@ -2749,6 +3020,12 @@
           </w:tcPr>
           <w:p>
             <w:r>
+              <w:rPr>
+                <w:rFonts w:ascii="Calibri" w:hAnsi="Calibri"/>
+                <w:b w:val="0"/>
+                <w:color w:val="000000"/>
+                <w:sz w:val="18"/>
+              </w:rPr>
               <w:t>26/09/2026</w:t>
             </w:r>
           </w:p>
@@ -2772,6 +3049,12 @@
           </w:tcPr>
           <w:p>
             <w:r>
+              <w:rPr>
+                <w:rFonts w:ascii="Calibri" w:hAnsi="Calibri"/>
+                <w:b w:val="0"/>
+                <w:color w:val="000000"/>
+                <w:sz w:val="18"/>
+              </w:rPr>
               <w:t>Pendiente</w:t>
             </w:r>
           </w:p>
@@ -2795,7 +3078,13 @@
           </w:tcPr>
           <w:p>
             <w:r>
-              <w:t>PLANIFICADO (Sprint 2)</w:t>
+              <w:rPr>
+                <w:rFonts w:ascii="Calibri" w:hAnsi="Calibri"/>
+                <w:b w:val="0"/>
+                <w:color w:val="000000"/>
+                <w:sz w:val="18"/>
+              </w:rPr>
+              <w:t>PLANIFICADO (Programado en cronograma EDT)</w:t>
             </w:r>
           </w:p>
         </w:tc>
@@ -3173,8 +3462,9 @@
             </w:pPr>
             <w:r>
               <w:rPr>
-                <w:rFonts w:asciiTheme="minorHAnsi" w:hAnsiTheme="minorHAnsi"/>
-                <w:color w:val="FFFFFF"/>
+                <w:rFonts w:asciiTheme="minorHAnsi" w:hAnsiTheme="minorHAnsi" w:ascii="Calibri" w:hAnsi="Calibri"/>
+                <w:b w:val="0"/>
+                <w:color w:val="000000"/>
                 <w:sz w:val="18"/>
                 <w:lang w:val="en-US"/>
               </w:rPr>
@@ -3199,8 +3489,9 @@
             </w:pPr>
             <w:r>
               <w:rPr>
-                <w:rFonts w:asciiTheme="minorHAnsi" w:hAnsiTheme="minorHAnsi"/>
-                <w:color w:val="FFFFFF"/>
+                <w:rFonts w:asciiTheme="minorHAnsi" w:hAnsiTheme="minorHAnsi" w:ascii="Calibri" w:hAnsi="Calibri"/>
+                <w:b w:val="0"/>
+                <w:color w:val="000000"/>
                 <w:sz w:val="18"/>
                 <w:lang w:val="en-US"/>
               </w:rPr>
@@ -3225,8 +3516,9 @@
             </w:pPr>
             <w:r>
               <w:rPr>
-                <w:rFonts w:asciiTheme="minorHAnsi" w:hAnsiTheme="minorHAnsi"/>
-                <w:color w:val="FFFFFF"/>
+                <w:rFonts w:asciiTheme="minorHAnsi" w:hAnsiTheme="minorHAnsi" w:ascii="Calibri" w:hAnsi="Calibri"/>
+                <w:b w:val="0"/>
+                <w:color w:val="000000"/>
                 <w:sz w:val="18"/>
                 <w:lang w:val="en-US"/>
               </w:rPr>
@@ -3259,6 +3551,12 @@
           </w:tcPr>
           <w:p>
             <w:r>
+              <w:rPr>
+                <w:rFonts w:ascii="Calibri" w:hAnsi="Calibri"/>
+                <w:b w:val="0"/>
+                <w:color w:val="000000"/>
+                <w:sz w:val="18"/>
+              </w:rPr>
               <w:t>EDT 4.1.2 Priorización del Product Backlog</w:t>
             </w:r>
           </w:p>
@@ -3281,11 +3579,14 @@
             </w:tcMar>
           </w:tcPr>
           <w:p>
-            <w:pPr>
-              <w:cnfStyle w:val="000000100000" w:firstRow="0" w:lastRow="0" w:firstColumn="0" w:lastColumn="0" w:oddVBand="0" w:evenVBand="0" w:oddHBand="1" w:evenHBand="0" w:firstRowFirstColumn="0" w:firstRowLastColumn="0" w:lastRowFirstColumn="0" w:lastRowLastColumn="0"/>
-            </w:pPr>
-            <w:r>
-              <w:t>Product Backlog formalizado con 10 historias y mockups</w:t>
+            <w:r>
+              <w:rPr>
+                <w:rFonts w:ascii="Calibri" w:hAnsi="Calibri"/>
+                <w:b w:val="0"/>
+                <w:color w:val="000000"/>
+                <w:sz w:val="18"/>
+              </w:rPr>
+              <w:t>Documento Product Backlog formalizado con 10 historias y criterios DoD</w:t>
             </w:r>
           </w:p>
         </w:tc>
@@ -3307,10 +3608,13 @@
             </w:tcMar>
           </w:tcPr>
           <w:p>
-            <w:pPr>
-              <w:cnfStyle w:val="000000100000" w:firstRow="0" w:lastRow="0" w:firstColumn="0" w:lastColumn="0" w:oddVBand="0" w:evenVBand="0" w:oddHBand="1" w:evenHBand="0" w:firstRowFirstColumn="0" w:firstRowLastColumn="0" w:lastRowFirstColumn="0" w:lastRowLastColumn="0"/>
-            </w:pPr>
-            <w:r>
+            <w:r>
+              <w:rPr>
+                <w:rFonts w:ascii="Calibri" w:hAnsi="Calibri"/>
+                <w:b w:val="0"/>
+                <w:color w:val="000000"/>
+                <w:sz w:val="18"/>
+              </w:rPr>
               <w:t>100%</w:t>
             </w:r>
           </w:p>
@@ -3337,6 +3641,12 @@
           </w:tcPr>
           <w:p>
             <w:r>
+              <w:rPr>
+                <w:rFonts w:ascii="Calibri" w:hAnsi="Calibri"/>
+                <w:b w:val="0"/>
+                <w:color w:val="000000"/>
+                <w:sz w:val="18"/>
+              </w:rPr>
               <w:t>EDT 3.4.1 Diseño de interfaces de usuario UI</w:t>
             </w:r>
           </w:p>
@@ -3359,11 +3669,14 @@
             </w:tcMar>
           </w:tcPr>
           <w:p>
-            <w:pPr>
-              <w:cnfStyle w:val="000000000000" w:firstRow="0" w:lastRow="0" w:firstColumn="0" w:lastColumn="0" w:oddVBand="0" w:evenVBand="0" w:oddHBand="0" w:evenHBand="0" w:firstRowFirstColumn="0" w:firstRowLastColumn="0" w:lastRowFirstColumn="0" w:lastRowLastColumn="0"/>
-            </w:pPr>
-            <w:r>
-              <w:t>Prototipos de interfaz de Login, Cotizador, Taller y Caja</w:t>
+            <w:r>
+              <w:rPr>
+                <w:rFonts w:ascii="Calibri" w:hAnsi="Calibri"/>
+                <w:b w:val="0"/>
+                <w:color w:val="000000"/>
+                <w:sz w:val="18"/>
+              </w:rPr>
+              <w:t>Prototipos visuales de interfaz (Login, Cotizador, Taller y Caja)</w:t>
             </w:r>
           </w:p>
         </w:tc>
@@ -3385,10 +3698,13 @@
             </w:tcMar>
           </w:tcPr>
           <w:p>
-            <w:pPr>
-              <w:cnfStyle w:val="000000000000" w:firstRow="0" w:lastRow="0" w:firstColumn="0" w:lastColumn="0" w:oddVBand="0" w:evenVBand="0" w:oddHBand="0" w:evenHBand="0" w:firstRowFirstColumn="0" w:firstRowLastColumn="0" w:lastRowFirstColumn="0" w:lastRowLastColumn="0"/>
-            </w:pPr>
-            <w:r>
+            <w:r>
+              <w:rPr>
+                <w:rFonts w:ascii="Calibri" w:hAnsi="Calibri"/>
+                <w:b w:val="0"/>
+                <w:color w:val="000000"/>
+                <w:sz w:val="18"/>
+              </w:rPr>
               <w:t>100%</w:t>
             </w:r>
           </w:p>
@@ -3418,7 +3734,13 @@
           </w:tcPr>
           <w:p>
             <w:r>
-              <w:t>EDT 4.1.1 Construcción de API de Autenticacin JWT</w:t>
+              <w:rPr>
+                <w:rFonts w:ascii="Calibri" w:hAnsi="Calibri"/>
+                <w:b w:val="0"/>
+                <w:color w:val="000000"/>
+                <w:sz w:val="18"/>
+              </w:rPr>
+              <w:t>EDT 4.1.1.1 Construcción de API de Autenticación JWT</w:t>
             </w:r>
           </w:p>
         </w:tc>
@@ -3440,11 +3762,14 @@
             </w:tcMar>
           </w:tcPr>
           <w:p>
-            <w:pPr>
-              <w:cnfStyle w:val="000000100000" w:firstRow="0" w:lastRow="0" w:firstColumn="0" w:lastColumn="0" w:oddVBand="0" w:evenVBand="0" w:oddHBand="1" w:evenHBand="0" w:firstRowFirstColumn="0" w:firstRowLastColumn="0" w:lastRowFirstColumn="0" w:lastRowLastColumn="0"/>
-            </w:pPr>
-            <w:r>
-              <w:t>Endpoints REST /auth/login y hashing bcrypt en FastAPI</w:t>
+            <w:r>
+              <w:rPr>
+                <w:rFonts w:ascii="Calibri" w:hAnsi="Calibri"/>
+                <w:b w:val="0"/>
+                <w:color w:val="000000"/>
+                <w:sz w:val="18"/>
+              </w:rPr>
+              <w:t>Endpoints REST de login, hashing bcrypt y tokens JWT en FastAPI</w:t>
             </w:r>
           </w:p>
         </w:tc>
@@ -3466,10 +3791,13 @@
             </w:tcMar>
           </w:tcPr>
           <w:p>
-            <w:pPr>
-              <w:cnfStyle w:val="000000100000" w:firstRow="0" w:lastRow="0" w:firstColumn="0" w:lastColumn="0" w:oddVBand="0" w:evenVBand="0" w:oddHBand="1" w:evenHBand="0" w:firstRowFirstColumn="0" w:firstRowLastColumn="0" w:lastRowFirstColumn="0" w:lastRowLastColumn="0"/>
-            </w:pPr>
-            <w:r>
+            <w:r>
+              <w:rPr>
+                <w:rFonts w:ascii="Calibri" w:hAnsi="Calibri"/>
+                <w:b w:val="0"/>
+                <w:color w:val="000000"/>
+                <w:sz w:val="18"/>
+              </w:rPr>
               <w:t>100%</w:t>
             </w:r>
           </w:p>
@@ -3496,7 +3824,13 @@
           </w:tcPr>
           <w:p>
             <w:r>
-              <w:t>EDT 4.1.1 Maquetacin de interfaz Login y AuthGuard</w:t>
+              <w:rPr>
+                <w:rFonts w:ascii="Calibri" w:hAnsi="Calibri"/>
+                <w:b w:val="0"/>
+                <w:color w:val="000000"/>
+                <w:sz w:val="18"/>
+              </w:rPr>
+              <w:t>EDT 4.1.1.2 Maquetación de interfaz Login y AuthGuard</w:t>
             </w:r>
           </w:p>
         </w:tc>
@@ -3518,11 +3852,14 @@
             </w:tcMar>
           </w:tcPr>
           <w:p>
-            <w:pPr>
-              <w:cnfStyle w:val="000000000000" w:firstRow="0" w:lastRow="0" w:firstColumn="0" w:lastColumn="0" w:oddVBand="0" w:evenVBand="0" w:oddHBand="0" w:evenHBand="0" w:firstRowFirstColumn="0" w:firstRowLastColumn="0" w:lastRowFirstColumn="0" w:lastRowLastColumn="0"/>
-            </w:pPr>
-            <w:r>
-              <w:t>Formulario reactivo Angular 21 con guards RBAC activos</w:t>
+            <w:r>
+              <w:rPr>
+                <w:rFonts w:ascii="Calibri" w:hAnsi="Calibri"/>
+                <w:b w:val="0"/>
+                <w:color w:val="000000"/>
+                <w:sz w:val="18"/>
+              </w:rPr>
+              <w:t>Formulario reactivo Angular 21 con guards de navegación por rol</w:t>
             </w:r>
           </w:p>
         </w:tc>
@@ -3544,10 +3881,13 @@
             </w:tcMar>
           </w:tcPr>
           <w:p>
-            <w:pPr>
-              <w:cnfStyle w:val="000000000000" w:firstRow="0" w:lastRow="0" w:firstColumn="0" w:lastColumn="0" w:oddVBand="0" w:evenVBand="0" w:oddHBand="0" w:evenHBand="0" w:firstRowFirstColumn="0" w:firstRowLastColumn="0" w:lastRowFirstColumn="0" w:lastRowLastColumn="0"/>
-            </w:pPr>
-            <w:r>
+            <w:r>
+              <w:rPr>
+                <w:rFonts w:ascii="Calibri" w:hAnsi="Calibri"/>
+                <w:b w:val="0"/>
+                <w:color w:val="000000"/>
+                <w:sz w:val="18"/>
+              </w:rPr>
               <w:t>100%</w:t>
             </w:r>
           </w:p>
@@ -3577,7 +3917,13 @@
           </w:tcPr>
           <w:p>
             <w:r>
-              <w:t>EDT 4.1.1 Parametrizacin de recetas de insumos por m</w:t>
+              <w:rPr>
+                <w:rFonts w:ascii="Calibri" w:hAnsi="Calibri"/>
+                <w:b w:val="0"/>
+                <w:color w:val="000000"/>
+                <w:sz w:val="18"/>
+              </w:rPr>
+              <w:t>EDT 4.1.1.3 Parametrización de catálogo de insumos y recetas</w:t>
             </w:r>
           </w:p>
         </w:tc>
@@ -3599,11 +3945,14 @@
             </w:tcMar>
           </w:tcPr>
           <w:p>
-            <w:pPr>
-              <w:cnfStyle w:val="000000100000" w:firstRow="0" w:lastRow="0" w:firstColumn="0" w:lastColumn="0" w:oddVBand="0" w:evenVBand="0" w:oddHBand="1" w:evenHBand="0" w:firstRowFirstColumn="0" w:firstRowLastColumn="0" w:lastRowFirstColumn="0" w:lastRowLastColumn="0"/>
-            </w:pPr>
-            <w:r>
-              <w:t>Fórmulas de consumo de lonas y vinilos en base de datos</w:t>
+            <w:r>
+              <w:rPr>
+                <w:rFonts w:ascii="Calibri" w:hAnsi="Calibri"/>
+                <w:b w:val="0"/>
+                <w:color w:val="000000"/>
+                <w:sz w:val="18"/>
+              </w:rPr>
+              <w:t>Script DDL y modelo relacional de catálogo de insumos en PostgreSQL</w:t>
             </w:r>
           </w:p>
         </w:tc>
@@ -3625,10 +3974,13 @@
             </w:tcMar>
           </w:tcPr>
           <w:p>
-            <w:pPr>
-              <w:cnfStyle w:val="000000100000" w:firstRow="0" w:lastRow="0" w:firstColumn="0" w:lastColumn="0" w:oddVBand="0" w:evenVBand="0" w:oddHBand="1" w:evenHBand="0" w:firstRowFirstColumn="0" w:firstRowLastColumn="0" w:lastRowFirstColumn="0" w:lastRowLastColumn="0"/>
-            </w:pPr>
-            <w:r>
+            <w:r>
+              <w:rPr>
+                <w:rFonts w:ascii="Calibri" w:hAnsi="Calibri"/>
+                <w:b w:val="0"/>
+                <w:color w:val="000000"/>
+                <w:sz w:val="18"/>
+              </w:rPr>
               <w:t>0%</w:t>
             </w:r>
           </w:p>
@@ -3654,13 +4006,11 @@
             </w:tcMar>
           </w:tcPr>
           <w:p>
-            <w:pPr>
-              <w:spacing w:before="40" w:after="80" w:line="276" w:lineRule="auto"/>
-            </w:pPr>
-            <w:r>
-              <w:rPr>
-                <w:rFonts w:ascii="Calibri" w:hAnsi="Calibri"/>
-                <w:color w:val="FFFFFF"/>
+            <w:r>
+              <w:rPr>
+                <w:rFonts w:ascii="Calibri" w:hAnsi="Calibri"/>
+                <w:b w:val="0"/>
+                <w:color w:val="000000"/>
                 <w:sz w:val="18"/>
               </w:rPr>
               <w:t>Cumplimiento Promedio Global del Período</w:t>
@@ -3685,18 +4035,14 @@
             </w:tcMar>
           </w:tcPr>
           <w:p>
-            <w:pPr>
-              <w:spacing w:before="40" w:after="80" w:line="276" w:lineRule="auto"/>
-              <w:cnfStyle w:val="000000000000" w:firstRow="0" w:lastRow="0" w:firstColumn="0" w:lastColumn="0" w:oddVBand="0" w:evenVBand="0" w:oddHBand="0" w:evenHBand="0" w:firstRowFirstColumn="0" w:firstRowLastColumn="0" w:lastRowFirstColumn="0" w:lastRowLastColumn="0"/>
-            </w:pPr>
-            <w:r>
-              <w:rPr>
-                <w:rFonts w:ascii="Calibri" w:hAnsi="Calibri"/>
-                <w:b/>
-                <w:color w:val="FFFFFF"/>
-                <w:sz w:val="18"/>
-              </w:rPr>
-              <w:t>5 actividades evaluadías en la Semana 4</w:t>
+            <w:r>
+              <w:rPr>
+                <w:rFonts w:ascii="Calibri" w:hAnsi="Calibri"/>
+                <w:b w:val="0"/>
+                <w:color w:val="000000"/>
+                <w:sz w:val="18"/>
+              </w:rPr>
+              <w:t>5 actividades EDT evaluadas bajo regla binaria (100% o 0%)</w:t>
             </w:r>
           </w:p>
         </w:tc>
@@ -3718,16 +4064,11 @@
             </w:tcMar>
           </w:tcPr>
           <w:p>
-            <w:pPr>
-              <w:spacing w:before="40" w:after="80" w:line="276" w:lineRule="auto"/>
-              <w:jc w:val="center"/>
-              <w:cnfStyle w:val="000000000000" w:firstRow="0" w:lastRow="0" w:firstColumn="0" w:lastColumn="0" w:oddVBand="0" w:evenVBand="0" w:oddHBand="0" w:evenHBand="0" w:firstRowFirstColumn="0" w:firstRowLastColumn="0" w:lastRowFirstColumn="0" w:lastRowLastColumn="0"/>
-            </w:pPr>
-            <w:r>
-              <w:rPr>
-                <w:rFonts w:ascii="Calibri" w:hAnsi="Calibri"/>
-                <w:b/>
-                <w:color w:val="FFFFFF"/>
+            <w:r>
+              <w:rPr>
+                <w:rFonts w:ascii="Calibri" w:hAnsi="Calibri"/>
+                <w:b w:val="0"/>
+                <w:color w:val="000000"/>
                 <w:sz w:val="18"/>
               </w:rPr>
               <w:t>80.0%</w:t>
@@ -3812,8 +4153,9 @@
             </w:pPr>
             <w:r>
               <w:rPr>
-                <w:rFonts w:asciiTheme="minorHAnsi" w:hAnsiTheme="minorHAnsi"/>
-                <w:color w:val="FFFFFF"/>
+                <w:rFonts w:asciiTheme="minorHAnsi" w:hAnsiTheme="minorHAnsi" w:ascii="Calibri" w:hAnsi="Calibri"/>
+                <w:b w:val="0"/>
+                <w:color w:val="000000"/>
                 <w:sz w:val="18"/>
                 <w:lang w:val="en-US"/>
               </w:rPr>
@@ -3838,8 +4180,9 @@
             </w:pPr>
             <w:r>
               <w:rPr>
-                <w:rFonts w:asciiTheme="minorHAnsi" w:hAnsiTheme="minorHAnsi"/>
-                <w:color w:val="FFFFFF"/>
+                <w:rFonts w:asciiTheme="minorHAnsi" w:hAnsiTheme="minorHAnsi" w:ascii="Calibri" w:hAnsi="Calibri"/>
+                <w:b w:val="0"/>
+                <w:color w:val="000000"/>
                 <w:sz w:val="18"/>
                 <w:lang w:val="en-US"/>
               </w:rPr>
@@ -3864,8 +4207,9 @@
             </w:pPr>
             <w:r>
               <w:rPr>
-                <w:rFonts w:asciiTheme="minorHAnsi" w:hAnsiTheme="minorHAnsi"/>
-                <w:color w:val="FFFFFF"/>
+                <w:rFonts w:asciiTheme="minorHAnsi" w:hAnsiTheme="minorHAnsi" w:ascii="Calibri" w:hAnsi="Calibri"/>
+                <w:b w:val="0"/>
+                <w:color w:val="000000"/>
                 <w:sz w:val="18"/>
                 <w:lang w:val="en-US"/>
               </w:rPr>
@@ -3890,8 +4234,9 @@
             </w:pPr>
             <w:r>
               <w:rPr>
-                <w:rFonts w:asciiTheme="minorHAnsi" w:hAnsiTheme="minorHAnsi"/>
-                <w:color w:val="FFFFFF"/>
+                <w:rFonts w:asciiTheme="minorHAnsi" w:hAnsiTheme="minorHAnsi" w:ascii="Calibri" w:hAnsi="Calibri"/>
+                <w:b w:val="0"/>
+                <w:color w:val="000000"/>
                 <w:sz w:val="18"/>
                 <w:lang w:val="en-US"/>
               </w:rPr>
@@ -3923,17 +4268,14 @@
             </w:tcMar>
           </w:tcPr>
           <w:p>
-            <w:pPr>
-              <w:spacing w:before="40" w:after="80" w:line="276" w:lineRule="auto"/>
-            </w:pPr>
-            <w:r>
-              <w:rPr>
-                <w:rFonts w:ascii="Calibri" w:hAnsi="Calibri"/>
-                <w:b w:val="0"/>
-                <w:color w:val="000000"/>
-                <w:sz w:val="17"/>
-              </w:rPr>
-              <w:t>Configuración de entorno Docker local y base de datos</w:t>
+            <w:r>
+              <w:rPr>
+                <w:rFonts w:ascii="Calibri" w:hAnsi="Calibri"/>
+                <w:b w:val="0"/>
+                <w:color w:val="000000"/>
+                <w:sz w:val="18"/>
+              </w:rPr>
+              <w:t>EDT 4.1.1.a Configuración de entorno Docker local y base de datos</w:t>
             </w:r>
           </w:p>
         </w:tc>
@@ -3955,16 +4297,12 @@
             </w:tcMar>
           </w:tcPr>
           <w:p>
-            <w:pPr>
-              <w:spacing w:before="40" w:after="80" w:line="276" w:lineRule="auto"/>
-              <w:jc w:val="center"/>
-              <w:cnfStyle w:val="000000100000" w:firstRow="0" w:lastRow="0" w:firstColumn="0" w:lastColumn="0" w:oddVBand="0" w:evenVBand="0" w:oddHBand="1" w:evenHBand="0" w:firstRowFirstColumn="0" w:firstRowLastColumn="0" w:lastRowFirstColumn="0" w:lastRowLastColumn="0"/>
-            </w:pPr>
-            <w:r>
-              <w:rPr>
-                <w:rFonts w:ascii="Calibri" w:hAnsi="Calibri"/>
-                <w:color w:val="000000"/>
-                <w:sz w:val="17"/>
+            <w:r>
+              <w:rPr>
+                <w:rFonts w:ascii="Calibri" w:hAnsi="Calibri"/>
+                <w:b w:val="0"/>
+                <w:color w:val="000000"/>
+                <w:sz w:val="18"/>
               </w:rPr>
               <w:t>2 días</w:t>
             </w:r>
@@ -3988,16 +4326,12 @@
             </w:tcMar>
           </w:tcPr>
           <w:p>
-            <w:pPr>
-              <w:spacing w:before="40" w:after="80" w:line="276" w:lineRule="auto"/>
-              <w:jc w:val="center"/>
-              <w:cnfStyle w:val="000000100000" w:firstRow="0" w:lastRow="0" w:firstColumn="0" w:lastColumn="0" w:oddVBand="0" w:evenVBand="0" w:oddHBand="1" w:evenHBand="0" w:firstRowFirstColumn="0" w:firstRowLastColumn="0" w:lastRowFirstColumn="0" w:lastRowLastColumn="0"/>
-            </w:pPr>
-            <w:r>
-              <w:rPr>
-                <w:rFonts w:ascii="Calibri" w:hAnsi="Calibri"/>
-                <w:color w:val="000000"/>
-                <w:sz w:val="17"/>
+            <w:r>
+              <w:rPr>
+                <w:rFonts w:ascii="Calibri" w:hAnsi="Calibri"/>
+                <w:b w:val="0"/>
+                <w:color w:val="000000"/>
+                <w:sz w:val="18"/>
               </w:rPr>
               <w:t>2 días</w:t>
             </w:r>
@@ -4021,17 +4355,12 @@
             </w:tcMar>
           </w:tcPr>
           <w:p>
-            <w:pPr>
-              <w:spacing w:before="40" w:after="80" w:line="276" w:lineRule="auto"/>
-              <w:jc w:val="center"/>
-              <w:cnfStyle w:val="000000100000" w:firstRow="0" w:lastRow="0" w:firstColumn="0" w:lastColumn="0" w:oddVBand="0" w:evenVBand="0" w:oddHBand="1" w:evenHBand="0" w:firstRowFirstColumn="0" w:firstRowLastColumn="0" w:lastRowFirstColumn="0" w:lastRowLastColumn="0"/>
-            </w:pPr>
-            <w:r>
-              <w:rPr>
-                <w:rFonts w:ascii="Calibri" w:hAnsi="Calibri"/>
-                <w:b/>
-                <w:color w:val="000000"/>
-                <w:sz w:val="17"/>
+            <w:r>
+              <w:rPr>
+                <w:rFonts w:ascii="Calibri" w:hAnsi="Calibri"/>
+                <w:b w:val="0"/>
+                <w:color w:val="000000"/>
+                <w:sz w:val="18"/>
               </w:rPr>
               <w:t>100.0%</w:t>
             </w:r>
@@ -4058,17 +4387,14 @@
             </w:tcMar>
           </w:tcPr>
           <w:p>
-            <w:pPr>
-              <w:spacing w:before="40" w:after="80" w:line="276" w:lineRule="auto"/>
-            </w:pPr>
-            <w:r>
-              <w:rPr>
-                <w:rFonts w:ascii="Calibri" w:hAnsi="Calibri"/>
-                <w:b w:val="0"/>
-                <w:color w:val="000000"/>
-                <w:sz w:val="17"/>
-              </w:rPr>
-              <w:t>Modelado relacional de tablas de Usuarios y Roles</w:t>
+            <w:r>
+              <w:rPr>
+                <w:rFonts w:ascii="Calibri" w:hAnsi="Calibri"/>
+                <w:b w:val="0"/>
+                <w:color w:val="000000"/>
+                <w:sz w:val="18"/>
+              </w:rPr>
+              <w:t>EDT 4.1.1.b Modelado relacional de tablas de Usuarios y Roles</w:t>
             </w:r>
           </w:p>
         </w:tc>
@@ -4090,16 +4416,12 @@
             </w:tcMar>
           </w:tcPr>
           <w:p>
-            <w:pPr>
-              <w:spacing w:before="40" w:after="80" w:line="276" w:lineRule="auto"/>
-              <w:jc w:val="center"/>
-              <w:cnfStyle w:val="000000000000" w:firstRow="0" w:lastRow="0" w:firstColumn="0" w:lastColumn="0" w:oddVBand="0" w:evenVBand="0" w:oddHBand="0" w:evenHBand="0" w:firstRowFirstColumn="0" w:firstRowLastColumn="0" w:lastRowFirstColumn="0" w:lastRowLastColumn="0"/>
-            </w:pPr>
-            <w:r>
-              <w:rPr>
-                <w:rFonts w:ascii="Calibri" w:hAnsi="Calibri"/>
-                <w:color w:val="000000"/>
-                <w:sz w:val="17"/>
+            <w:r>
+              <w:rPr>
+                <w:rFonts w:ascii="Calibri" w:hAnsi="Calibri"/>
+                <w:b w:val="0"/>
+                <w:color w:val="000000"/>
+                <w:sz w:val="18"/>
               </w:rPr>
               <w:t>2 días</w:t>
             </w:r>
@@ -4123,16 +4445,12 @@
             </w:tcMar>
           </w:tcPr>
           <w:p>
-            <w:pPr>
-              <w:spacing w:before="40" w:after="80" w:line="276" w:lineRule="auto"/>
-              <w:jc w:val="center"/>
-              <w:cnfStyle w:val="000000000000" w:firstRow="0" w:lastRow="0" w:firstColumn="0" w:lastColumn="0" w:oddVBand="0" w:evenVBand="0" w:oddHBand="0" w:evenHBand="0" w:firstRowFirstColumn="0" w:firstRowLastColumn="0" w:lastRowFirstColumn="0" w:lastRowLastColumn="0"/>
-            </w:pPr>
-            <w:r>
-              <w:rPr>
-                <w:rFonts w:ascii="Calibri" w:hAnsi="Calibri"/>
-                <w:color w:val="000000"/>
-                <w:sz w:val="17"/>
+            <w:r>
+              <w:rPr>
+                <w:rFonts w:ascii="Calibri" w:hAnsi="Calibri"/>
+                <w:b w:val="0"/>
+                <w:color w:val="000000"/>
+                <w:sz w:val="18"/>
               </w:rPr>
               <w:t>2 días</w:t>
             </w:r>
@@ -4156,17 +4474,12 @@
             </w:tcMar>
           </w:tcPr>
           <w:p>
-            <w:pPr>
-              <w:spacing w:before="40" w:after="80" w:line="276" w:lineRule="auto"/>
-              <w:jc w:val="center"/>
-              <w:cnfStyle w:val="000000000000" w:firstRow="0" w:lastRow="0" w:firstColumn="0" w:lastColumn="0" w:oddVBand="0" w:evenVBand="0" w:oddHBand="0" w:evenHBand="0" w:firstRowFirstColumn="0" w:firstRowLastColumn="0" w:lastRowFirstColumn="0" w:lastRowLastColumn="0"/>
-            </w:pPr>
-            <w:r>
-              <w:rPr>
-                <w:rFonts w:ascii="Calibri" w:hAnsi="Calibri"/>
-                <w:b/>
-                <w:color w:val="000000"/>
-                <w:sz w:val="17"/>
+            <w:r>
+              <w:rPr>
+                <w:rFonts w:ascii="Calibri" w:hAnsi="Calibri"/>
+                <w:b w:val="0"/>
+                <w:color w:val="000000"/>
+                <w:sz w:val="18"/>
               </w:rPr>
               <w:t>100.0%</w:t>
             </w:r>
@@ -4196,17 +4509,14 @@
             </w:tcMar>
           </w:tcPr>
           <w:p>
-            <w:pPr>
-              <w:spacing w:before="40" w:after="80" w:line="276" w:lineRule="auto"/>
-            </w:pPr>
-            <w:r>
-              <w:rPr>
-                <w:rFonts w:ascii="Calibri" w:hAnsi="Calibri"/>
-                <w:b w:val="0"/>
-                <w:color w:val="000000"/>
-                <w:sz w:val="17"/>
-              </w:rPr>
-              <w:t>Servicio de autenticación JWT y roles en FastAPI</w:t>
+            <w:r>
+              <w:rPr>
+                <w:rFonts w:ascii="Calibri" w:hAnsi="Calibri"/>
+                <w:b w:val="0"/>
+                <w:color w:val="000000"/>
+                <w:sz w:val="18"/>
+              </w:rPr>
+              <w:t>EDT 4.1.1.c Servicio de autenticación JWT y roles en FastAPI</w:t>
             </w:r>
           </w:p>
         </w:tc>
@@ -4228,16 +4538,12 @@
             </w:tcMar>
           </w:tcPr>
           <w:p>
-            <w:pPr>
-              <w:spacing w:before="40" w:after="80" w:line="276" w:lineRule="auto"/>
-              <w:jc w:val="center"/>
-              <w:cnfStyle w:val="000000100000" w:firstRow="0" w:lastRow="0" w:firstColumn="0" w:lastColumn="0" w:oddVBand="0" w:evenVBand="0" w:oddHBand="1" w:evenHBand="0" w:firstRowFirstColumn="0" w:firstRowLastColumn="0" w:lastRowFirstColumn="0" w:lastRowLastColumn="0"/>
-            </w:pPr>
-            <w:r>
-              <w:rPr>
-                <w:rFonts w:ascii="Calibri" w:hAnsi="Calibri"/>
-                <w:color w:val="000000"/>
-                <w:sz w:val="17"/>
+            <w:r>
+              <w:rPr>
+                <w:rFonts w:ascii="Calibri" w:hAnsi="Calibri"/>
+                <w:b w:val="0"/>
+                <w:color w:val="000000"/>
+                <w:sz w:val="18"/>
               </w:rPr>
               <w:t>3 días</w:t>
             </w:r>
@@ -4261,16 +4567,12 @@
             </w:tcMar>
           </w:tcPr>
           <w:p>
-            <w:pPr>
-              <w:spacing w:before="40" w:after="80" w:line="276" w:lineRule="auto"/>
-              <w:jc w:val="center"/>
-              <w:cnfStyle w:val="000000100000" w:firstRow="0" w:lastRow="0" w:firstColumn="0" w:lastColumn="0" w:oddVBand="0" w:evenVBand="0" w:oddHBand="1" w:evenHBand="0" w:firstRowFirstColumn="0" w:firstRowLastColumn="0" w:lastRowFirstColumn="0" w:lastRowLastColumn="0"/>
-            </w:pPr>
-            <w:r>
-              <w:rPr>
-                <w:rFonts w:ascii="Calibri" w:hAnsi="Calibri"/>
-                <w:color w:val="000000"/>
-                <w:sz w:val="17"/>
+            <w:r>
+              <w:rPr>
+                <w:rFonts w:ascii="Calibri" w:hAnsi="Calibri"/>
+                <w:b w:val="0"/>
+                <w:color w:val="000000"/>
+                <w:sz w:val="18"/>
               </w:rPr>
               <w:t>3 días</w:t>
             </w:r>
@@ -4294,17 +4596,12 @@
             </w:tcMar>
           </w:tcPr>
           <w:p>
-            <w:pPr>
-              <w:spacing w:before="40" w:after="80" w:line="276" w:lineRule="auto"/>
-              <w:jc w:val="center"/>
-              <w:cnfStyle w:val="000000100000" w:firstRow="0" w:lastRow="0" w:firstColumn="0" w:lastColumn="0" w:oddVBand="0" w:evenVBand="0" w:oddHBand="1" w:evenHBand="0" w:firstRowFirstColumn="0" w:firstRowLastColumn="0" w:lastRowFirstColumn="0" w:lastRowLastColumn="0"/>
-            </w:pPr>
-            <w:r>
-              <w:rPr>
-                <w:rFonts w:ascii="Calibri" w:hAnsi="Calibri"/>
-                <w:b/>
-                <w:color w:val="000000"/>
-                <w:sz w:val="17"/>
+            <w:r>
+              <w:rPr>
+                <w:rFonts w:ascii="Calibri" w:hAnsi="Calibri"/>
+                <w:b w:val="0"/>
+                <w:color w:val="000000"/>
+                <w:sz w:val="18"/>
               </w:rPr>
               <w:t>100.0%</w:t>
             </w:r>
@@ -4331,17 +4628,14 @@
             </w:tcMar>
           </w:tcPr>
           <w:p>
-            <w:pPr>
-              <w:spacing w:before="40" w:after="80" w:line="276" w:lineRule="auto"/>
-            </w:pPr>
-            <w:r>
-              <w:rPr>
-                <w:rFonts w:ascii="Calibri" w:hAnsi="Calibri"/>
-                <w:b w:val="0"/>
-                <w:color w:val="000000"/>
-                <w:sz w:val="17"/>
-              </w:rPr>
-              <w:t>Componente de Login y Guards de navegación Angular</w:t>
+            <w:r>
+              <w:rPr>
+                <w:rFonts w:ascii="Calibri" w:hAnsi="Calibri"/>
+                <w:b w:val="0"/>
+                <w:color w:val="000000"/>
+                <w:sz w:val="18"/>
+              </w:rPr>
+              <w:t>EDT 4.1.1.d Componente de Login y Guards de navegación Angular</w:t>
             </w:r>
           </w:p>
         </w:tc>
@@ -4363,16 +4657,12 @@
             </w:tcMar>
           </w:tcPr>
           <w:p>
-            <w:pPr>
-              <w:spacing w:before="40" w:after="80" w:line="276" w:lineRule="auto"/>
-              <w:jc w:val="center"/>
-              <w:cnfStyle w:val="000000000000" w:firstRow="0" w:lastRow="0" w:firstColumn="0" w:lastColumn="0" w:oddVBand="0" w:evenVBand="0" w:oddHBand="0" w:evenHBand="0" w:firstRowFirstColumn="0" w:firstRowLastColumn="0" w:lastRowFirstColumn="0" w:lastRowLastColumn="0"/>
-            </w:pPr>
-            <w:r>
-              <w:rPr>
-                <w:rFonts w:ascii="Calibri" w:hAnsi="Calibri"/>
-                <w:color w:val="000000"/>
-                <w:sz w:val="17"/>
+            <w:r>
+              <w:rPr>
+                <w:rFonts w:ascii="Calibri" w:hAnsi="Calibri"/>
+                <w:b w:val="0"/>
+                <w:color w:val="000000"/>
+                <w:sz w:val="18"/>
               </w:rPr>
               <w:t>3 días</w:t>
             </w:r>
@@ -4396,16 +4686,12 @@
             </w:tcMar>
           </w:tcPr>
           <w:p>
-            <w:pPr>
-              <w:spacing w:before="40" w:after="80" w:line="276" w:lineRule="auto"/>
-              <w:jc w:val="center"/>
-              <w:cnfStyle w:val="000000000000" w:firstRow="0" w:lastRow="0" w:firstColumn="0" w:lastColumn="0" w:oddVBand="0" w:evenVBand="0" w:oddHBand="0" w:evenHBand="0" w:firstRowFirstColumn="0" w:firstRowLastColumn="0" w:lastRowFirstColumn="0" w:lastRowLastColumn="0"/>
-            </w:pPr>
-            <w:r>
-              <w:rPr>
-                <w:rFonts w:ascii="Calibri" w:hAnsi="Calibri"/>
-                <w:color w:val="000000"/>
-                <w:sz w:val="17"/>
+            <w:r>
+              <w:rPr>
+                <w:rFonts w:ascii="Calibri" w:hAnsi="Calibri"/>
+                <w:b w:val="0"/>
+                <w:color w:val="000000"/>
+                <w:sz w:val="18"/>
               </w:rPr>
               <w:t>3 días</w:t>
             </w:r>
@@ -4429,17 +4715,12 @@
             </w:tcMar>
           </w:tcPr>
           <w:p>
-            <w:pPr>
-              <w:spacing w:before="40" w:after="80" w:line="276" w:lineRule="auto"/>
-              <w:jc w:val="center"/>
-              <w:cnfStyle w:val="000000000000" w:firstRow="0" w:lastRow="0" w:firstColumn="0" w:lastColumn="0" w:oddVBand="0" w:evenVBand="0" w:oddHBand="0" w:evenHBand="0" w:firstRowFirstColumn="0" w:firstRowLastColumn="0" w:lastRowFirstColumn="0" w:lastRowLastColumn="0"/>
-            </w:pPr>
-            <w:r>
-              <w:rPr>
-                <w:rFonts w:ascii="Calibri" w:hAnsi="Calibri"/>
-                <w:b/>
-                <w:color w:val="000000"/>
-                <w:sz w:val="17"/>
+            <w:r>
+              <w:rPr>
+                <w:rFonts w:ascii="Calibri" w:hAnsi="Calibri"/>
+                <w:b w:val="0"/>
+                <w:color w:val="000000"/>
+                <w:sz w:val="18"/>
               </w:rPr>
               <w:t>100.0%</w:t>
             </w:r>
@@ -4469,17 +4750,14 @@
             </w:tcMar>
           </w:tcPr>
           <w:p>
-            <w:pPr>
-              <w:spacing w:before="40" w:after="80" w:line="276" w:lineRule="auto"/>
-            </w:pPr>
-            <w:r>
-              <w:rPr>
-                <w:rFonts w:ascii="Calibri" w:hAnsi="Calibri"/>
-                <w:b w:val="0"/>
-                <w:color w:val="000000"/>
-                <w:sz w:val="17"/>
-              </w:rPr>
-              <w:t>Parametrización de catálogo y recetas de insumos por m²</w:t>
+            <w:r>
+              <w:rPr>
+                <w:rFonts w:ascii="Calibri" w:hAnsi="Calibri"/>
+                <w:b w:val="0"/>
+                <w:color w:val="000000"/>
+                <w:sz w:val="18"/>
+              </w:rPr>
+              <w:t>EDT 4.1.1.e Modelo de base de datos de catálogo e insumos</w:t>
             </w:r>
           </w:p>
         </w:tc>
@@ -4501,16 +4779,12 @@
             </w:tcMar>
           </w:tcPr>
           <w:p>
-            <w:pPr>
-              <w:spacing w:before="40" w:after="80" w:line="276" w:lineRule="auto"/>
-              <w:jc w:val="center"/>
-              <w:cnfStyle w:val="000000100000" w:firstRow="0" w:lastRow="0" w:firstColumn="0" w:lastColumn="0" w:oddVBand="0" w:evenVBand="0" w:oddHBand="1" w:evenHBand="0" w:firstRowFirstColumn="0" w:firstRowLastColumn="0" w:lastRowFirstColumn="0" w:lastRowLastColumn="0"/>
-            </w:pPr>
-            <w:r>
-              <w:rPr>
-                <w:rFonts w:ascii="Calibri" w:hAnsi="Calibri"/>
-                <w:color w:val="000000"/>
-                <w:sz w:val="17"/>
+            <w:r>
+              <w:rPr>
+                <w:rFonts w:ascii="Calibri" w:hAnsi="Calibri"/>
+                <w:b w:val="0"/>
+                <w:color w:val="000000"/>
+                <w:sz w:val="18"/>
               </w:rPr>
               <w:t>3 días</w:t>
             </w:r>
@@ -4534,16 +4808,12 @@
             </w:tcMar>
           </w:tcPr>
           <w:p>
-            <w:pPr>
-              <w:spacing w:before="40" w:after="80" w:line="276" w:lineRule="auto"/>
-              <w:jc w:val="center"/>
-              <w:cnfStyle w:val="000000100000" w:firstRow="0" w:lastRow="0" w:firstColumn="0" w:lastColumn="0" w:oddVBand="0" w:evenVBand="0" w:oddHBand="1" w:evenHBand="0" w:firstRowFirstColumn="0" w:firstRowLastColumn="0" w:lastRowFirstColumn="0" w:lastRowLastColumn="0"/>
-            </w:pPr>
-            <w:r>
-              <w:rPr>
-                <w:rFonts w:ascii="Calibri" w:hAnsi="Calibri"/>
-                <w:color w:val="000000"/>
-                <w:sz w:val="17"/>
+            <w:r>
+              <w:rPr>
+                <w:rFonts w:ascii="Calibri" w:hAnsi="Calibri"/>
+                <w:b w:val="0"/>
+                <w:color w:val="000000"/>
+                <w:sz w:val="18"/>
               </w:rPr>
               <w:t>4 días (en curso)</w:t>
             </w:r>
@@ -4567,17 +4837,12 @@
             </w:tcMar>
           </w:tcPr>
           <w:p>
-            <w:pPr>
-              <w:spacing w:before="40" w:after="80" w:line="276" w:lineRule="auto"/>
-              <w:jc w:val="center"/>
-              <w:cnfStyle w:val="000000100000" w:firstRow="0" w:lastRow="0" w:firstColumn="0" w:lastColumn="0" w:oddVBand="0" w:evenVBand="0" w:oddHBand="1" w:evenHBand="0" w:firstRowFirstColumn="0" w:firstRowLastColumn="0" w:lastRowFirstColumn="0" w:lastRowLastColumn="0"/>
-            </w:pPr>
-            <w:r>
-              <w:rPr>
-                <w:rFonts w:ascii="Calibri" w:hAnsi="Calibri"/>
-                <w:b/>
-                <w:color w:val="000000"/>
-                <w:sz w:val="17"/>
+            <w:r>
+              <w:rPr>
+                <w:rFonts w:ascii="Calibri" w:hAnsi="Calibri"/>
+                <w:b w:val="0"/>
+                <w:color w:val="000000"/>
+                <w:sz w:val="18"/>
               </w:rPr>
               <w:t>50.0%</w:t>
             </w:r>
@@ -4604,13 +4869,11 @@
             </w:tcMar>
           </w:tcPr>
           <w:p>
-            <w:pPr>
-              <w:spacing w:before="40" w:after="80" w:line="276" w:lineRule="auto"/>
-            </w:pPr>
-            <w:r>
-              <w:rPr>
-                <w:rFonts w:ascii="Calibri" w:hAnsi="Calibri"/>
-                <w:color w:val="FFFFFF"/>
+            <w:r>
+              <w:rPr>
+                <w:rFonts w:ascii="Calibri" w:hAnsi="Calibri"/>
+                <w:b w:val="0"/>
+                <w:color w:val="000000"/>
                 <w:sz w:val="18"/>
               </w:rPr>
               <w:t>Cumplimiento Promedio de Tiempo</w:t>
@@ -4635,19 +4898,14 @@
             </w:tcMar>
           </w:tcPr>
           <w:p>
-            <w:pPr>
-              <w:spacing w:before="40" w:after="80" w:line="276" w:lineRule="auto"/>
-              <w:jc w:val="center"/>
-              <w:cnfStyle w:val="000000000000" w:firstRow="0" w:lastRow="0" w:firstColumn="0" w:lastColumn="0" w:oddVBand="0" w:evenVBand="0" w:oddHBand="0" w:evenHBand="0" w:firstRowFirstColumn="0" w:firstRowLastColumn="0" w:lastRowFirstColumn="0" w:lastRowLastColumn="0"/>
-            </w:pPr>
-            <w:r>
-              <w:rPr>
-                <w:rFonts w:ascii="Calibri" w:hAnsi="Calibri"/>
-                <w:b/>
-                <w:color w:val="FFFFFF"/>
-                <w:sz w:val="18"/>
-              </w:rPr>
-              <w:t>13 días planificados</w:t>
+            <w:r>
+              <w:rPr>
+                <w:rFonts w:ascii="Calibri" w:hAnsi="Calibri"/>
+                <w:b w:val="0"/>
+                <w:color w:val="000000"/>
+                <w:sz w:val="18"/>
+              </w:rPr>
+              <w:t>12 días planificados</w:t>
             </w:r>
           </w:p>
         </w:tc>
@@ -4669,16 +4927,11 @@
             </w:tcMar>
           </w:tcPr>
           <w:p>
-            <w:pPr>
-              <w:spacing w:before="40" w:after="80" w:line="276" w:lineRule="auto"/>
-              <w:jc w:val="center"/>
-              <w:cnfStyle w:val="000000000000" w:firstRow="0" w:lastRow="0" w:firstColumn="0" w:lastColumn="0" w:oddVBand="0" w:evenVBand="0" w:oddHBand="0" w:evenHBand="0" w:firstRowFirstColumn="0" w:firstRowLastColumn="0" w:lastRowFirstColumn="0" w:lastRowLastColumn="0"/>
-            </w:pPr>
-            <w:r>
-              <w:rPr>
-                <w:rFonts w:ascii="Calibri" w:hAnsi="Calibri"/>
-                <w:b/>
-                <w:color w:val="FFFFFF"/>
+            <w:r>
+              <w:rPr>
+                <w:rFonts w:ascii="Calibri" w:hAnsi="Calibri"/>
+                <w:b w:val="0"/>
+                <w:color w:val="000000"/>
                 <w:sz w:val="18"/>
               </w:rPr>
               <w:t>14 días insumidos</w:t>
@@ -4703,16 +4956,11 @@
             </w:tcMar>
           </w:tcPr>
           <w:p>
-            <w:pPr>
-              <w:spacing w:before="40" w:after="80" w:line="276" w:lineRule="auto"/>
-              <w:jc w:val="center"/>
-              <w:cnfStyle w:val="000000000000" w:firstRow="0" w:lastRow="0" w:firstColumn="0" w:lastColumn="0" w:oddVBand="0" w:evenVBand="0" w:oddHBand="0" w:evenHBand="0" w:firstRowFirstColumn="0" w:firstRowLastColumn="0" w:lastRowFirstColumn="0" w:lastRowLastColumn="0"/>
-            </w:pPr>
-            <w:r>
-              <w:rPr>
-                <w:rFonts w:ascii="Calibri" w:hAnsi="Calibri"/>
-                <w:b/>
-                <w:color w:val="FFFFFF"/>
+            <w:r>
+              <w:rPr>
+                <w:rFonts w:ascii="Calibri" w:hAnsi="Calibri"/>
+                <w:b w:val="0"/>
+                <w:color w:val="000000"/>
                 <w:sz w:val="18"/>
               </w:rPr>
               <w:t>83.3%</w:t>
@@ -4796,8 +5044,9 @@
             </w:pPr>
             <w:r>
               <w:rPr>
-                <w:rFonts w:asciiTheme="minorHAnsi" w:hAnsiTheme="minorHAnsi"/>
-                <w:color w:val="FFFFFF"/>
+                <w:rFonts w:asciiTheme="minorHAnsi" w:hAnsiTheme="minorHAnsi" w:ascii="Calibri" w:hAnsi="Calibri"/>
+                <w:b w:val="0"/>
+                <w:color w:val="000000"/>
                 <w:sz w:val="18"/>
                 <w:lang w:val="en-US"/>
               </w:rPr>
@@ -4822,8 +5071,9 @@
             </w:pPr>
             <w:r>
               <w:rPr>
-                <w:rFonts w:asciiTheme="minorHAnsi" w:hAnsiTheme="minorHAnsi"/>
-                <w:color w:val="FFFFFF"/>
+                <w:rFonts w:asciiTheme="minorHAnsi" w:hAnsiTheme="minorHAnsi" w:ascii="Calibri" w:hAnsi="Calibri"/>
+                <w:b w:val="0"/>
+                <w:color w:val="000000"/>
                 <w:sz w:val="18"/>
                 <w:lang w:val="en-US"/>
               </w:rPr>
@@ -4848,8 +5098,9 @@
             </w:pPr>
             <w:r>
               <w:rPr>
-                <w:rFonts w:asciiTheme="minorHAnsi" w:hAnsiTheme="minorHAnsi"/>
-                <w:color w:val="FFFFFF"/>
+                <w:rFonts w:asciiTheme="minorHAnsi" w:hAnsiTheme="minorHAnsi" w:ascii="Calibri" w:hAnsi="Calibri"/>
+                <w:b w:val="0"/>
+                <w:color w:val="000000"/>
                 <w:sz w:val="18"/>
                 <w:lang w:val="en-US"/>
               </w:rPr>
@@ -4881,17 +5132,14 @@
             </w:tcMar>
           </w:tcPr>
           <w:p>
-            <w:pPr>
-              <w:spacing w:before="40" w:after="80" w:line="276" w:lineRule="auto"/>
-            </w:pPr>
-            <w:r>
-              <w:rPr>
-                <w:rFonts w:ascii="Calibri" w:hAnsi="Calibri"/>
-                <w:b w:val="0"/>
-                <w:color w:val="000000"/>
-                <w:sz w:val="17"/>
-              </w:rPr>
-              <w:t>Configuración de entorno Docker Compose y PostgreSQL</w:t>
+            <w:r>
+              <w:rPr>
+                <w:rFonts w:ascii="Calibri" w:hAnsi="Calibri"/>
+                <w:b w:val="0"/>
+                <w:color w:val="000000"/>
+                <w:sz w:val="18"/>
+              </w:rPr>
+              <w:t>EDT 4.1.1.a Configuración de entorno Docker Compose y PostgreSQL</w:t>
             </w:r>
           </w:p>
         </w:tc>
@@ -4913,17 +5161,12 @@
             </w:tcMar>
           </w:tcPr>
           <w:p>
-            <w:pPr>
-              <w:spacing w:before="40" w:after="80" w:line="276" w:lineRule="auto"/>
-              <w:jc w:val="right"/>
-              <w:cnfStyle w:val="000000100000" w:firstRow="0" w:lastRow="0" w:firstColumn="0" w:lastColumn="0" w:oddVBand="0" w:evenVBand="0" w:oddHBand="1" w:evenHBand="0" w:firstRowFirstColumn="0" w:firstRowLastColumn="0" w:lastRowFirstColumn="0" w:lastRowLastColumn="0"/>
-            </w:pPr>
-            <w:r>
-              <w:rPr>
-                <w:rFonts w:ascii="Calibri" w:hAnsi="Calibri"/>
-                <w:b/>
-                <w:color w:val="000000"/>
-                <w:sz w:val="17"/>
+            <w:r>
+              <w:rPr>
+                <w:rFonts w:ascii="Calibri" w:hAnsi="Calibri"/>
+                <w:b w:val="0"/>
+                <w:color w:val="000000"/>
+                <w:sz w:val="18"/>
               </w:rPr>
               <w:t>S/ 250.00</w:t>
             </w:r>
@@ -4947,17 +5190,12 @@
             </w:tcMar>
           </w:tcPr>
           <w:p>
-            <w:pPr>
-              <w:spacing w:before="40" w:after="80" w:line="276" w:lineRule="auto"/>
-              <w:jc w:val="right"/>
-              <w:cnfStyle w:val="000000100000" w:firstRow="0" w:lastRow="0" w:firstColumn="0" w:lastColumn="0" w:oddVBand="0" w:evenVBand="0" w:oddHBand="1" w:evenHBand="0" w:firstRowFirstColumn="0" w:firstRowLastColumn="0" w:lastRowFirstColumn="0" w:lastRowLastColumn="0"/>
-            </w:pPr>
-            <w:r>
-              <w:rPr>
-                <w:rFonts w:ascii="Calibri" w:hAnsi="Calibri"/>
-                <w:b/>
-                <w:color w:val="000000"/>
-                <w:sz w:val="17"/>
+            <w:r>
+              <w:rPr>
+                <w:rFonts w:ascii="Calibri" w:hAnsi="Calibri"/>
+                <w:b w:val="0"/>
+                <w:color w:val="000000"/>
+                <w:sz w:val="18"/>
               </w:rPr>
               <w:t>S/ 240.00</w:t>
             </w:r>
@@ -4984,17 +5222,14 @@
             </w:tcMar>
           </w:tcPr>
           <w:p>
-            <w:pPr>
-              <w:spacing w:before="40" w:after="80" w:line="276" w:lineRule="auto"/>
-            </w:pPr>
-            <w:r>
-              <w:rPr>
-                <w:rFonts w:ascii="Calibri" w:hAnsi="Calibri"/>
-                <w:b w:val="0"/>
-                <w:color w:val="000000"/>
-                <w:sz w:val="17"/>
-              </w:rPr>
-              <w:t>Modelado relacional de datos y tablas de Usuarios</w:t>
+            <w:r>
+              <w:rPr>
+                <w:rFonts w:ascii="Calibri" w:hAnsi="Calibri"/>
+                <w:b w:val="0"/>
+                <w:color w:val="000000"/>
+                <w:sz w:val="18"/>
+              </w:rPr>
+              <w:t>EDT 4.1.1.b Modelado relacional de datos y tablas de Usuarios</w:t>
             </w:r>
           </w:p>
         </w:tc>
@@ -5016,17 +5251,12 @@
             </w:tcMar>
           </w:tcPr>
           <w:p>
-            <w:pPr>
-              <w:spacing w:before="40" w:after="80" w:line="276" w:lineRule="auto"/>
-              <w:jc w:val="right"/>
-              <w:cnfStyle w:val="000000000000" w:firstRow="0" w:lastRow="0" w:firstColumn="0" w:lastColumn="0" w:oddVBand="0" w:evenVBand="0" w:oddHBand="0" w:evenHBand="0" w:firstRowFirstColumn="0" w:firstRowLastColumn="0" w:lastRowFirstColumn="0" w:lastRowLastColumn="0"/>
-            </w:pPr>
-            <w:r>
-              <w:rPr>
-                <w:rFonts w:ascii="Calibri" w:hAnsi="Calibri"/>
-                <w:b/>
-                <w:color w:val="000000"/>
-                <w:sz w:val="17"/>
+            <w:r>
+              <w:rPr>
+                <w:rFonts w:ascii="Calibri" w:hAnsi="Calibri"/>
+                <w:b w:val="0"/>
+                <w:color w:val="000000"/>
+                <w:sz w:val="18"/>
               </w:rPr>
               <w:t>S/ 250.00</w:t>
             </w:r>
@@ -5050,17 +5280,12 @@
             </w:tcMar>
           </w:tcPr>
           <w:p>
-            <w:pPr>
-              <w:spacing w:before="40" w:after="80" w:line="276" w:lineRule="auto"/>
-              <w:jc w:val="right"/>
-              <w:cnfStyle w:val="000000000000" w:firstRow="0" w:lastRow="0" w:firstColumn="0" w:lastColumn="0" w:oddVBand="0" w:evenVBand="0" w:oddHBand="0" w:evenHBand="0" w:firstRowFirstColumn="0" w:firstRowLastColumn="0" w:lastRowFirstColumn="0" w:lastRowLastColumn="0"/>
-            </w:pPr>
-            <w:r>
-              <w:rPr>
-                <w:rFonts w:ascii="Calibri" w:hAnsi="Calibri"/>
-                <w:b/>
-                <w:color w:val="000000"/>
-                <w:sz w:val="17"/>
+            <w:r>
+              <w:rPr>
+                <w:rFonts w:ascii="Calibri" w:hAnsi="Calibri"/>
+                <w:b w:val="0"/>
+                <w:color w:val="000000"/>
+                <w:sz w:val="18"/>
               </w:rPr>
               <w:t>S/ 240.00</w:t>
             </w:r>
@@ -5090,17 +5315,14 @@
             </w:tcMar>
           </w:tcPr>
           <w:p>
-            <w:pPr>
-              <w:spacing w:before="40" w:after="80" w:line="276" w:lineRule="auto"/>
-            </w:pPr>
-            <w:r>
-              <w:rPr>
-                <w:rFonts w:ascii="Calibri" w:hAnsi="Calibri"/>
-                <w:b w:val="0"/>
-                <w:color w:val="000000"/>
-                <w:sz w:val="17"/>
-              </w:rPr>
-              <w:t>Desarrollo de API de Autenticación JWT en FastAPI</w:t>
+            <w:r>
+              <w:rPr>
+                <w:rFonts w:ascii="Calibri" w:hAnsi="Calibri"/>
+                <w:b w:val="0"/>
+                <w:color w:val="000000"/>
+                <w:sz w:val="18"/>
+              </w:rPr>
+              <w:t>EDT 4.1.1.c Desarrollo de API de Autenticación JWT en FastAPI</w:t>
             </w:r>
           </w:p>
         </w:tc>
@@ -5122,17 +5344,12 @@
             </w:tcMar>
           </w:tcPr>
           <w:p>
-            <w:pPr>
-              <w:spacing w:before="40" w:after="80" w:line="276" w:lineRule="auto"/>
-              <w:jc w:val="right"/>
-              <w:cnfStyle w:val="000000100000" w:firstRow="0" w:lastRow="0" w:firstColumn="0" w:lastColumn="0" w:oddVBand="0" w:evenVBand="0" w:oddHBand="1" w:evenHBand="0" w:firstRowFirstColumn="0" w:firstRowLastColumn="0" w:lastRowFirstColumn="0" w:lastRowLastColumn="0"/>
-            </w:pPr>
-            <w:r>
-              <w:rPr>
-                <w:rFonts w:ascii="Calibri" w:hAnsi="Calibri"/>
-                <w:b/>
-                <w:color w:val="000000"/>
-                <w:sz w:val="17"/>
+            <w:r>
+              <w:rPr>
+                <w:rFonts w:ascii="Calibri" w:hAnsi="Calibri"/>
+                <w:b w:val="0"/>
+                <w:color w:val="000000"/>
+                <w:sz w:val="18"/>
               </w:rPr>
               <w:t>S/ 400.00</w:t>
             </w:r>
@@ -5156,17 +5373,12 @@
             </w:tcMar>
           </w:tcPr>
           <w:p>
-            <w:pPr>
-              <w:spacing w:before="40" w:after="80" w:line="276" w:lineRule="auto"/>
-              <w:jc w:val="right"/>
-              <w:cnfStyle w:val="000000100000" w:firstRow="0" w:lastRow="0" w:firstColumn="0" w:lastColumn="0" w:oddVBand="0" w:evenVBand="0" w:oddHBand="1" w:evenHBand="0" w:firstRowFirstColumn="0" w:firstRowLastColumn="0" w:lastRowFirstColumn="0" w:lastRowLastColumn="0"/>
-            </w:pPr>
-            <w:r>
-              <w:rPr>
-                <w:rFonts w:ascii="Calibri" w:hAnsi="Calibri"/>
-                <w:b/>
-                <w:color w:val="000000"/>
-                <w:sz w:val="17"/>
+            <w:r>
+              <w:rPr>
+                <w:rFonts w:ascii="Calibri" w:hAnsi="Calibri"/>
+                <w:b w:val="0"/>
+                <w:color w:val="000000"/>
+                <w:sz w:val="18"/>
               </w:rPr>
               <w:t>S/ 380.00</w:t>
             </w:r>
@@ -5193,17 +5405,14 @@
             </w:tcMar>
           </w:tcPr>
           <w:p>
-            <w:pPr>
-              <w:spacing w:before="40" w:after="80" w:line="276" w:lineRule="auto"/>
-            </w:pPr>
-            <w:r>
-              <w:rPr>
-                <w:rFonts w:ascii="Calibri" w:hAnsi="Calibri"/>
-                <w:b w:val="0"/>
-                <w:color w:val="000000"/>
-                <w:sz w:val="17"/>
-              </w:rPr>
-              <w:t>Maquetación de Login y Guards de navegación Angular 21</w:t>
+            <w:r>
+              <w:rPr>
+                <w:rFonts w:ascii="Calibri" w:hAnsi="Calibri"/>
+                <w:b w:val="0"/>
+                <w:color w:val="000000"/>
+                <w:sz w:val="18"/>
+              </w:rPr>
+              <w:t>EDT 4.1.1.d Maquetación de Login y Guards de navegación Angular 21</w:t>
             </w:r>
           </w:p>
         </w:tc>
@@ -5225,17 +5434,12 @@
             </w:tcMar>
           </w:tcPr>
           <w:p>
-            <w:pPr>
-              <w:spacing w:before="40" w:after="80" w:line="276" w:lineRule="auto"/>
-              <w:jc w:val="right"/>
-              <w:cnfStyle w:val="000000000000" w:firstRow="0" w:lastRow="0" w:firstColumn="0" w:lastColumn="0" w:oddVBand="0" w:evenVBand="0" w:oddHBand="0" w:evenHBand="0" w:firstRowFirstColumn="0" w:firstRowLastColumn="0" w:lastRowFirstColumn="0" w:lastRowLastColumn="0"/>
-            </w:pPr>
-            <w:r>
-              <w:rPr>
-                <w:rFonts w:ascii="Calibri" w:hAnsi="Calibri"/>
-                <w:b/>
-                <w:color w:val="000000"/>
-                <w:sz w:val="17"/>
+            <w:r>
+              <w:rPr>
+                <w:rFonts w:ascii="Calibri" w:hAnsi="Calibri"/>
+                <w:b w:val="0"/>
+                <w:color w:val="000000"/>
+                <w:sz w:val="18"/>
               </w:rPr>
               <w:t>S/ 400.00</w:t>
             </w:r>
@@ -5259,17 +5463,12 @@
             </w:tcMar>
           </w:tcPr>
           <w:p>
-            <w:pPr>
-              <w:spacing w:before="40" w:after="80" w:line="276" w:lineRule="auto"/>
-              <w:jc w:val="right"/>
-              <w:cnfStyle w:val="000000000000" w:firstRow="0" w:lastRow="0" w:firstColumn="0" w:lastColumn="0" w:oddVBand="0" w:evenVBand="0" w:oddHBand="0" w:evenHBand="0" w:firstRowFirstColumn="0" w:firstRowLastColumn="0" w:lastRowFirstColumn="0" w:lastRowLastColumn="0"/>
-            </w:pPr>
-            <w:r>
-              <w:rPr>
-                <w:rFonts w:ascii="Calibri" w:hAnsi="Calibri"/>
-                <w:b/>
-                <w:color w:val="000000"/>
-                <w:sz w:val="17"/>
+            <w:r>
+              <w:rPr>
+                <w:rFonts w:ascii="Calibri" w:hAnsi="Calibri"/>
+                <w:b w:val="0"/>
+                <w:color w:val="000000"/>
+                <w:sz w:val="18"/>
               </w:rPr>
               <w:t>S/ 380.00</w:t>
             </w:r>
@@ -5299,17 +5498,14 @@
             </w:tcMar>
           </w:tcPr>
           <w:p>
-            <w:pPr>
-              <w:spacing w:before="40" w:after="80" w:line="276" w:lineRule="auto"/>
-            </w:pPr>
-            <w:r>
-              <w:rPr>
-                <w:rFonts w:ascii="Calibri" w:hAnsi="Calibri"/>
-                <w:b w:val="0"/>
-                <w:color w:val="000000"/>
-                <w:sz w:val="17"/>
-              </w:rPr>
-              <w:t>Parametrización de catálogo de insumos y recetas por m²</w:t>
+            <w:r>
+              <w:rPr>
+                <w:rFonts w:ascii="Calibri" w:hAnsi="Calibri"/>
+                <w:b w:val="0"/>
+                <w:color w:val="000000"/>
+                <w:sz w:val="18"/>
+              </w:rPr>
+              <w:t>EDT 4.1.1.e Parametrización de catálogo de insumos y recetas</w:t>
             </w:r>
           </w:p>
         </w:tc>
@@ -5331,17 +5527,12 @@
             </w:tcMar>
           </w:tcPr>
           <w:p>
-            <w:pPr>
-              <w:spacing w:before="40" w:after="80" w:line="276" w:lineRule="auto"/>
-              <w:jc w:val="right"/>
-              <w:cnfStyle w:val="000000100000" w:firstRow="0" w:lastRow="0" w:firstColumn="0" w:lastColumn="0" w:oddVBand="0" w:evenVBand="0" w:oddHBand="1" w:evenHBand="0" w:firstRowFirstColumn="0" w:firstRowLastColumn="0" w:lastRowFirstColumn="0" w:lastRowLastColumn="0"/>
-            </w:pPr>
-            <w:r>
-              <w:rPr>
-                <w:rFonts w:ascii="Calibri" w:hAnsi="Calibri"/>
-                <w:b/>
-                <w:color w:val="000000"/>
-                <w:sz w:val="17"/>
+            <w:r>
+              <w:rPr>
+                <w:rFonts w:ascii="Calibri" w:hAnsi="Calibri"/>
+                <w:b w:val="0"/>
+                <w:color w:val="000000"/>
+                <w:sz w:val="18"/>
               </w:rPr>
               <w:t>S/ 200.00</w:t>
             </w:r>
@@ -5365,17 +5556,12 @@
             </w:tcMar>
           </w:tcPr>
           <w:p>
-            <w:pPr>
-              <w:spacing w:before="40" w:after="80" w:line="276" w:lineRule="auto"/>
-              <w:jc w:val="right"/>
-              <w:cnfStyle w:val="000000100000" w:firstRow="0" w:lastRow="0" w:firstColumn="0" w:lastColumn="0" w:oddVBand="0" w:evenVBand="0" w:oddHBand="1" w:evenHBand="0" w:firstRowFirstColumn="0" w:firstRowLastColumn="0" w:lastRowFirstColumn="0" w:lastRowLastColumn="0"/>
-            </w:pPr>
-            <w:r>
-              <w:rPr>
-                <w:rFonts w:ascii="Calibri" w:hAnsi="Calibri"/>
-                <w:b/>
-                <w:color w:val="000000"/>
-                <w:sz w:val="17"/>
+            <w:r>
+              <w:rPr>
+                <w:rFonts w:ascii="Calibri" w:hAnsi="Calibri"/>
+                <w:b w:val="0"/>
+                <w:color w:val="000000"/>
+                <w:sz w:val="18"/>
               </w:rPr>
               <w:t>S/ 160.00</w:t>
             </w:r>
@@ -5402,13 +5588,11 @@
             </w:tcMar>
           </w:tcPr>
           <w:p>
-            <w:pPr>
-              <w:spacing w:before="40" w:after="80" w:line="276" w:lineRule="auto"/>
-            </w:pPr>
-            <w:r>
-              <w:rPr>
-                <w:rFonts w:ascii="Calibri" w:hAnsi="Calibri"/>
-                <w:color w:val="FFFFFF"/>
+            <w:r>
+              <w:rPr>
+                <w:rFonts w:ascii="Calibri" w:hAnsi="Calibri"/>
+                <w:b w:val="0"/>
+                <w:color w:val="000000"/>
                 <w:sz w:val="18"/>
               </w:rPr>
               <w:t>TOTAL VALORIZADO</w:t>
@@ -5433,16 +5617,11 @@
             </w:tcMar>
           </w:tcPr>
           <w:p>
-            <w:pPr>
-              <w:spacing w:before="40" w:after="80" w:line="276" w:lineRule="auto"/>
-              <w:jc w:val="right"/>
-              <w:cnfStyle w:val="000000000000" w:firstRow="0" w:lastRow="0" w:firstColumn="0" w:lastColumn="0" w:oddVBand="0" w:evenVBand="0" w:oddHBand="0" w:evenHBand="0" w:firstRowFirstColumn="0" w:firstRowLastColumn="0" w:lastRowFirstColumn="0" w:lastRowLastColumn="0"/>
-            </w:pPr>
-            <w:r>
-              <w:rPr>
-                <w:rFonts w:ascii="Calibri" w:hAnsi="Calibri"/>
-                <w:b/>
-                <w:color w:val="FFFFFF"/>
+            <w:r>
+              <w:rPr>
+                <w:rFonts w:ascii="Calibri" w:hAnsi="Calibri"/>
+                <w:b w:val="0"/>
+                <w:color w:val="000000"/>
                 <w:sz w:val="18"/>
               </w:rPr>
               <w:t>S/ 1,500.00</w:t>
@@ -5467,16 +5646,11 @@
             </w:tcMar>
           </w:tcPr>
           <w:p>
-            <w:pPr>
-              <w:spacing w:before="40" w:after="80" w:line="276" w:lineRule="auto"/>
-              <w:jc w:val="right"/>
-              <w:cnfStyle w:val="000000000000" w:firstRow="0" w:lastRow="0" w:firstColumn="0" w:lastColumn="0" w:oddVBand="0" w:evenVBand="0" w:oddHBand="0" w:evenHBand="0" w:firstRowFirstColumn="0" w:firstRowLastColumn="0" w:lastRowFirstColumn="0" w:lastRowLastColumn="0"/>
-            </w:pPr>
-            <w:r>
-              <w:rPr>
-                <w:rFonts w:ascii="Calibri" w:hAnsi="Calibri"/>
-                <w:b/>
-                <w:color w:val="FFFFFF"/>
+            <w:r>
+              <w:rPr>
+                <w:rFonts w:ascii="Calibri" w:hAnsi="Calibri"/>
+                <w:b w:val="0"/>
+                <w:color w:val="000000"/>
                 <w:sz w:val="18"/>
               </w:rPr>
               <w:t>S/ 1,400.00</w:t>
@@ -5507,13 +5681,11 @@
             </w:tcMar>
           </w:tcPr>
           <w:p>
-            <w:pPr>
-              <w:spacing w:before="40" w:after="80" w:line="276" w:lineRule="auto"/>
-            </w:pPr>
-            <w:r>
-              <w:rPr>
-                <w:rFonts w:ascii="Calibri" w:hAnsi="Calibri"/>
-                <w:color w:val="FFFFFF"/>
+            <w:r>
+              <w:rPr>
+                <w:rFonts w:ascii="Calibri" w:hAnsi="Calibri"/>
+                <w:b w:val="0"/>
+                <w:color w:val="000000"/>
                 <w:sz w:val="18"/>
               </w:rPr>
               <w:t>Porcentaje de Variación (AC / PV)</w:t>
@@ -5538,11 +5710,15 @@
             </w:tcMar>
           </w:tcPr>
           <w:p>
-            <w:pPr>
-              <w:spacing w:before="40" w:after="80" w:line="276" w:lineRule="auto"/>
-              <w:jc w:val="right"/>
-              <w:cnfStyle w:val="000000100000" w:firstRow="0" w:lastRow="0" w:firstColumn="0" w:lastColumn="0" w:oddVBand="0" w:evenVBand="0" w:oddHBand="1" w:evenHBand="0" w:firstRowFirstColumn="0" w:firstRowLastColumn="0" w:lastRowFirstColumn="0" w:lastRowLastColumn="0"/>
-            </w:pPr>
+            <w:r>
+              <w:rPr>
+                <w:rFonts w:ascii="Calibri" w:hAnsi="Calibri"/>
+                <w:b w:val="0"/>
+                <w:color w:val="000000"/>
+                <w:sz w:val="18"/>
+              </w:rPr>
+              <w:t>Ahorro económico: S/ 100.00</w:t>
+            </w:r>
           </w:p>
         </w:tc>
         <w:tc>
@@ -5563,16 +5739,11 @@
             </w:tcMar>
           </w:tcPr>
           <w:p>
-            <w:pPr>
-              <w:spacing w:before="40" w:after="80" w:line="276" w:lineRule="auto"/>
-              <w:jc w:val="right"/>
-              <w:cnfStyle w:val="000000100000" w:firstRow="0" w:lastRow="0" w:firstColumn="0" w:lastColumn="0" w:oddVBand="0" w:evenVBand="0" w:oddHBand="1" w:evenHBand="0" w:firstRowFirstColumn="0" w:firstRowLastColumn="0" w:lastRowFirstColumn="0" w:lastRowLastColumn="0"/>
-            </w:pPr>
-            <w:r>
-              <w:rPr>
-                <w:rFonts w:ascii="Calibri" w:hAnsi="Calibri"/>
-                <w:b/>
-                <w:color w:val="FFFFFF"/>
+            <w:r>
+              <w:rPr>
+                <w:rFonts w:ascii="Calibri" w:hAnsi="Calibri"/>
+                <w:b w:val="0"/>
+                <w:color w:val="000000"/>
                 <w:sz w:val="18"/>
               </w:rPr>
               <w:t>93.3% (Eficiencia de Costo)</w:t>

</xml_diff>